<commit_message>
updating models and admin.
</commit_message>
<xml_diff>
--- a/Shiluvim Web.docx
+++ b/Shiluvim Web.docx
@@ -4,6 +4,54 @@
   <w:body>
     <w:p>
       <w:pPr>
+        <w:rPr>
+          <w:b/>
+          <w:bCs/>
+        </w:rPr>
+      </w:pPr>
+      <w:r>
+        <w:rPr>
+          <w:b/>
+          <w:bCs/>
+        </w:rPr>
+        <w:t xml:space="preserve">Username: </w:t>
+      </w:r>
+      <w:proofErr w:type="spellStart"/>
+      <w:r>
+        <w:rPr>
+          <w:b/>
+          <w:bCs/>
+        </w:rPr>
+        <w:t>ailyaev</w:t>
+      </w:r>
+      <w:proofErr w:type="spellEnd"/>
+    </w:p>
+    <w:p>
+      <w:pPr>
+        <w:rPr>
+          <w:b/>
+          <w:bCs/>
+        </w:rPr>
+      </w:pPr>
+      <w:r>
+        <w:rPr>
+          <w:b/>
+          <w:bCs/>
+        </w:rPr>
+        <w:t xml:space="preserve">Password: </w:t>
+      </w:r>
+      <w:proofErr w:type="spellStart"/>
+      <w:r>
+        <w:rPr>
+          <w:b/>
+          <w:bCs/>
+        </w:rPr>
+        <w:t>admAshiluvim</w:t>
+      </w:r>
+      <w:proofErr w:type="spellEnd"/>
+    </w:p>
+    <w:p>
+      <w:pPr>
         <w:bidi/>
         <w:rPr>
           <w:rtl/>
@@ -29,7 +77,23 @@
           <w:rFonts w:hint="cs"/>
           <w:rtl/>
         </w:rPr>
-        <w:t xml:space="preserve">דאטה בייס </w:t>
+        <w:t xml:space="preserve">דאטה </w:t>
+      </w:r>
+      <w:proofErr w:type="spellStart"/>
+      <w:r>
+        <w:rPr>
+          <w:rFonts w:hint="cs"/>
+          <w:rtl/>
+        </w:rPr>
+        <w:t>בייס</w:t>
+      </w:r>
+      <w:proofErr w:type="spellEnd"/>
+      <w:r>
+        <w:rPr>
+          <w:rFonts w:hint="cs"/>
+          <w:rtl/>
+        </w:rPr>
+        <w:t xml:space="preserve"> </w:t>
       </w:r>
       <w:r>
         <w:rPr>
@@ -42,21 +106,37 @@
           <w:rFonts w:hint="cs"/>
           <w:rtl/>
         </w:rPr>
-        <w:t xml:space="preserve"> הוא יכול להיות מאוד גדול... מאונדקס.</w:t>
-      </w:r>
-    </w:p>
-    <w:p>
-      <w:pPr>
-        <w:bidi/>
-        <w:rPr>
-          <w:rtl/>
-        </w:rPr>
-      </w:pPr>
+        <w:t xml:space="preserve"> הוא יכול להיות מאוד גדול... </w:t>
+      </w:r>
+      <w:proofErr w:type="spellStart"/>
       <w:r>
         <w:rPr>
           <w:rFonts w:hint="cs"/>
           <w:rtl/>
         </w:rPr>
+        <w:t>מאונדקס</w:t>
+      </w:r>
+      <w:proofErr w:type="spellEnd"/>
+      <w:r>
+        <w:rPr>
+          <w:rFonts w:hint="cs"/>
+          <w:rtl/>
+        </w:rPr>
+        <w:t>.</w:t>
+      </w:r>
+    </w:p>
+    <w:p>
+      <w:pPr>
+        <w:bidi/>
+        <w:rPr>
+          <w:rtl/>
+        </w:rPr>
+      </w:pPr>
+      <w:r>
+        <w:rPr>
+          <w:rFonts w:hint="cs"/>
+          <w:rtl/>
+        </w:rPr>
         <w:t xml:space="preserve">קובץ טקסט ענקי </w:t>
       </w:r>
       <w:r>
@@ -101,13 +181,29 @@
           <w:rFonts w:hint="cs"/>
           <w:rtl/>
         </w:rPr>
-        <w:t xml:space="preserve"> זה סוג של דאטה בייס. במחשב אצלי זה יוצא</w:t>
-      </w:r>
+        <w:t xml:space="preserve"> זה סוג של דאטה </w:t>
+      </w:r>
+      <w:proofErr w:type="spellStart"/>
       <w:r>
         <w:rPr>
           <w:rFonts w:hint="cs"/>
           <w:rtl/>
         </w:rPr>
+        <w:t>בייס</w:t>
+      </w:r>
+      <w:proofErr w:type="spellEnd"/>
+      <w:r>
+        <w:rPr>
+          <w:rFonts w:hint="cs"/>
+          <w:rtl/>
+        </w:rPr>
+        <w:t>. במחשב אצלי זה יוצא</w:t>
+      </w:r>
+      <w:r>
+        <w:rPr>
+          <w:rFonts w:hint="cs"/>
+          <w:rtl/>
+        </w:rPr>
         <w:t>.</w:t>
       </w:r>
     </w:p>
@@ -177,30 +273,62 @@
           <w:rFonts w:hint="cs"/>
           <w:rtl/>
         </w:rPr>
-        <w:t>טוען את המודל לדאטה בייס.</w:t>
-      </w:r>
-    </w:p>
-    <w:p>
-      <w:pPr>
-        <w:bidi/>
-        <w:rPr>
-          <w:rtl/>
-        </w:rPr>
-      </w:pPr>
-    </w:p>
-    <w:p>
-      <w:pPr>
-        <w:bidi/>
-        <w:rPr>
-          <w:rtl/>
-        </w:rPr>
-      </w:pPr>
+        <w:t xml:space="preserve">טוען את המודל לדאטה </w:t>
+      </w:r>
+      <w:proofErr w:type="spellStart"/>
       <w:r>
         <w:rPr>
           <w:rFonts w:hint="cs"/>
           <w:rtl/>
         </w:rPr>
-        <w:t>מודל זה הטבלאות בדאטה בייס.</w:t>
+        <w:t>בייס</w:t>
+      </w:r>
+      <w:proofErr w:type="spellEnd"/>
+      <w:r>
+        <w:rPr>
+          <w:rFonts w:hint="cs"/>
+          <w:rtl/>
+        </w:rPr>
+        <w:t>.</w:t>
+      </w:r>
+    </w:p>
+    <w:p>
+      <w:pPr>
+        <w:bidi/>
+        <w:rPr>
+          <w:rtl/>
+        </w:rPr>
+      </w:pPr>
+    </w:p>
+    <w:p>
+      <w:pPr>
+        <w:bidi/>
+        <w:rPr>
+          <w:rtl/>
+        </w:rPr>
+      </w:pPr>
+      <w:r>
+        <w:rPr>
+          <w:rFonts w:hint="cs"/>
+          <w:rtl/>
+        </w:rPr>
+        <w:t xml:space="preserve">מודל זה הטבלאות בדאטה </w:t>
+      </w:r>
+      <w:proofErr w:type="spellStart"/>
+      <w:r>
+        <w:rPr>
+          <w:rFonts w:hint="cs"/>
+          <w:rtl/>
+        </w:rPr>
+        <w:t>בייס</w:t>
+      </w:r>
+      <w:proofErr w:type="spellEnd"/>
+      <w:r>
+        <w:rPr>
+          <w:rFonts w:hint="cs"/>
+          <w:rtl/>
+        </w:rPr>
+        <w:t>.</w:t>
       </w:r>
     </w:p>
     <w:p>
@@ -378,8 +506,32 @@
         <w:rPr>
           <w:color w:val="FF0000"/>
         </w:rPr>
-        <w:t>python -m venv .venv</w:t>
-      </w:r>
+        <w:t xml:space="preserve">python -m </w:t>
+      </w:r>
+      <w:proofErr w:type="spellStart"/>
+      <w:proofErr w:type="gramStart"/>
+      <w:r>
+        <w:rPr>
+          <w:color w:val="FF0000"/>
+        </w:rPr>
+        <w:t>venv</w:t>
+      </w:r>
+      <w:proofErr w:type="spellEnd"/>
+      <w:r>
+        <w:rPr>
+          <w:color w:val="FF0000"/>
+        </w:rPr>
+        <w:t xml:space="preserve"> .</w:t>
+      </w:r>
+      <w:proofErr w:type="spellStart"/>
+      <w:r>
+        <w:rPr>
+          <w:color w:val="FF0000"/>
+        </w:rPr>
+        <w:t>venv</w:t>
+      </w:r>
+      <w:proofErr w:type="spellEnd"/>
+      <w:proofErr w:type="gramEnd"/>
     </w:p>
     <w:p>
       <w:pPr>
@@ -415,11 +567,19 @@
         </w:rPr>
         <w:t>.\.</w:t>
       </w:r>
+      <w:proofErr w:type="spellStart"/>
       <w:r>
         <w:rPr>
           <w:color w:val="FF0000"/>
         </w:rPr>
-        <w:t>venv\Scripts\Activate.ps1</w:t>
+        <w:t>venv</w:t>
+      </w:r>
+      <w:proofErr w:type="spellEnd"/>
+      <w:r>
+        <w:rPr>
+          <w:color w:val="FF0000"/>
+        </w:rPr>
+        <w:t>\Scripts\Activate.ps1</w:t>
       </w:r>
     </w:p>
     <w:p>
@@ -445,6 +605,7 @@
           <w:rFonts w:hint="cs"/>
           <w:rtl/>
         </w:rPr>
+        <w:lastRenderedPageBreak/>
         <w:t xml:space="preserve">מתקין </w:t>
       </w:r>
       <w:r>
@@ -481,7 +642,6 @@
           <w:bCs/>
           <w:rtl/>
         </w:rPr>
-        <w:lastRenderedPageBreak/>
         <w:t xml:space="preserve">התקנת </w:t>
       </w:r>
       <w:r>
@@ -564,7 +724,23 @@
           <w:rFonts w:hint="cs"/>
           <w:rtl/>
         </w:rPr>
-        <w:t xml:space="preserve"> בגלובל)</w:t>
+        <w:t xml:space="preserve"> </w:t>
+      </w:r>
+      <w:proofErr w:type="spellStart"/>
+      <w:r>
+        <w:rPr>
+          <w:rFonts w:hint="cs"/>
+          <w:rtl/>
+        </w:rPr>
+        <w:t>בגלובל</w:t>
+      </w:r>
+      <w:proofErr w:type="spellEnd"/>
+      <w:r>
+        <w:rPr>
+          <w:rFonts w:hint="cs"/>
+          <w:rtl/>
+        </w:rPr>
+        <w:t>)</w:t>
       </w:r>
     </w:p>
     <w:p>
@@ -732,8 +908,31 @@
         <w:rPr>
           <w:color w:val="FF0000"/>
         </w:rPr>
-        <w:t>django-admin startproject mysite</w:t>
-      </w:r>
+        <w:t xml:space="preserve">django-admin </w:t>
+      </w:r>
+      <w:proofErr w:type="spellStart"/>
+      <w:r>
+        <w:rPr>
+          <w:color w:val="FF0000"/>
+        </w:rPr>
+        <w:t>startproject</w:t>
+      </w:r>
+      <w:proofErr w:type="spellEnd"/>
+      <w:r>
+        <w:rPr>
+          <w:color w:val="FF0000"/>
+        </w:rPr>
+        <w:t xml:space="preserve"> </w:t>
+      </w:r>
+      <w:proofErr w:type="spellStart"/>
+      <w:proofErr w:type="gramStart"/>
+      <w:r>
+        <w:rPr>
+          <w:color w:val="FF0000"/>
+        </w:rPr>
+        <w:t>mysite</w:t>
+      </w:r>
+      <w:proofErr w:type="spellEnd"/>
       <w:r>
         <w:rPr>
           <w:rFonts w:cs="Arial"/>
@@ -742,6 +941,7 @@
         </w:rPr>
         <w:t xml:space="preserve"> .</w:t>
       </w:r>
+      <w:proofErr w:type="gramEnd"/>
       <w:r>
         <w:rPr>
           <w:rFonts w:cs="Arial"/>
@@ -839,8 +1039,17 @@
           <w:rFonts w:cs="Arial"/>
           <w:color w:val="FF0000"/>
         </w:rPr>
-        <w:t>python manage.py runserver</w:t>
-      </w:r>
+        <w:t xml:space="preserve">python manage.py </w:t>
+      </w:r>
+      <w:proofErr w:type="spellStart"/>
+      <w:r>
+        <w:rPr>
+          <w:rFonts w:cs="Arial"/>
+          <w:color w:val="FF0000"/>
+        </w:rPr>
+        <w:t>runserver</w:t>
+      </w:r>
+      <w:proofErr w:type="spellEnd"/>
     </w:p>
     <w:p>
       <w:pPr>
@@ -861,7 +1070,15 @@
         </w:numPr>
       </w:pPr>
       <w:r>
-        <w:t>It loads your project settings (mysite/settings.py) and serves your site at:</w:t>
+        <w:t>It loads your project settings (</w:t>
+      </w:r>
+      <w:proofErr w:type="spellStart"/>
+      <w:r>
+        <w:t>mysite</w:t>
+      </w:r>
+      <w:proofErr w:type="spellEnd"/>
+      <w:r>
+        <w:t>/settings.py) and serves your site at:</w:t>
       </w:r>
       <w:r>
         <w:br/>
@@ -876,7 +1093,15 @@
         </w:numPr>
       </w:pPr>
       <w:r>
-        <w:t>It keeps running and waiting for requests until you stop it (Ctrl+C).</w:t>
+        <w:t>It keeps running and waiting for requests until you stop it (</w:t>
+      </w:r>
+      <w:proofErr w:type="spellStart"/>
+      <w:r>
+        <w:t>Ctrl+C</w:t>
+      </w:r>
+      <w:proofErr w:type="spellEnd"/>
+      <w:r>
+        <w:t>).</w:t>
       </w:r>
     </w:p>
     <w:p>
@@ -887,7 +1112,15 @@
         </w:numPr>
       </w:pPr>
       <w:r>
-        <w:t>While it runs, it also auto-reloads when you change code (that “StatReloader” message).</w:t>
+        <w:t>While it runs, it also auto-reloads when you change code (that “</w:t>
+      </w:r>
+      <w:proofErr w:type="spellStart"/>
+      <w:r>
+        <w:t>StatReloader</w:t>
+      </w:r>
+      <w:proofErr w:type="spellEnd"/>
+      <w:r>
+        <w:t>” message).</w:t>
       </w:r>
     </w:p>
     <w:p>
@@ -931,7 +1164,6 @@
           <w:rFonts w:hint="cs"/>
           <w:rtl/>
         </w:rPr>
-        <w:lastRenderedPageBreak/>
         <w:t>בונה אפליקציה בתוך האתר</w:t>
       </w:r>
     </w:p>
@@ -995,7 +1227,21 @@
         <w:rPr>
           <w:color w:val="FF0000"/>
         </w:rPr>
-        <w:t>python manage.py startapp playground</w:t>
+        <w:t xml:space="preserve">python manage.py </w:t>
+      </w:r>
+      <w:proofErr w:type="spellStart"/>
+      <w:r>
+        <w:rPr>
+          <w:color w:val="FF0000"/>
+        </w:rPr>
+        <w:t>startapp</w:t>
+      </w:r>
+      <w:proofErr w:type="spellEnd"/>
+      <w:r>
+        <w:rPr>
+          <w:color w:val="FF0000"/>
+        </w:rPr>
+        <w:t xml:space="preserve"> playground</w:t>
       </w:r>
     </w:p>
     <w:p/>
@@ -1401,6 +1647,7 @@
           <w:bCs/>
         </w:rPr>
       </w:pPr>
+      <w:proofErr w:type="gramStart"/>
       <w:r>
         <w:rPr>
           <w:b/>
@@ -1408,8 +1655,9 @@
           <w:i/>
           <w:iCs/>
         </w:rPr>
-        <w:t>&lt;!-- region BLOCK 3 --&gt;</w:t>
-      </w:r>
+        <w:t>&lt;!--</w:t>
+      </w:r>
+      <w:proofErr w:type="gramEnd"/>
       <w:r>
         <w:rPr>
           <w:b/>
@@ -1417,6 +1665,15 @@
           <w:i/>
           <w:iCs/>
         </w:rPr>
+        <w:t xml:space="preserve"> region BLOCK 3 --&gt;</w:t>
+      </w:r>
+      <w:r>
+        <w:rPr>
+          <w:b/>
+          <w:bCs/>
+          <w:i/>
+          <w:iCs/>
+        </w:rPr>
         <w:br/>
       </w:r>
       <w:r>
@@ -1424,7 +1681,23 @@
           <w:b/>
           <w:bCs/>
         </w:rPr>
-        <w:t>&lt;div id="rating_table"&gt;</w:t>
+        <w:t>&lt;div id="</w:t>
+      </w:r>
+      <w:proofErr w:type="spellStart"/>
+      <w:r>
+        <w:rPr>
+          <w:b/>
+          <w:bCs/>
+        </w:rPr>
+        <w:t>rating_table</w:t>
+      </w:r>
+      <w:proofErr w:type="spellEnd"/>
+      <w:r>
+        <w:rPr>
+          <w:b/>
+          <w:bCs/>
+        </w:rPr>
+        <w:t>"&gt;</w:t>
       </w:r>
       <w:r>
         <w:rPr>
@@ -1432,7 +1705,39 @@
           <w:bCs/>
         </w:rPr>
         <w:br/>
-        <w:t xml:space="preserve">    {{ df_ranking_table_html|safe }}</w:t>
+        <w:t xml:space="preserve"> </w:t>
+      </w:r>
+      <w:proofErr w:type="gramStart"/>
+      <w:r>
+        <w:rPr>
+          <w:b/>
+          <w:bCs/>
+        </w:rPr>
+        <w:t xml:space="preserve">   {{ </w:t>
+      </w:r>
+      <w:proofErr w:type="spellStart"/>
+      <w:r>
+        <w:rPr>
+          <w:b/>
+          <w:bCs/>
+        </w:rPr>
+        <w:t>df</w:t>
+      </w:r>
+      <w:proofErr w:type="gramEnd"/>
+      <w:r>
+        <w:rPr>
+          <w:b/>
+          <w:bCs/>
+        </w:rPr>
+        <w:t>_ranking_table_html|safe</w:t>
+      </w:r>
+      <w:proofErr w:type="spellEnd"/>
+      <w:r>
+        <w:rPr>
+          <w:b/>
+          <w:bCs/>
+        </w:rPr>
+        <w:t xml:space="preserve"> }}</w:t>
       </w:r>
       <w:r>
         <w:rPr>
@@ -1486,6 +1791,7 @@
           <w:bCs/>
         </w:rPr>
       </w:pPr>
+      <w:proofErr w:type="gramStart"/>
       <w:r>
         <w:rPr>
           <w:b/>
@@ -1493,8 +1799,9 @@
           <w:i/>
           <w:iCs/>
         </w:rPr>
-        <w:t>&lt;!-- region BLOCK 3 --&gt;</w:t>
-      </w:r>
+        <w:t>&lt;!--</w:t>
+      </w:r>
+      <w:proofErr w:type="gramEnd"/>
       <w:r>
         <w:rPr>
           <w:b/>
@@ -1502,6 +1809,15 @@
           <w:i/>
           <w:iCs/>
         </w:rPr>
+        <w:t xml:space="preserve"> region BLOCK 3 --&gt;</w:t>
+      </w:r>
+      <w:r>
+        <w:rPr>
+          <w:b/>
+          <w:bCs/>
+          <w:i/>
+          <w:iCs/>
+        </w:rPr>
         <w:br/>
       </w:r>
       <w:r>
@@ -1509,7 +1825,23 @@
           <w:b/>
           <w:bCs/>
         </w:rPr>
-        <w:t>&lt;div id="rating_table"&gt;</w:t>
+        <w:t>&lt;div id="</w:t>
+      </w:r>
+      <w:proofErr w:type="spellStart"/>
+      <w:r>
+        <w:rPr>
+          <w:b/>
+          <w:bCs/>
+        </w:rPr>
+        <w:t>rating_table</w:t>
+      </w:r>
+      <w:proofErr w:type="spellEnd"/>
+      <w:r>
+        <w:rPr>
+          <w:b/>
+          <w:bCs/>
+        </w:rPr>
+        <w:t>"&gt;</w:t>
       </w:r>
       <w:r>
         <w:rPr>
@@ -1517,7 +1849,39 @@
           <w:bCs/>
         </w:rPr>
         <w:br/>
-        <w:t xml:space="preserve">    {{ df_ranking_table_html|safe }}</w:t>
+        <w:t xml:space="preserve"> </w:t>
+      </w:r>
+      <w:proofErr w:type="gramStart"/>
+      <w:r>
+        <w:rPr>
+          <w:b/>
+          <w:bCs/>
+        </w:rPr>
+        <w:t xml:space="preserve">   {{ </w:t>
+      </w:r>
+      <w:proofErr w:type="spellStart"/>
+      <w:r>
+        <w:rPr>
+          <w:b/>
+          <w:bCs/>
+        </w:rPr>
+        <w:t>df</w:t>
+      </w:r>
+      <w:proofErr w:type="gramEnd"/>
+      <w:r>
+        <w:rPr>
+          <w:b/>
+          <w:bCs/>
+        </w:rPr>
+        <w:t>_ranking_table_html|safe</w:t>
+      </w:r>
+      <w:proofErr w:type="spellEnd"/>
+      <w:r>
+        <w:rPr>
+          <w:b/>
+          <w:bCs/>
+        </w:rPr>
+        <w:t xml:space="preserve"> }}</w:t>
       </w:r>
       <w:r>
         <w:rPr>
@@ -1580,23 +1944,141 @@
           <w:b/>
           <w:bCs/>
         </w:rPr>
-        <w:t>const table_rating = document.getElementById("rating_table");</w:t>
-      </w:r>
-    </w:p>
-    <w:p>
-      <w:pPr>
-        <w:rPr>
-          <w:b/>
-          <w:bCs/>
-        </w:rPr>
-      </w:pPr>
-      <w:r>
-        <w:rPr>
-          <w:b/>
-          <w:bCs/>
-        </w:rPr>
-        <w:t>const stationDropdown = document.getElementById("stationFilter");</w:t>
-      </w:r>
+        <w:t xml:space="preserve">const </w:t>
+      </w:r>
+      <w:proofErr w:type="spellStart"/>
+      <w:r>
+        <w:rPr>
+          <w:b/>
+          <w:bCs/>
+        </w:rPr>
+        <w:t>table_rating</w:t>
+      </w:r>
+      <w:proofErr w:type="spellEnd"/>
+      <w:r>
+        <w:rPr>
+          <w:b/>
+          <w:bCs/>
+        </w:rPr>
+        <w:t xml:space="preserve"> = </w:t>
+      </w:r>
+      <w:proofErr w:type="spellStart"/>
+      <w:proofErr w:type="gramStart"/>
+      <w:r>
+        <w:rPr>
+          <w:b/>
+          <w:bCs/>
+        </w:rPr>
+        <w:t>document.getElementById</w:t>
+      </w:r>
+      <w:proofErr w:type="spellEnd"/>
+      <w:proofErr w:type="gramEnd"/>
+      <w:r>
+        <w:rPr>
+          <w:b/>
+          <w:bCs/>
+        </w:rPr>
+        <w:t>("</w:t>
+      </w:r>
+      <w:proofErr w:type="spellStart"/>
+      <w:r>
+        <w:rPr>
+          <w:b/>
+          <w:bCs/>
+        </w:rPr>
+        <w:t>rating_table</w:t>
+      </w:r>
+      <w:proofErr w:type="spellEnd"/>
+      <w:r>
+        <w:rPr>
+          <w:b/>
+          <w:bCs/>
+        </w:rPr>
+        <w:t>"</w:t>
+      </w:r>
+      <w:proofErr w:type="gramStart"/>
+      <w:r>
+        <w:rPr>
+          <w:b/>
+          <w:bCs/>
+        </w:rPr>
+        <w:t>);</w:t>
+      </w:r>
+      <w:proofErr w:type="gramEnd"/>
+    </w:p>
+    <w:p>
+      <w:pPr>
+        <w:rPr>
+          <w:b/>
+          <w:bCs/>
+        </w:rPr>
+      </w:pPr>
+      <w:r>
+        <w:rPr>
+          <w:b/>
+          <w:bCs/>
+        </w:rPr>
+        <w:t xml:space="preserve">const </w:t>
+      </w:r>
+      <w:proofErr w:type="spellStart"/>
+      <w:r>
+        <w:rPr>
+          <w:b/>
+          <w:bCs/>
+        </w:rPr>
+        <w:t>stationDropdown</w:t>
+      </w:r>
+      <w:proofErr w:type="spellEnd"/>
+      <w:r>
+        <w:rPr>
+          <w:b/>
+          <w:bCs/>
+        </w:rPr>
+        <w:t xml:space="preserve"> = </w:t>
+      </w:r>
+      <w:proofErr w:type="spellStart"/>
+      <w:proofErr w:type="gramStart"/>
+      <w:r>
+        <w:rPr>
+          <w:b/>
+          <w:bCs/>
+        </w:rPr>
+        <w:t>document.getElementById</w:t>
+      </w:r>
+      <w:proofErr w:type="spellEnd"/>
+      <w:proofErr w:type="gramEnd"/>
+      <w:r>
+        <w:rPr>
+          <w:b/>
+          <w:bCs/>
+        </w:rPr>
+        <w:t>("</w:t>
+      </w:r>
+      <w:proofErr w:type="spellStart"/>
+      <w:r>
+        <w:rPr>
+          <w:b/>
+          <w:bCs/>
+        </w:rPr>
+        <w:t>stationFilter</w:t>
+      </w:r>
+      <w:proofErr w:type="spellEnd"/>
+      <w:r>
+        <w:rPr>
+          <w:b/>
+          <w:bCs/>
+        </w:rPr>
+        <w:t>"</w:t>
+      </w:r>
+      <w:proofErr w:type="gramStart"/>
+      <w:r>
+        <w:rPr>
+          <w:b/>
+          <w:bCs/>
+        </w:rPr>
+        <w:t>);</w:t>
+      </w:r>
+      <w:proofErr w:type="gramEnd"/>
     </w:p>
     <w:p>
       <w:pPr>
@@ -1648,6 +2130,8 @@
         </w:rPr>
         <w:t xml:space="preserve">function </w:t>
       </w:r>
+      <w:proofErr w:type="spellStart"/>
+      <w:proofErr w:type="gramStart"/>
       <w:r>
         <w:rPr>
           <w:b/>
@@ -1657,12 +2141,21 @@
         </w:rPr>
         <w:t>hideAllTables</w:t>
       </w:r>
-      <w:r>
-        <w:rPr>
-          <w:b/>
-          <w:bCs/>
-        </w:rPr>
-        <w:t>() {</w:t>
+      <w:proofErr w:type="spellEnd"/>
+      <w:r>
+        <w:rPr>
+          <w:b/>
+          <w:bCs/>
+        </w:rPr>
+        <w:t>(</w:t>
+      </w:r>
+      <w:proofErr w:type="gramEnd"/>
+      <w:r>
+        <w:rPr>
+          <w:b/>
+          <w:bCs/>
+        </w:rPr>
+        <w:t>) {</w:t>
       </w:r>
       <w:r>
         <w:rPr>
@@ -1670,7 +2163,23 @@
           <w:bCs/>
         </w:rPr>
         <w:br/>
-        <w:t xml:space="preserve">  if (table_rating) {</w:t>
+        <w:t xml:space="preserve">  if (</w:t>
+      </w:r>
+      <w:proofErr w:type="spellStart"/>
+      <w:r>
+        <w:rPr>
+          <w:b/>
+          <w:bCs/>
+        </w:rPr>
+        <w:t>table_rating</w:t>
+      </w:r>
+      <w:proofErr w:type="spellEnd"/>
+      <w:r>
+        <w:rPr>
+          <w:b/>
+          <w:bCs/>
+        </w:rPr>
+        <w:t>) {</w:t>
       </w:r>
       <w:r>
         <w:rPr>
@@ -1680,6 +2189,7 @@
         <w:br/>
         <w:t xml:space="preserve">    </w:t>
       </w:r>
+      <w:proofErr w:type="spellStart"/>
       <w:r>
         <w:rPr>
           <w:b/>
@@ -1694,7 +2204,40 @@
           <w:b/>
           <w:bCs/>
         </w:rPr>
-        <w:t>.from(table_rating.querySelectorAll("tr"))</w:t>
+        <w:t>.from</w:t>
+      </w:r>
+      <w:proofErr w:type="spellEnd"/>
+      <w:r>
+        <w:rPr>
+          <w:b/>
+          <w:bCs/>
+        </w:rPr>
+        <w:t>(</w:t>
+      </w:r>
+      <w:proofErr w:type="spellStart"/>
+      <w:r>
+        <w:rPr>
+          <w:b/>
+          <w:bCs/>
+        </w:rPr>
+        <w:t>table_</w:t>
+      </w:r>
+      <w:proofErr w:type="gramStart"/>
+      <w:r>
+        <w:rPr>
+          <w:b/>
+          <w:bCs/>
+        </w:rPr>
+        <w:t>rating.querySelectorAll</w:t>
+      </w:r>
+      <w:proofErr w:type="spellEnd"/>
+      <w:proofErr w:type="gramEnd"/>
+      <w:r>
+        <w:rPr>
+          <w:b/>
+          <w:bCs/>
+        </w:rPr>
+        <w:t>("tr"))</w:t>
       </w:r>
       <w:r>
         <w:rPr>
@@ -1702,7 +2245,71 @@
           <w:bCs/>
         </w:rPr>
         <w:br/>
-        <w:t xml:space="preserve">      .filter(r =&gt; !r.querySelector("th"))</w:t>
+        <w:t xml:space="preserve">    </w:t>
+      </w:r>
+      <w:proofErr w:type="gramStart"/>
+      <w:r>
+        <w:rPr>
+          <w:b/>
+          <w:bCs/>
+        </w:rPr>
+        <w:t xml:space="preserve">  .filter</w:t>
+      </w:r>
+      <w:proofErr w:type="gramEnd"/>
+      <w:r>
+        <w:rPr>
+          <w:b/>
+          <w:bCs/>
+        </w:rPr>
+        <w:t>(r =</w:t>
+      </w:r>
+      <w:proofErr w:type="gramStart"/>
+      <w:r>
+        <w:rPr>
+          <w:b/>
+          <w:bCs/>
+        </w:rPr>
+        <w:t>&gt; !</w:t>
+      </w:r>
+      <w:proofErr w:type="spellStart"/>
+      <w:r>
+        <w:rPr>
+          <w:b/>
+          <w:bCs/>
+        </w:rPr>
+        <w:t>r</w:t>
+      </w:r>
+      <w:proofErr w:type="gramEnd"/>
+      <w:r>
+        <w:rPr>
+          <w:b/>
+          <w:bCs/>
+        </w:rPr>
+        <w:t>.querySelector</w:t>
+      </w:r>
+      <w:proofErr w:type="spellEnd"/>
+      <w:r>
+        <w:rPr>
+          <w:b/>
+          <w:bCs/>
+        </w:rPr>
+        <w:t>("</w:t>
+      </w:r>
+      <w:proofErr w:type="spellStart"/>
+      <w:r>
+        <w:rPr>
+          <w:b/>
+          <w:bCs/>
+        </w:rPr>
+        <w:t>th</w:t>
+      </w:r>
+      <w:proofErr w:type="spellEnd"/>
+      <w:r>
+        <w:rPr>
+          <w:b/>
+          <w:bCs/>
+        </w:rPr>
+        <w:t>"))</w:t>
       </w:r>
       <w:r>
         <w:rPr>
@@ -1710,7 +2317,64 @@
           <w:bCs/>
         </w:rPr>
         <w:br/>
-        <w:t xml:space="preserve">      .forEach(r =&gt; r.style.display = "none");</w:t>
+      </w:r>
+      <w:r>
+        <w:rPr>
+          <w:b/>
+          <w:bCs/>
+        </w:rPr>
+        <w:lastRenderedPageBreak/>
+        <w:t xml:space="preserve">    </w:t>
+      </w:r>
+      <w:proofErr w:type="gramStart"/>
+      <w:r>
+        <w:rPr>
+          <w:b/>
+          <w:bCs/>
+        </w:rPr>
+        <w:t xml:space="preserve">  .</w:t>
+      </w:r>
+      <w:proofErr w:type="spellStart"/>
+      <w:r>
+        <w:rPr>
+          <w:b/>
+          <w:bCs/>
+        </w:rPr>
+        <w:t>forEach</w:t>
+      </w:r>
+      <w:proofErr w:type="spellEnd"/>
+      <w:proofErr w:type="gramEnd"/>
+      <w:r>
+        <w:rPr>
+          <w:b/>
+          <w:bCs/>
+        </w:rPr>
+        <w:t xml:space="preserve">(r =&gt; </w:t>
+      </w:r>
+      <w:proofErr w:type="spellStart"/>
+      <w:proofErr w:type="gramStart"/>
+      <w:r>
+        <w:rPr>
+          <w:b/>
+          <w:bCs/>
+        </w:rPr>
+        <w:t>r.style</w:t>
+      </w:r>
+      <w:proofErr w:type="gramEnd"/>
+      <w:r>
+        <w:rPr>
+          <w:b/>
+          <w:bCs/>
+        </w:rPr>
+        <w:t>.display</w:t>
+      </w:r>
+      <w:proofErr w:type="spellEnd"/>
+      <w:r>
+        <w:rPr>
+          <w:b/>
+          <w:bCs/>
+        </w:rPr>
+        <w:t xml:space="preserve"> = "none");</w:t>
       </w:r>
       <w:r>
         <w:rPr>
@@ -1772,31 +2436,152 @@
           <w:b/>
           <w:bCs/>
         </w:rPr>
-        <w:t>let stationColIndex = -1;</w:t>
-      </w:r>
-    </w:p>
-    <w:p>
-      <w:pPr>
-        <w:rPr>
-          <w:b/>
-          <w:bCs/>
-          <w:rtl/>
-        </w:rPr>
-      </w:pPr>
-    </w:p>
-    <w:p>
-      <w:pPr>
-        <w:rPr>
-          <w:b/>
-          <w:bCs/>
-        </w:rPr>
-      </w:pPr>
-      <w:r>
-        <w:rPr>
-          <w:b/>
-          <w:bCs/>
-        </w:rPr>
-        <w:t>if (table_rating &amp;&amp; stationDropdown &amp;&amp; yearDropdown &amp;&amp; monthDropdown &amp;&amp; busDirectionDropdown &amp;&amp; weekDayCheckboxContainer) {</w:t>
+        <w:t xml:space="preserve">let </w:t>
+      </w:r>
+      <w:proofErr w:type="spellStart"/>
+      <w:r>
+        <w:rPr>
+          <w:b/>
+          <w:bCs/>
+        </w:rPr>
+        <w:t>stationColIndex</w:t>
+      </w:r>
+      <w:proofErr w:type="spellEnd"/>
+      <w:r>
+        <w:rPr>
+          <w:b/>
+          <w:bCs/>
+        </w:rPr>
+        <w:t xml:space="preserve"> = </w:t>
+      </w:r>
+      <w:proofErr w:type="gramStart"/>
+      <w:r>
+        <w:rPr>
+          <w:b/>
+          <w:bCs/>
+        </w:rPr>
+        <w:t>-1;</w:t>
+      </w:r>
+      <w:proofErr w:type="gramEnd"/>
+    </w:p>
+    <w:p>
+      <w:pPr>
+        <w:rPr>
+          <w:b/>
+          <w:bCs/>
+          <w:rtl/>
+        </w:rPr>
+      </w:pPr>
+    </w:p>
+    <w:p>
+      <w:pPr>
+        <w:rPr>
+          <w:b/>
+          <w:bCs/>
+        </w:rPr>
+      </w:pPr>
+      <w:r>
+        <w:rPr>
+          <w:b/>
+          <w:bCs/>
+        </w:rPr>
+        <w:t>if (</w:t>
+      </w:r>
+      <w:proofErr w:type="spellStart"/>
+      <w:r>
+        <w:rPr>
+          <w:b/>
+          <w:bCs/>
+        </w:rPr>
+        <w:t>table_rating</w:t>
+      </w:r>
+      <w:proofErr w:type="spellEnd"/>
+      <w:r>
+        <w:rPr>
+          <w:b/>
+          <w:bCs/>
+        </w:rPr>
+        <w:t xml:space="preserve"> &amp;&amp; </w:t>
+      </w:r>
+      <w:proofErr w:type="spellStart"/>
+      <w:r>
+        <w:rPr>
+          <w:b/>
+          <w:bCs/>
+        </w:rPr>
+        <w:t>stationDropdown</w:t>
+      </w:r>
+      <w:proofErr w:type="spellEnd"/>
+      <w:r>
+        <w:rPr>
+          <w:b/>
+          <w:bCs/>
+        </w:rPr>
+        <w:t xml:space="preserve"> &amp;&amp; </w:t>
+      </w:r>
+      <w:proofErr w:type="spellStart"/>
+      <w:r>
+        <w:rPr>
+          <w:b/>
+          <w:bCs/>
+        </w:rPr>
+        <w:t>yearDropdown</w:t>
+      </w:r>
+      <w:proofErr w:type="spellEnd"/>
+      <w:r>
+        <w:rPr>
+          <w:b/>
+          <w:bCs/>
+        </w:rPr>
+        <w:t xml:space="preserve"> &amp;&amp; </w:t>
+      </w:r>
+      <w:proofErr w:type="spellStart"/>
+      <w:r>
+        <w:rPr>
+          <w:b/>
+          <w:bCs/>
+        </w:rPr>
+        <w:t>monthDropdown</w:t>
+      </w:r>
+      <w:proofErr w:type="spellEnd"/>
+      <w:r>
+        <w:rPr>
+          <w:b/>
+          <w:bCs/>
+        </w:rPr>
+        <w:t xml:space="preserve"> &amp;&amp; </w:t>
+      </w:r>
+      <w:proofErr w:type="spellStart"/>
+      <w:r>
+        <w:rPr>
+          <w:b/>
+          <w:bCs/>
+        </w:rPr>
+        <w:t>busDirectionDropdown</w:t>
+      </w:r>
+      <w:proofErr w:type="spellEnd"/>
+      <w:r>
+        <w:rPr>
+          <w:b/>
+          <w:bCs/>
+        </w:rPr>
+        <w:t xml:space="preserve"> &amp;&amp; </w:t>
+      </w:r>
+      <w:proofErr w:type="spellStart"/>
+      <w:r>
+        <w:rPr>
+          <w:b/>
+          <w:bCs/>
+        </w:rPr>
+        <w:t>weekDayCheckboxContainer</w:t>
+      </w:r>
+      <w:proofErr w:type="spellEnd"/>
+      <w:r>
+        <w:rPr>
+          <w:b/>
+          <w:bCs/>
+        </w:rPr>
+        <w:t>) {</w:t>
       </w:r>
       <w:r>
         <w:rPr>
@@ -1822,14 +2607,112 @@
           <w:iCs/>
         </w:rPr>
         <w:br/>
-        <w:t xml:space="preserve">  Array</w:t>
-      </w:r>
-      <w:r>
-        <w:rPr>
-          <w:b/>
-          <w:bCs/>
-        </w:rPr>
-        <w:t>.from(table_rating.querySelectorAll("th")).forEach((th, i) =&gt; {</w:t>
+        <w:t xml:space="preserve">  </w:t>
+      </w:r>
+      <w:proofErr w:type="spellStart"/>
+      <w:r>
+        <w:rPr>
+          <w:b/>
+          <w:bCs/>
+          <w:i/>
+          <w:iCs/>
+        </w:rPr>
+        <w:t>Array</w:t>
+      </w:r>
+      <w:r>
+        <w:rPr>
+          <w:b/>
+          <w:bCs/>
+        </w:rPr>
+        <w:t>.from</w:t>
+      </w:r>
+      <w:proofErr w:type="spellEnd"/>
+      <w:r>
+        <w:rPr>
+          <w:b/>
+          <w:bCs/>
+        </w:rPr>
+        <w:t>(</w:t>
+      </w:r>
+      <w:proofErr w:type="spellStart"/>
+      <w:r>
+        <w:rPr>
+          <w:b/>
+          <w:bCs/>
+        </w:rPr>
+        <w:t>table_rating.querySelectorAll</w:t>
+      </w:r>
+      <w:proofErr w:type="spellEnd"/>
+      <w:r>
+        <w:rPr>
+          <w:b/>
+          <w:bCs/>
+        </w:rPr>
+        <w:t>("</w:t>
+      </w:r>
+      <w:proofErr w:type="spellStart"/>
+      <w:r>
+        <w:rPr>
+          <w:b/>
+          <w:bCs/>
+        </w:rPr>
+        <w:t>th</w:t>
+      </w:r>
+      <w:proofErr w:type="spellEnd"/>
+      <w:r>
+        <w:rPr>
+          <w:b/>
+          <w:bCs/>
+        </w:rPr>
+        <w:t>")).</w:t>
+      </w:r>
+      <w:proofErr w:type="spellStart"/>
+      <w:r>
+        <w:rPr>
+          <w:b/>
+          <w:bCs/>
+        </w:rPr>
+        <w:t>forEach</w:t>
+      </w:r>
+      <w:proofErr w:type="spellEnd"/>
+      <w:r>
+        <w:rPr>
+          <w:b/>
+          <w:bCs/>
+        </w:rPr>
+        <w:t>((</w:t>
+      </w:r>
+      <w:proofErr w:type="spellStart"/>
+      <w:r>
+        <w:rPr>
+          <w:b/>
+          <w:bCs/>
+        </w:rPr>
+        <w:t>th</w:t>
+      </w:r>
+      <w:proofErr w:type="spellEnd"/>
+      <w:r>
+        <w:rPr>
+          <w:b/>
+          <w:bCs/>
+        </w:rPr>
+        <w:t xml:space="preserve">, </w:t>
+      </w:r>
+      <w:proofErr w:type="spellStart"/>
+      <w:r>
+        <w:rPr>
+          <w:b/>
+          <w:bCs/>
+        </w:rPr>
+        <w:t>i</w:t>
+      </w:r>
+      <w:proofErr w:type="spellEnd"/>
+      <w:r>
+        <w:rPr>
+          <w:b/>
+          <w:bCs/>
+        </w:rPr>
+        <w:t>) =&gt; {</w:t>
       </w:r>
       <w:r>
         <w:rPr>
@@ -1853,7 +2736,23 @@
           <w:b/>
           <w:bCs/>
         </w:rPr>
-        <w:t>(th.innerText);</w:t>
+        <w:t>(</w:t>
+      </w:r>
+      <w:proofErr w:type="spellStart"/>
+      <w:r>
+        <w:rPr>
+          <w:b/>
+          <w:bCs/>
+        </w:rPr>
+        <w:t>th.innerText</w:t>
+      </w:r>
+      <w:proofErr w:type="spellEnd"/>
+      <w:r>
+        <w:rPr>
+          <w:b/>
+          <w:bCs/>
+        </w:rPr>
+        <w:t>);</w:t>
       </w:r>
       <w:r>
         <w:rPr>
@@ -1906,7 +2805,39 @@
           <w:b/>
           <w:bCs/>
         </w:rPr>
-        <w:t>") stationColIndex = i;</w:t>
+        <w:t xml:space="preserve">") </w:t>
+      </w:r>
+      <w:proofErr w:type="spellStart"/>
+      <w:r>
+        <w:rPr>
+          <w:b/>
+          <w:bCs/>
+        </w:rPr>
+        <w:t>stationColIndex</w:t>
+      </w:r>
+      <w:proofErr w:type="spellEnd"/>
+      <w:r>
+        <w:rPr>
+          <w:b/>
+          <w:bCs/>
+        </w:rPr>
+        <w:t xml:space="preserve"> = </w:t>
+      </w:r>
+      <w:proofErr w:type="spellStart"/>
+      <w:r>
+        <w:rPr>
+          <w:b/>
+          <w:bCs/>
+        </w:rPr>
+        <w:t>i</w:t>
+      </w:r>
+      <w:proofErr w:type="spellEnd"/>
+      <w:r>
+        <w:rPr>
+          <w:b/>
+          <w:bCs/>
+        </w:rPr>
+        <w:t>;</w:t>
       </w:r>
       <w:r>
         <w:rPr>
@@ -1929,7 +2860,23 @@
           <w:b/>
           <w:bCs/>
         </w:rPr>
-        <w:t>") yearColIndexT1 = i;</w:t>
+        <w:t xml:space="preserve">") yearColIndexT1 = </w:t>
+      </w:r>
+      <w:proofErr w:type="spellStart"/>
+      <w:r>
+        <w:rPr>
+          <w:b/>
+          <w:bCs/>
+        </w:rPr>
+        <w:t>i</w:t>
+      </w:r>
+      <w:proofErr w:type="spellEnd"/>
+      <w:r>
+        <w:rPr>
+          <w:b/>
+          <w:bCs/>
+        </w:rPr>
+        <w:t>;</w:t>
       </w:r>
       <w:r>
         <w:rPr>
@@ -1952,7 +2899,23 @@
           <w:b/>
           <w:bCs/>
         </w:rPr>
-        <w:t>") monthColIndexT1 = i;</w:t>
+        <w:t xml:space="preserve">") monthColIndexT1 = </w:t>
+      </w:r>
+      <w:proofErr w:type="spellStart"/>
+      <w:r>
+        <w:rPr>
+          <w:b/>
+          <w:bCs/>
+        </w:rPr>
+        <w:t>i</w:t>
+      </w:r>
+      <w:proofErr w:type="spellEnd"/>
+      <w:r>
+        <w:rPr>
+          <w:b/>
+          <w:bCs/>
+        </w:rPr>
+        <w:t>;</w:t>
       </w:r>
       <w:r>
         <w:rPr>
@@ -1975,7 +2938,23 @@
           <w:bCs/>
         </w:rPr>
         <w:br/>
-        <w:t xml:space="preserve">  if (stationColIndex !== -1) {</w:t>
+        <w:t xml:space="preserve">  if (</w:t>
+      </w:r>
+      <w:proofErr w:type="spellStart"/>
+      <w:r>
+        <w:rPr>
+          <w:b/>
+          <w:bCs/>
+        </w:rPr>
+        <w:t>stationColIndex</w:t>
+      </w:r>
+      <w:proofErr w:type="spellEnd"/>
+      <w:r>
+        <w:rPr>
+          <w:b/>
+          <w:bCs/>
+        </w:rPr>
+        <w:t xml:space="preserve"> !== -1) {</w:t>
       </w:r>
       <w:r>
         <w:rPr>
@@ -1983,8 +2962,25 @@
           <w:bCs/>
         </w:rPr>
         <w:br/>
-        <w:t xml:space="preserve">    const allRows = </w:t>
-      </w:r>
+        <w:t xml:space="preserve">    const </w:t>
+      </w:r>
+      <w:proofErr w:type="spellStart"/>
+      <w:r>
+        <w:rPr>
+          <w:b/>
+          <w:bCs/>
+        </w:rPr>
+        <w:t>allRows</w:t>
+      </w:r>
+      <w:proofErr w:type="spellEnd"/>
+      <w:r>
+        <w:rPr>
+          <w:b/>
+          <w:bCs/>
+        </w:rPr>
+        <w:t xml:space="preserve"> = </w:t>
+      </w:r>
+      <w:proofErr w:type="spellStart"/>
       <w:r>
         <w:rPr>
           <w:b/>
@@ -1999,7 +2995,31 @@
           <w:b/>
           <w:bCs/>
         </w:rPr>
-        <w:t>.from(table_rating.querySelectorAll("tr"));</w:t>
+        <w:t>.from</w:t>
+      </w:r>
+      <w:proofErr w:type="spellEnd"/>
+      <w:r>
+        <w:rPr>
+          <w:b/>
+          <w:bCs/>
+        </w:rPr>
+        <w:t>(</w:t>
+      </w:r>
+      <w:proofErr w:type="spellStart"/>
+      <w:r>
+        <w:rPr>
+          <w:b/>
+          <w:bCs/>
+        </w:rPr>
+        <w:t>table_rating.querySelectorAll</w:t>
+      </w:r>
+      <w:proofErr w:type="spellEnd"/>
+      <w:r>
+        <w:rPr>
+          <w:b/>
+          <w:bCs/>
+        </w:rPr>
+        <w:t>("tr"));</w:t>
       </w:r>
       <w:r>
         <w:rPr>
@@ -2007,7 +3027,71 @@
           <w:bCs/>
         </w:rPr>
         <w:br/>
-        <w:t xml:space="preserve">    dataRows = allRows.filter(r =&gt; !r.querySelector("th"));</w:t>
+        <w:t xml:space="preserve">    </w:t>
+      </w:r>
+      <w:proofErr w:type="spellStart"/>
+      <w:r>
+        <w:rPr>
+          <w:b/>
+          <w:bCs/>
+        </w:rPr>
+        <w:t>dataRows</w:t>
+      </w:r>
+      <w:proofErr w:type="spellEnd"/>
+      <w:r>
+        <w:rPr>
+          <w:b/>
+          <w:bCs/>
+        </w:rPr>
+        <w:t xml:space="preserve"> = </w:t>
+      </w:r>
+      <w:proofErr w:type="spellStart"/>
+      <w:r>
+        <w:rPr>
+          <w:b/>
+          <w:bCs/>
+        </w:rPr>
+        <w:t>allRows.filter</w:t>
+      </w:r>
+      <w:proofErr w:type="spellEnd"/>
+      <w:r>
+        <w:rPr>
+          <w:b/>
+          <w:bCs/>
+        </w:rPr>
+        <w:t>(r =&gt; !</w:t>
+      </w:r>
+      <w:proofErr w:type="spellStart"/>
+      <w:r>
+        <w:rPr>
+          <w:b/>
+          <w:bCs/>
+        </w:rPr>
+        <w:t>r.querySelector</w:t>
+      </w:r>
+      <w:proofErr w:type="spellEnd"/>
+      <w:r>
+        <w:rPr>
+          <w:b/>
+          <w:bCs/>
+        </w:rPr>
+        <w:t>("</w:t>
+      </w:r>
+      <w:proofErr w:type="spellStart"/>
+      <w:r>
+        <w:rPr>
+          <w:b/>
+          <w:bCs/>
+        </w:rPr>
+        <w:t>th</w:t>
+      </w:r>
+      <w:proofErr w:type="spellEnd"/>
+      <w:r>
+        <w:rPr>
+          <w:b/>
+          <w:bCs/>
+        </w:rPr>
+        <w:t>"));</w:t>
       </w:r>
       <w:r>
         <w:rPr>
@@ -2022,7 +3106,23 @@
           <w:bCs/>
         </w:rPr>
         <w:br/>
-        <w:t xml:space="preserve">    const stationSet = new </w:t>
+        <w:t xml:space="preserve">    const </w:t>
+      </w:r>
+      <w:proofErr w:type="spellStart"/>
+      <w:r>
+        <w:rPr>
+          <w:b/>
+          <w:bCs/>
+        </w:rPr>
+        <w:t>stationSet</w:t>
+      </w:r>
+      <w:proofErr w:type="spellEnd"/>
+      <w:r>
+        <w:rPr>
+          <w:b/>
+          <w:bCs/>
+        </w:rPr>
+        <w:t xml:space="preserve"> = new </w:t>
       </w:r>
       <w:r>
         <w:rPr>
@@ -2046,7 +3146,23 @@
           <w:bCs/>
         </w:rPr>
         <w:br/>
-        <w:t xml:space="preserve">    dataRows.forEach(r =&gt; {</w:t>
+        <w:t xml:space="preserve">    </w:t>
+      </w:r>
+      <w:proofErr w:type="spellStart"/>
+      <w:r>
+        <w:rPr>
+          <w:b/>
+          <w:bCs/>
+        </w:rPr>
+        <w:t>dataRows.forEach</w:t>
+      </w:r>
+      <w:proofErr w:type="spellEnd"/>
+      <w:r>
+        <w:rPr>
+          <w:b/>
+          <w:bCs/>
+        </w:rPr>
+        <w:t>(r =&gt; {</w:t>
       </w:r>
       <w:r>
         <w:rPr>
@@ -2070,7 +3186,55 @@
           <w:b/>
           <w:bCs/>
         </w:rPr>
-        <w:t>(r.children[stationColIndex]?.innerText);</w:t>
+        <w:t>(</w:t>
+      </w:r>
+      <w:proofErr w:type="spellStart"/>
+      <w:r>
+        <w:rPr>
+          <w:b/>
+          <w:bCs/>
+        </w:rPr>
+        <w:t>r.children</w:t>
+      </w:r>
+      <w:proofErr w:type="spellEnd"/>
+      <w:r>
+        <w:rPr>
+          <w:b/>
+          <w:bCs/>
+        </w:rPr>
+        <w:t>[</w:t>
+      </w:r>
+      <w:proofErr w:type="spellStart"/>
+      <w:r>
+        <w:rPr>
+          <w:b/>
+          <w:bCs/>
+        </w:rPr>
+        <w:t>stationColIndex</w:t>
+      </w:r>
+      <w:proofErr w:type="spellEnd"/>
+      <w:r>
+        <w:rPr>
+          <w:b/>
+          <w:bCs/>
+        </w:rPr>
+        <w:t>]?.</w:t>
+      </w:r>
+      <w:proofErr w:type="spellStart"/>
+      <w:r>
+        <w:rPr>
+          <w:b/>
+          <w:bCs/>
+        </w:rPr>
+        <w:t>innerText</w:t>
+      </w:r>
+      <w:proofErr w:type="spellEnd"/>
+      <w:r>
+        <w:rPr>
+          <w:b/>
+          <w:bCs/>
+        </w:rPr>
+        <w:t>);</w:t>
       </w:r>
       <w:r>
         <w:rPr>
@@ -2078,7 +3242,23 @@
           <w:bCs/>
         </w:rPr>
         <w:br/>
-        <w:t xml:space="preserve">      if (v) stationSet.add(v);</w:t>
+        <w:t xml:space="preserve">      if (v) </w:t>
+      </w:r>
+      <w:proofErr w:type="spellStart"/>
+      <w:r>
+        <w:rPr>
+          <w:b/>
+          <w:bCs/>
+        </w:rPr>
+        <w:t>stationSet.add</w:t>
+      </w:r>
+      <w:proofErr w:type="spellEnd"/>
+      <w:r>
+        <w:rPr>
+          <w:b/>
+          <w:bCs/>
+        </w:rPr>
+        <w:t>(v);</w:t>
       </w:r>
       <w:r>
         <w:rPr>
@@ -2101,7 +3281,23 @@
           <w:bCs/>
         </w:rPr>
         <w:br/>
-        <w:t xml:space="preserve">    stationDropdown.innerHTML = "";</w:t>
+        <w:t xml:space="preserve">    </w:t>
+      </w:r>
+      <w:proofErr w:type="spellStart"/>
+      <w:r>
+        <w:rPr>
+          <w:b/>
+          <w:bCs/>
+        </w:rPr>
+        <w:t>stationDropdown.innerHTML</w:t>
+      </w:r>
+      <w:proofErr w:type="spellEnd"/>
+      <w:r>
+        <w:rPr>
+          <w:b/>
+          <w:bCs/>
+        </w:rPr>
+        <w:t xml:space="preserve"> = "";</w:t>
       </w:r>
       <w:r>
         <w:rPr>
@@ -2116,68 +3312,39 @@
           <w:bCs/>
         </w:rPr>
         <w:br/>
-        <w:t xml:space="preserve">    const sph = document.createElement("option");</w:t>
-      </w:r>
-      <w:r>
-        <w:rPr>
-          <w:b/>
-          <w:bCs/>
-        </w:rPr>
-        <w:br/>
-        <w:t xml:space="preserve">    sph.value = "";</w:t>
-      </w:r>
-      <w:r>
-        <w:rPr>
-          <w:b/>
-          <w:bCs/>
-        </w:rPr>
-        <w:br/>
-        <w:t xml:space="preserve">    sph.textContent = "</w:t>
-      </w:r>
-      <w:r>
-        <w:rPr>
-          <w:b/>
-          <w:bCs/>
-          <w:rtl/>
-        </w:rPr>
-        <w:t>בחר</w:t>
-      </w:r>
-      <w:r>
-        <w:rPr>
-          <w:b/>
-          <w:bCs/>
-        </w:rPr>
-        <w:t xml:space="preserve"> </w:t>
-      </w:r>
-      <w:r>
-        <w:rPr>
-          <w:b/>
-          <w:bCs/>
-          <w:rtl/>
-        </w:rPr>
-        <w:t>תחנה</w:t>
-      </w:r>
-      <w:r>
-        <w:rPr>
-          <w:b/>
-          <w:bCs/>
-        </w:rPr>
-        <w:t>";</w:t>
-      </w:r>
-      <w:r>
-        <w:rPr>
-          <w:b/>
-          <w:bCs/>
-        </w:rPr>
-        <w:br/>
-        <w:t xml:space="preserve">    stationDropdown.appendChild(sph);</w:t>
-      </w:r>
-      <w:r>
-        <w:rPr>
-          <w:b/>
-          <w:bCs/>
-        </w:rPr>
-        <w:br/>
+        <w:t xml:space="preserve">    const </w:t>
+      </w:r>
+      <w:proofErr w:type="spellStart"/>
+      <w:r>
+        <w:rPr>
+          <w:b/>
+          <w:bCs/>
+        </w:rPr>
+        <w:t>sph</w:t>
+      </w:r>
+      <w:proofErr w:type="spellEnd"/>
+      <w:r>
+        <w:rPr>
+          <w:b/>
+          <w:bCs/>
+        </w:rPr>
+        <w:t xml:space="preserve"> = </w:t>
+      </w:r>
+      <w:proofErr w:type="spellStart"/>
+      <w:r>
+        <w:rPr>
+          <w:b/>
+          <w:bCs/>
+        </w:rPr>
+        <w:t>document.createElement</w:t>
+      </w:r>
+      <w:proofErr w:type="spellEnd"/>
+      <w:r>
+        <w:rPr>
+          <w:b/>
+          <w:bCs/>
+        </w:rPr>
+        <w:t>("option");</w:t>
       </w:r>
       <w:r>
         <w:rPr>
@@ -2187,6 +3354,132 @@
         <w:br/>
         <w:t xml:space="preserve">    </w:t>
       </w:r>
+      <w:proofErr w:type="spellStart"/>
+      <w:r>
+        <w:rPr>
+          <w:b/>
+          <w:bCs/>
+        </w:rPr>
+        <w:t>sph.value</w:t>
+      </w:r>
+      <w:proofErr w:type="spellEnd"/>
+      <w:r>
+        <w:rPr>
+          <w:b/>
+          <w:bCs/>
+        </w:rPr>
+        <w:t xml:space="preserve"> = "";</w:t>
+      </w:r>
+      <w:r>
+        <w:rPr>
+          <w:b/>
+          <w:bCs/>
+        </w:rPr>
+        <w:br/>
+        <w:t xml:space="preserve">    </w:t>
+      </w:r>
+      <w:proofErr w:type="spellStart"/>
+      <w:r>
+        <w:rPr>
+          <w:b/>
+          <w:bCs/>
+        </w:rPr>
+        <w:t>sph.textContent</w:t>
+      </w:r>
+      <w:proofErr w:type="spellEnd"/>
+      <w:r>
+        <w:rPr>
+          <w:b/>
+          <w:bCs/>
+        </w:rPr>
+        <w:t xml:space="preserve"> = "</w:t>
+      </w:r>
+      <w:r>
+        <w:rPr>
+          <w:b/>
+          <w:bCs/>
+          <w:rtl/>
+        </w:rPr>
+        <w:t>בחר</w:t>
+      </w:r>
+      <w:r>
+        <w:rPr>
+          <w:b/>
+          <w:bCs/>
+        </w:rPr>
+        <w:t xml:space="preserve"> </w:t>
+      </w:r>
+      <w:r>
+        <w:rPr>
+          <w:b/>
+          <w:bCs/>
+          <w:rtl/>
+        </w:rPr>
+        <w:t>תחנה</w:t>
+      </w:r>
+      <w:r>
+        <w:rPr>
+          <w:b/>
+          <w:bCs/>
+        </w:rPr>
+        <w:t>";</w:t>
+      </w:r>
+      <w:r>
+        <w:rPr>
+          <w:b/>
+          <w:bCs/>
+        </w:rPr>
+        <w:br/>
+        <w:t xml:space="preserve">    </w:t>
+      </w:r>
+      <w:proofErr w:type="spellStart"/>
+      <w:r>
+        <w:rPr>
+          <w:b/>
+          <w:bCs/>
+        </w:rPr>
+        <w:t>stationDropdown.appendChild</w:t>
+      </w:r>
+      <w:proofErr w:type="spellEnd"/>
+      <w:r>
+        <w:rPr>
+          <w:b/>
+          <w:bCs/>
+        </w:rPr>
+        <w:t>(</w:t>
+      </w:r>
+      <w:proofErr w:type="spellStart"/>
+      <w:r>
+        <w:rPr>
+          <w:b/>
+          <w:bCs/>
+        </w:rPr>
+        <w:t>sph</w:t>
+      </w:r>
+      <w:proofErr w:type="spellEnd"/>
+      <w:r>
+        <w:rPr>
+          <w:b/>
+          <w:bCs/>
+        </w:rPr>
+        <w:t>);</w:t>
+      </w:r>
+      <w:r>
+        <w:rPr>
+          <w:b/>
+          <w:bCs/>
+        </w:rPr>
+        <w:br/>
+      </w:r>
+      <w:r>
+        <w:rPr>
+          <w:b/>
+          <w:bCs/>
+        </w:rPr>
+        <w:br/>
+        <w:t xml:space="preserve">    </w:t>
+      </w:r>
+      <w:proofErr w:type="spellStart"/>
       <w:r>
         <w:rPr>
           <w:b/>
@@ -2201,7 +3494,63 @@
           <w:b/>
           <w:bCs/>
         </w:rPr>
-        <w:t>.from(stationSet).sort().forEach(st =&gt; {</w:t>
+        <w:t>.from</w:t>
+      </w:r>
+      <w:proofErr w:type="spellEnd"/>
+      <w:r>
+        <w:rPr>
+          <w:b/>
+          <w:bCs/>
+        </w:rPr>
+        <w:t>(</w:t>
+      </w:r>
+      <w:proofErr w:type="spellStart"/>
+      <w:r>
+        <w:rPr>
+          <w:b/>
+          <w:bCs/>
+        </w:rPr>
+        <w:t>stationSet</w:t>
+      </w:r>
+      <w:proofErr w:type="spellEnd"/>
+      <w:r>
+        <w:rPr>
+          <w:b/>
+          <w:bCs/>
+        </w:rPr>
+        <w:t>).sort().</w:t>
+      </w:r>
+      <w:proofErr w:type="spellStart"/>
+      <w:r>
+        <w:rPr>
+          <w:b/>
+          <w:bCs/>
+        </w:rPr>
+        <w:t>forEach</w:t>
+      </w:r>
+      <w:proofErr w:type="spellEnd"/>
+      <w:r>
+        <w:rPr>
+          <w:b/>
+          <w:bCs/>
+        </w:rPr>
+        <w:t>(</w:t>
+      </w:r>
+      <w:proofErr w:type="spellStart"/>
+      <w:r>
+        <w:rPr>
+          <w:b/>
+          <w:bCs/>
+        </w:rPr>
+        <w:t>st</w:t>
+      </w:r>
+      <w:proofErr w:type="spellEnd"/>
+      <w:r>
+        <w:rPr>
+          <w:b/>
+          <w:bCs/>
+        </w:rPr>
+        <w:t xml:space="preserve"> =&gt; {</w:t>
       </w:r>
       <w:r>
         <w:rPr>
@@ -2209,7 +3558,30 @@
           <w:bCs/>
         </w:rPr>
         <w:br/>
-        <w:t xml:space="preserve">      const opt = document.createElement("option");</w:t>
+      </w:r>
+      <w:r>
+        <w:rPr>
+          <w:b/>
+          <w:bCs/>
+        </w:rPr>
+        <w:lastRenderedPageBreak/>
+        <w:t xml:space="preserve">      const opt = </w:t>
+      </w:r>
+      <w:proofErr w:type="spellStart"/>
+      <w:r>
+        <w:rPr>
+          <w:b/>
+          <w:bCs/>
+        </w:rPr>
+        <w:t>document.createElement</w:t>
+      </w:r>
+      <w:proofErr w:type="spellEnd"/>
+      <w:r>
+        <w:rPr>
+          <w:b/>
+          <w:bCs/>
+        </w:rPr>
+        <w:t>("option");</w:t>
       </w:r>
       <w:r>
         <w:rPr>
@@ -2217,7 +3589,39 @@
           <w:bCs/>
         </w:rPr>
         <w:br/>
-        <w:t xml:space="preserve">      opt.value = st;</w:t>
+        <w:t xml:space="preserve">      </w:t>
+      </w:r>
+      <w:proofErr w:type="spellStart"/>
+      <w:r>
+        <w:rPr>
+          <w:b/>
+          <w:bCs/>
+        </w:rPr>
+        <w:t>opt.value</w:t>
+      </w:r>
+      <w:proofErr w:type="spellEnd"/>
+      <w:r>
+        <w:rPr>
+          <w:b/>
+          <w:bCs/>
+        </w:rPr>
+        <w:t xml:space="preserve"> = </w:t>
+      </w:r>
+      <w:proofErr w:type="spellStart"/>
+      <w:r>
+        <w:rPr>
+          <w:b/>
+          <w:bCs/>
+        </w:rPr>
+        <w:t>st</w:t>
+      </w:r>
+      <w:proofErr w:type="spellEnd"/>
+      <w:r>
+        <w:rPr>
+          <w:b/>
+          <w:bCs/>
+        </w:rPr>
+        <w:t>;</w:t>
       </w:r>
       <w:r>
         <w:rPr>
@@ -2225,7 +3629,39 @@
           <w:bCs/>
         </w:rPr>
         <w:br/>
-        <w:t xml:space="preserve">      opt.textContent = st;</w:t>
+        <w:t xml:space="preserve">      </w:t>
+      </w:r>
+      <w:proofErr w:type="spellStart"/>
+      <w:r>
+        <w:rPr>
+          <w:b/>
+          <w:bCs/>
+        </w:rPr>
+        <w:t>opt.textContent</w:t>
+      </w:r>
+      <w:proofErr w:type="spellEnd"/>
+      <w:r>
+        <w:rPr>
+          <w:b/>
+          <w:bCs/>
+        </w:rPr>
+        <w:t xml:space="preserve"> = </w:t>
+      </w:r>
+      <w:proofErr w:type="spellStart"/>
+      <w:r>
+        <w:rPr>
+          <w:b/>
+          <w:bCs/>
+        </w:rPr>
+        <w:t>st</w:t>
+      </w:r>
+      <w:proofErr w:type="spellEnd"/>
+      <w:r>
+        <w:rPr>
+          <w:b/>
+          <w:bCs/>
+        </w:rPr>
+        <w:t>;</w:t>
       </w:r>
       <w:r>
         <w:rPr>
@@ -2233,14 +3669,23 @@
           <w:bCs/>
         </w:rPr>
         <w:br/>
-      </w:r>
-      <w:r>
-        <w:rPr>
-          <w:b/>
-          <w:bCs/>
-        </w:rPr>
-        <w:lastRenderedPageBreak/>
-        <w:t xml:space="preserve">      stationDropdown.appendChild(opt);</w:t>
+        <w:t xml:space="preserve">      </w:t>
+      </w:r>
+      <w:proofErr w:type="spellStart"/>
+      <w:r>
+        <w:rPr>
+          <w:b/>
+          <w:bCs/>
+        </w:rPr>
+        <w:t>stationDropdown.appendChild</w:t>
+      </w:r>
+      <w:proofErr w:type="spellEnd"/>
+      <w:r>
+        <w:rPr>
+          <w:b/>
+          <w:bCs/>
+        </w:rPr>
+        <w:t>(opt);</w:t>
       </w:r>
       <w:r>
         <w:rPr>
@@ -2263,7 +3708,39 @@
           <w:bCs/>
         </w:rPr>
         <w:br/>
-        <w:t xml:space="preserve">    dataRows.forEach(r =&gt; r.style.display = "none");</w:t>
+        <w:t xml:space="preserve">    </w:t>
+      </w:r>
+      <w:proofErr w:type="spellStart"/>
+      <w:r>
+        <w:rPr>
+          <w:b/>
+          <w:bCs/>
+        </w:rPr>
+        <w:t>dataRows.forEach</w:t>
+      </w:r>
+      <w:proofErr w:type="spellEnd"/>
+      <w:r>
+        <w:rPr>
+          <w:b/>
+          <w:bCs/>
+        </w:rPr>
+        <w:t xml:space="preserve">(r =&gt; </w:t>
+      </w:r>
+      <w:proofErr w:type="spellStart"/>
+      <w:r>
+        <w:rPr>
+          <w:b/>
+          <w:bCs/>
+        </w:rPr>
+        <w:t>r.style.display</w:t>
+      </w:r>
+      <w:proofErr w:type="spellEnd"/>
+      <w:r>
+        <w:rPr>
+          <w:b/>
+          <w:bCs/>
+        </w:rPr>
+        <w:t xml:space="preserve"> = "none");</w:t>
       </w:r>
       <w:r>
         <w:rPr>
@@ -2322,6 +3799,8 @@
         </w:rPr>
         <w:t xml:space="preserve">function </w:t>
       </w:r>
+      <w:proofErr w:type="spellStart"/>
+      <w:proofErr w:type="gramStart"/>
       <w:r>
         <w:rPr>
           <w:b/>
@@ -2331,12 +3810,21 @@
         </w:rPr>
         <w:t>applyFilters</w:t>
       </w:r>
-      <w:r>
-        <w:rPr>
-          <w:b/>
-          <w:bCs/>
-        </w:rPr>
-        <w:t>() {</w:t>
+      <w:proofErr w:type="spellEnd"/>
+      <w:r>
+        <w:rPr>
+          <w:b/>
+          <w:bCs/>
+        </w:rPr>
+        <w:t>(</w:t>
+      </w:r>
+      <w:proofErr w:type="gramEnd"/>
+      <w:r>
+        <w:rPr>
+          <w:b/>
+          <w:bCs/>
+        </w:rPr>
+        <w:t>) {</w:t>
       </w:r>
       <w:r>
         <w:rPr>
@@ -2344,7 +3832,39 @@
           <w:bCs/>
         </w:rPr>
         <w:br/>
-        <w:t xml:space="preserve">  const selectedStation = stationDropdown.value;</w:t>
+        <w:t xml:space="preserve">  const </w:t>
+      </w:r>
+      <w:proofErr w:type="spellStart"/>
+      <w:r>
+        <w:rPr>
+          <w:b/>
+          <w:bCs/>
+        </w:rPr>
+        <w:t>selectedStation</w:t>
+      </w:r>
+      <w:proofErr w:type="spellEnd"/>
+      <w:r>
+        <w:rPr>
+          <w:b/>
+          <w:bCs/>
+        </w:rPr>
+        <w:t xml:space="preserve"> = </w:t>
+      </w:r>
+      <w:proofErr w:type="spellStart"/>
+      <w:r>
+        <w:rPr>
+          <w:b/>
+          <w:bCs/>
+        </w:rPr>
+        <w:t>stationDropdown.value</w:t>
+      </w:r>
+      <w:proofErr w:type="spellEnd"/>
+      <w:r>
+        <w:rPr>
+          <w:b/>
+          <w:bCs/>
+        </w:rPr>
+        <w:t>;</w:t>
       </w:r>
       <w:r>
         <w:rPr>

</xml_diff>

<commit_message>
creatin MYSQL and updating ranking_table in my_SQL
</commit_message>
<xml_diff>
--- a/Shiluvim Web.docx
+++ b/Shiluvim Web.docx
@@ -509,7 +509,6 @@
         <w:t xml:space="preserve">python -m </w:t>
       </w:r>
       <w:proofErr w:type="spellStart"/>
-      <w:proofErr w:type="gramStart"/>
       <w:r>
         <w:rPr>
           <w:color w:val="FF0000"/>
@@ -531,7 +530,6 @@
         <w:t>venv</w:t>
       </w:r>
       <w:proofErr w:type="spellEnd"/>
-      <w:proofErr w:type="gramEnd"/>
     </w:p>
     <w:p>
       <w:pPr>
@@ -925,7 +923,6 @@
         <w:t xml:space="preserve"> </w:t>
       </w:r>
       <w:proofErr w:type="spellStart"/>
-      <w:proofErr w:type="gramStart"/>
       <w:r>
         <w:rPr>
           <w:color w:val="FF0000"/>
@@ -941,7 +938,6 @@
         </w:rPr>
         <w:t xml:space="preserve"> .</w:t>
       </w:r>
-      <w:proofErr w:type="gramEnd"/>
       <w:r>
         <w:rPr>
           <w:rFonts w:cs="Arial"/>
@@ -1647,7 +1643,6 @@
           <w:bCs/>
         </w:rPr>
       </w:pPr>
-      <w:proofErr w:type="gramStart"/>
       <w:r>
         <w:rPr>
           <w:b/>
@@ -1655,9 +1650,8 @@
           <w:i/>
           <w:iCs/>
         </w:rPr>
-        <w:t>&lt;!--</w:t>
-      </w:r>
-      <w:proofErr w:type="gramEnd"/>
+        <w:t>&lt;!-- region BLOCK 3 --&gt;</w:t>
+      </w:r>
       <w:r>
         <w:rPr>
           <w:b/>
@@ -1665,8 +1659,107 @@
           <w:i/>
           <w:iCs/>
         </w:rPr>
-        <w:t xml:space="preserve"> region BLOCK 3 --&gt;</w:t>
-      </w:r>
+        <w:br/>
+      </w:r>
+      <w:r>
+        <w:rPr>
+          <w:b/>
+          <w:bCs/>
+        </w:rPr>
+        <w:t>&lt;div id="</w:t>
+      </w:r>
+      <w:proofErr w:type="spellStart"/>
+      <w:r>
+        <w:rPr>
+          <w:b/>
+          <w:bCs/>
+        </w:rPr>
+        <w:t>rating_table</w:t>
+      </w:r>
+      <w:proofErr w:type="spellEnd"/>
+      <w:r>
+        <w:rPr>
+          <w:b/>
+          <w:bCs/>
+        </w:rPr>
+        <w:t>"&gt;</w:t>
+      </w:r>
+      <w:r>
+        <w:rPr>
+          <w:b/>
+          <w:bCs/>
+        </w:rPr>
+        <w:br/>
+        <w:t xml:space="preserve">    {{ </w:t>
+      </w:r>
+      <w:proofErr w:type="spellStart"/>
+      <w:r>
+        <w:rPr>
+          <w:b/>
+          <w:bCs/>
+        </w:rPr>
+        <w:t>df_ranking_table_html|safe</w:t>
+      </w:r>
+      <w:proofErr w:type="spellEnd"/>
+      <w:r>
+        <w:rPr>
+          <w:b/>
+          <w:bCs/>
+        </w:rPr>
+        <w:t xml:space="preserve"> }}</w:t>
+      </w:r>
+      <w:r>
+        <w:rPr>
+          <w:b/>
+          <w:bCs/>
+        </w:rPr>
+        <w:br/>
+        <w:t>&lt;/div&gt;</w:t>
+      </w:r>
+    </w:p>
+    <w:p>
+      <w:pPr>
+        <w:rPr>
+          <w:b/>
+          <w:bCs/>
+          <w:rtl/>
+        </w:rPr>
+      </w:pPr>
+    </w:p>
+    <w:p>
+      <w:pPr>
+        <w:rPr>
+          <w:b/>
+          <w:bCs/>
+          <w:rtl/>
+        </w:rPr>
+      </w:pPr>
+    </w:p>
+    <w:p>
+      <w:pPr>
+        <w:rPr>
+          <w:b/>
+          <w:bCs/>
+          <w:rtl/>
+        </w:rPr>
+      </w:pPr>
+      <w:r>
+        <w:rPr>
+          <w:rFonts w:hint="cs"/>
+          <w:b/>
+          <w:bCs/>
+          <w:rtl/>
+        </w:rPr>
+        <w:t>הפילטר שהגדרתי, נגיד תחנת רכבת:</w:t>
+      </w:r>
+    </w:p>
+    <w:p>
+      <w:pPr>
+        <w:rPr>
+          <w:b/>
+          <w:bCs/>
+        </w:rPr>
+      </w:pPr>
       <w:r>
         <w:rPr>
           <w:b/>
@@ -1674,6 +1767,15 @@
           <w:i/>
           <w:iCs/>
         </w:rPr>
+        <w:t>&lt;!-- region BLOCK 3 --&gt;</w:t>
+      </w:r>
+      <w:r>
+        <w:rPr>
+          <w:b/>
+          <w:bCs/>
+          <w:i/>
+          <w:iCs/>
+        </w:rPr>
         <w:br/>
       </w:r>
       <w:r>
@@ -1705,31 +1807,15 @@
           <w:bCs/>
         </w:rPr>
         <w:br/>
-        <w:t xml:space="preserve"> </w:t>
-      </w:r>
-      <w:proofErr w:type="gramStart"/>
-      <w:r>
-        <w:rPr>
-          <w:b/>
-          <w:bCs/>
-        </w:rPr>
-        <w:t xml:space="preserve">   {{ </w:t>
-      </w:r>
-      <w:proofErr w:type="spellStart"/>
-      <w:r>
-        <w:rPr>
-          <w:b/>
-          <w:bCs/>
-        </w:rPr>
-        <w:t>df</w:t>
-      </w:r>
-      <w:proofErr w:type="gramEnd"/>
-      <w:r>
-        <w:rPr>
-          <w:b/>
-          <w:bCs/>
-        </w:rPr>
-        <w:t>_ranking_table_html|safe</w:t>
+        <w:t xml:space="preserve">    {{ </w:t>
+      </w:r>
+      <w:proofErr w:type="spellStart"/>
+      <w:r>
+        <w:rPr>
+          <w:b/>
+          <w:bCs/>
+        </w:rPr>
+        <w:t>df_ranking_table_html|safe</w:t>
       </w:r>
       <w:proofErr w:type="spellEnd"/>
       <w:r>
@@ -1750,24 +1836,27 @@
     </w:p>
     <w:p>
       <w:pPr>
-        <w:rPr>
-          <w:b/>
-          <w:bCs/>
-          <w:rtl/>
-        </w:rPr>
-      </w:pPr>
-    </w:p>
-    <w:p>
-      <w:pPr>
-        <w:rPr>
-          <w:b/>
-          <w:bCs/>
-          <w:rtl/>
-        </w:rPr>
-      </w:pPr>
-    </w:p>
-    <w:p>
-      <w:pPr>
+        <w:bidi/>
+        <w:rPr>
+          <w:b/>
+          <w:bCs/>
+          <w:rtl/>
+        </w:rPr>
+      </w:pPr>
+    </w:p>
+    <w:p>
+      <w:pPr>
+        <w:bidi/>
+        <w:rPr>
+          <w:b/>
+          <w:bCs/>
+          <w:rtl/>
+        </w:rPr>
+      </w:pPr>
+    </w:p>
+    <w:p>
+      <w:pPr>
+        <w:bidi/>
         <w:rPr>
           <w:b/>
           <w:bCs/>
@@ -1781,17 +1870,187 @@
           <w:bCs/>
           <w:rtl/>
         </w:rPr>
-        <w:t>הפילטר שהגדרתי, נגיד תחנת רכבת:</w:t>
-      </w:r>
-    </w:p>
-    <w:p>
-      <w:pPr>
-        <w:rPr>
-          <w:b/>
-          <w:bCs/>
-        </w:rPr>
-      </w:pPr>
-      <w:proofErr w:type="gramStart"/>
+        <w:t>הגדרת משתנה:</w:t>
+      </w:r>
+    </w:p>
+    <w:p>
+      <w:pPr>
+        <w:rPr>
+          <w:b/>
+          <w:bCs/>
+          <w:rtl/>
+        </w:rPr>
+      </w:pPr>
+      <w:r>
+        <w:rPr>
+          <w:b/>
+          <w:bCs/>
+        </w:rPr>
+        <w:t xml:space="preserve">const </w:t>
+      </w:r>
+      <w:proofErr w:type="spellStart"/>
+      <w:r>
+        <w:rPr>
+          <w:b/>
+          <w:bCs/>
+        </w:rPr>
+        <w:t>table_rating</w:t>
+      </w:r>
+      <w:proofErr w:type="spellEnd"/>
+      <w:r>
+        <w:rPr>
+          <w:b/>
+          <w:bCs/>
+        </w:rPr>
+        <w:t xml:space="preserve"> = </w:t>
+      </w:r>
+      <w:proofErr w:type="spellStart"/>
+      <w:r>
+        <w:rPr>
+          <w:b/>
+          <w:bCs/>
+        </w:rPr>
+        <w:t>document.getElementById</w:t>
+      </w:r>
+      <w:proofErr w:type="spellEnd"/>
+      <w:r>
+        <w:rPr>
+          <w:b/>
+          <w:bCs/>
+        </w:rPr>
+        <w:t>("</w:t>
+      </w:r>
+      <w:proofErr w:type="spellStart"/>
+      <w:r>
+        <w:rPr>
+          <w:b/>
+          <w:bCs/>
+        </w:rPr>
+        <w:t>rating_table</w:t>
+      </w:r>
+      <w:proofErr w:type="spellEnd"/>
+      <w:r>
+        <w:rPr>
+          <w:b/>
+          <w:bCs/>
+        </w:rPr>
+        <w:t>");</w:t>
+      </w:r>
+    </w:p>
+    <w:p>
+      <w:pPr>
+        <w:rPr>
+          <w:b/>
+          <w:bCs/>
+        </w:rPr>
+      </w:pPr>
+      <w:r>
+        <w:rPr>
+          <w:b/>
+          <w:bCs/>
+        </w:rPr>
+        <w:t xml:space="preserve">const </w:t>
+      </w:r>
+      <w:proofErr w:type="spellStart"/>
+      <w:r>
+        <w:rPr>
+          <w:b/>
+          <w:bCs/>
+        </w:rPr>
+        <w:t>stationDropdown</w:t>
+      </w:r>
+      <w:proofErr w:type="spellEnd"/>
+      <w:r>
+        <w:rPr>
+          <w:b/>
+          <w:bCs/>
+        </w:rPr>
+        <w:t xml:space="preserve"> = </w:t>
+      </w:r>
+      <w:proofErr w:type="spellStart"/>
+      <w:r>
+        <w:rPr>
+          <w:b/>
+          <w:bCs/>
+        </w:rPr>
+        <w:t>document.getElementById</w:t>
+      </w:r>
+      <w:proofErr w:type="spellEnd"/>
+      <w:r>
+        <w:rPr>
+          <w:b/>
+          <w:bCs/>
+        </w:rPr>
+        <w:t>("</w:t>
+      </w:r>
+      <w:proofErr w:type="spellStart"/>
+      <w:r>
+        <w:rPr>
+          <w:b/>
+          <w:bCs/>
+        </w:rPr>
+        <w:t>stationFilter</w:t>
+      </w:r>
+      <w:proofErr w:type="spellEnd"/>
+      <w:r>
+        <w:rPr>
+          <w:b/>
+          <w:bCs/>
+        </w:rPr>
+        <w:t>");</w:t>
+      </w:r>
+    </w:p>
+    <w:p>
+      <w:pPr>
+        <w:rPr>
+          <w:b/>
+          <w:bCs/>
+          <w:rtl/>
+        </w:rPr>
+      </w:pPr>
+    </w:p>
+    <w:p>
+      <w:pPr>
+        <w:rPr>
+          <w:b/>
+          <w:bCs/>
+        </w:rPr>
+      </w:pPr>
+    </w:p>
+    <w:p>
+      <w:pPr>
+        <w:rPr>
+          <w:b/>
+          <w:bCs/>
+          <w:rtl/>
+        </w:rPr>
+      </w:pPr>
+      <w:r>
+        <w:rPr>
+          <w:rFonts w:hint="cs"/>
+          <w:b/>
+          <w:bCs/>
+          <w:rtl/>
+        </w:rPr>
+        <w:t>להחביא את כל הדאטה:</w:t>
+      </w:r>
+    </w:p>
+    <w:p>
+      <w:pPr>
+        <w:rPr>
+          <w:b/>
+          <w:bCs/>
+          <w:rtl/>
+        </w:rPr>
+      </w:pPr>
+      <w:r>
+        <w:rPr>
+          <w:b/>
+          <w:bCs/>
+        </w:rPr>
+        <w:t xml:space="preserve">function </w:t>
+      </w:r>
+      <w:proofErr w:type="spellStart"/>
       <w:r>
         <w:rPr>
           <w:b/>
@@ -1799,9 +2058,49 @@
           <w:i/>
           <w:iCs/>
         </w:rPr>
-        <w:t>&lt;!--</w:t>
-      </w:r>
-      <w:proofErr w:type="gramEnd"/>
+        <w:t>hideAllTables</w:t>
+      </w:r>
+      <w:proofErr w:type="spellEnd"/>
+      <w:r>
+        <w:rPr>
+          <w:b/>
+          <w:bCs/>
+        </w:rPr>
+        <w:t>() {</w:t>
+      </w:r>
+      <w:r>
+        <w:rPr>
+          <w:b/>
+          <w:bCs/>
+        </w:rPr>
+        <w:br/>
+        <w:t xml:space="preserve">  if (</w:t>
+      </w:r>
+      <w:proofErr w:type="spellStart"/>
+      <w:r>
+        <w:rPr>
+          <w:b/>
+          <w:bCs/>
+        </w:rPr>
+        <w:t>table_rating</w:t>
+      </w:r>
+      <w:proofErr w:type="spellEnd"/>
+      <w:r>
+        <w:rPr>
+          <w:b/>
+          <w:bCs/>
+        </w:rPr>
+        <w:t>) {</w:t>
+      </w:r>
+      <w:r>
+        <w:rPr>
+          <w:b/>
+          <w:bCs/>
+        </w:rPr>
+        <w:br/>
+        <w:t xml:space="preserve">    </w:t>
+      </w:r>
+      <w:proofErr w:type="spellStart"/>
       <w:r>
         <w:rPr>
           <w:b/>
@@ -1809,7 +2108,330 @@
           <w:i/>
           <w:iCs/>
         </w:rPr>
-        <w:t xml:space="preserve"> region BLOCK 3 --&gt;</w:t>
+        <w:t>Array</w:t>
+      </w:r>
+      <w:r>
+        <w:rPr>
+          <w:b/>
+          <w:bCs/>
+        </w:rPr>
+        <w:t>.from</w:t>
+      </w:r>
+      <w:proofErr w:type="spellEnd"/>
+      <w:r>
+        <w:rPr>
+          <w:b/>
+          <w:bCs/>
+        </w:rPr>
+        <w:t>(</w:t>
+      </w:r>
+      <w:proofErr w:type="spellStart"/>
+      <w:r>
+        <w:rPr>
+          <w:b/>
+          <w:bCs/>
+        </w:rPr>
+        <w:t>table_rating.querySelectorAll</w:t>
+      </w:r>
+      <w:proofErr w:type="spellEnd"/>
+      <w:r>
+        <w:rPr>
+          <w:b/>
+          <w:bCs/>
+        </w:rPr>
+        <w:t>("tr"))</w:t>
+      </w:r>
+      <w:r>
+        <w:rPr>
+          <w:b/>
+          <w:bCs/>
+        </w:rPr>
+        <w:br/>
+        <w:t xml:space="preserve">      .filter(r =&gt; !</w:t>
+      </w:r>
+      <w:proofErr w:type="spellStart"/>
+      <w:r>
+        <w:rPr>
+          <w:b/>
+          <w:bCs/>
+        </w:rPr>
+        <w:t>r.querySelector</w:t>
+      </w:r>
+      <w:proofErr w:type="spellEnd"/>
+      <w:r>
+        <w:rPr>
+          <w:b/>
+          <w:bCs/>
+        </w:rPr>
+        <w:t>("</w:t>
+      </w:r>
+      <w:proofErr w:type="spellStart"/>
+      <w:r>
+        <w:rPr>
+          <w:b/>
+          <w:bCs/>
+        </w:rPr>
+        <w:t>th</w:t>
+      </w:r>
+      <w:proofErr w:type="spellEnd"/>
+      <w:r>
+        <w:rPr>
+          <w:b/>
+          <w:bCs/>
+        </w:rPr>
+        <w:t>"))</w:t>
+      </w:r>
+      <w:r>
+        <w:rPr>
+          <w:b/>
+          <w:bCs/>
+        </w:rPr>
+        <w:br/>
+      </w:r>
+      <w:r>
+        <w:rPr>
+          <w:b/>
+          <w:bCs/>
+        </w:rPr>
+        <w:lastRenderedPageBreak/>
+        <w:t xml:space="preserve">      .</w:t>
+      </w:r>
+      <w:proofErr w:type="spellStart"/>
+      <w:r>
+        <w:rPr>
+          <w:b/>
+          <w:bCs/>
+        </w:rPr>
+        <w:t>forEach</w:t>
+      </w:r>
+      <w:proofErr w:type="spellEnd"/>
+      <w:r>
+        <w:rPr>
+          <w:b/>
+          <w:bCs/>
+        </w:rPr>
+        <w:t xml:space="preserve">(r =&gt; </w:t>
+      </w:r>
+      <w:proofErr w:type="spellStart"/>
+      <w:r>
+        <w:rPr>
+          <w:b/>
+          <w:bCs/>
+        </w:rPr>
+        <w:t>r.style.display</w:t>
+      </w:r>
+      <w:proofErr w:type="spellEnd"/>
+      <w:r>
+        <w:rPr>
+          <w:b/>
+          <w:bCs/>
+        </w:rPr>
+        <w:t xml:space="preserve"> = "none");</w:t>
+      </w:r>
+      <w:r>
+        <w:rPr>
+          <w:b/>
+          <w:bCs/>
+        </w:rPr>
+        <w:br/>
+        <w:t xml:space="preserve">  }</w:t>
+      </w:r>
+    </w:p>
+    <w:p>
+      <w:pPr>
+        <w:bidi/>
+        <w:rPr>
+          <w:b/>
+          <w:bCs/>
+          <w:rtl/>
+        </w:rPr>
+      </w:pPr>
+    </w:p>
+    <w:p>
+      <w:pPr>
+        <w:bidi/>
+        <w:rPr>
+          <w:b/>
+          <w:bCs/>
+          <w:rtl/>
+        </w:rPr>
+      </w:pPr>
+    </w:p>
+    <w:p>
+      <w:pPr>
+        <w:bidi/>
+        <w:rPr>
+          <w:b/>
+          <w:bCs/>
+          <w:rtl/>
+        </w:rPr>
+      </w:pPr>
+      <w:r>
+        <w:rPr>
+          <w:rFonts w:hint="cs"/>
+          <w:b/>
+          <w:bCs/>
+          <w:rtl/>
+        </w:rPr>
+        <w:t>מכניס ערכים לתחנות רכבת:</w:t>
+      </w:r>
+    </w:p>
+    <w:p>
+      <w:pPr>
+        <w:rPr>
+          <w:b/>
+          <w:bCs/>
+        </w:rPr>
+      </w:pPr>
+      <w:r>
+        <w:rPr>
+          <w:b/>
+          <w:bCs/>
+        </w:rPr>
+        <w:t xml:space="preserve">let </w:t>
+      </w:r>
+      <w:proofErr w:type="spellStart"/>
+      <w:r>
+        <w:rPr>
+          <w:b/>
+          <w:bCs/>
+        </w:rPr>
+        <w:t>stationColIndex</w:t>
+      </w:r>
+      <w:proofErr w:type="spellEnd"/>
+      <w:r>
+        <w:rPr>
+          <w:b/>
+          <w:bCs/>
+        </w:rPr>
+        <w:t xml:space="preserve"> = -1;</w:t>
+      </w:r>
+    </w:p>
+    <w:p>
+      <w:pPr>
+        <w:rPr>
+          <w:b/>
+          <w:bCs/>
+          <w:rtl/>
+        </w:rPr>
+      </w:pPr>
+    </w:p>
+    <w:p>
+      <w:pPr>
+        <w:rPr>
+          <w:b/>
+          <w:bCs/>
+        </w:rPr>
+      </w:pPr>
+      <w:r>
+        <w:rPr>
+          <w:b/>
+          <w:bCs/>
+        </w:rPr>
+        <w:t>if (</w:t>
+      </w:r>
+      <w:proofErr w:type="spellStart"/>
+      <w:r>
+        <w:rPr>
+          <w:b/>
+          <w:bCs/>
+        </w:rPr>
+        <w:t>table_rating</w:t>
+      </w:r>
+      <w:proofErr w:type="spellEnd"/>
+      <w:r>
+        <w:rPr>
+          <w:b/>
+          <w:bCs/>
+        </w:rPr>
+        <w:t xml:space="preserve"> &amp;&amp; </w:t>
+      </w:r>
+      <w:proofErr w:type="spellStart"/>
+      <w:r>
+        <w:rPr>
+          <w:b/>
+          <w:bCs/>
+        </w:rPr>
+        <w:t>stationDropdown</w:t>
+      </w:r>
+      <w:proofErr w:type="spellEnd"/>
+      <w:r>
+        <w:rPr>
+          <w:b/>
+          <w:bCs/>
+        </w:rPr>
+        <w:t xml:space="preserve"> &amp;&amp; </w:t>
+      </w:r>
+      <w:proofErr w:type="spellStart"/>
+      <w:r>
+        <w:rPr>
+          <w:b/>
+          <w:bCs/>
+        </w:rPr>
+        <w:t>yearDropdown</w:t>
+      </w:r>
+      <w:proofErr w:type="spellEnd"/>
+      <w:r>
+        <w:rPr>
+          <w:b/>
+          <w:bCs/>
+        </w:rPr>
+        <w:t xml:space="preserve"> &amp;&amp; </w:t>
+      </w:r>
+      <w:proofErr w:type="spellStart"/>
+      <w:r>
+        <w:rPr>
+          <w:b/>
+          <w:bCs/>
+        </w:rPr>
+        <w:t>monthDropdown</w:t>
+      </w:r>
+      <w:proofErr w:type="spellEnd"/>
+      <w:r>
+        <w:rPr>
+          <w:b/>
+          <w:bCs/>
+        </w:rPr>
+        <w:t xml:space="preserve"> &amp;&amp; </w:t>
+      </w:r>
+      <w:proofErr w:type="spellStart"/>
+      <w:r>
+        <w:rPr>
+          <w:b/>
+          <w:bCs/>
+        </w:rPr>
+        <w:t>busDirectionDropdown</w:t>
+      </w:r>
+      <w:proofErr w:type="spellEnd"/>
+      <w:r>
+        <w:rPr>
+          <w:b/>
+          <w:bCs/>
+        </w:rPr>
+        <w:t xml:space="preserve"> &amp;&amp; </w:t>
+      </w:r>
+      <w:proofErr w:type="spellStart"/>
+      <w:r>
+        <w:rPr>
+          <w:b/>
+          <w:bCs/>
+        </w:rPr>
+        <w:t>weekDayCheckboxContainer</w:t>
+      </w:r>
+      <w:proofErr w:type="spellEnd"/>
+      <w:r>
+        <w:rPr>
+          <w:b/>
+          <w:bCs/>
+        </w:rPr>
+        <w:t>) {</w:t>
+      </w:r>
+      <w:r>
+        <w:rPr>
+          <w:b/>
+          <w:bCs/>
+        </w:rPr>
+        <w:br/>
       </w:r>
       <w:r>
         <w:rPr>
@@ -1818,320 +2440,8 @@
           <w:i/>
           <w:iCs/>
         </w:rPr>
-        <w:br/>
-      </w:r>
-      <w:r>
-        <w:rPr>
-          <w:b/>
-          <w:bCs/>
-        </w:rPr>
-        <w:t>&lt;div id="</w:t>
-      </w:r>
-      <w:proofErr w:type="spellStart"/>
-      <w:r>
-        <w:rPr>
-          <w:b/>
-          <w:bCs/>
-        </w:rPr>
-        <w:t>rating_table</w:t>
-      </w:r>
-      <w:proofErr w:type="spellEnd"/>
-      <w:r>
-        <w:rPr>
-          <w:b/>
-          <w:bCs/>
-        </w:rPr>
-        <w:t>"&gt;</w:t>
-      </w:r>
-      <w:r>
-        <w:rPr>
-          <w:b/>
-          <w:bCs/>
-        </w:rPr>
-        <w:br/>
-        <w:t xml:space="preserve"> </w:t>
-      </w:r>
-      <w:proofErr w:type="gramStart"/>
-      <w:r>
-        <w:rPr>
-          <w:b/>
-          <w:bCs/>
-        </w:rPr>
-        <w:t xml:space="preserve">   {{ </w:t>
-      </w:r>
-      <w:proofErr w:type="spellStart"/>
-      <w:r>
-        <w:rPr>
-          <w:b/>
-          <w:bCs/>
-        </w:rPr>
-        <w:t>df</w:t>
-      </w:r>
-      <w:proofErr w:type="gramEnd"/>
-      <w:r>
-        <w:rPr>
-          <w:b/>
-          <w:bCs/>
-        </w:rPr>
-        <w:t>_ranking_table_html|safe</w:t>
-      </w:r>
-      <w:proofErr w:type="spellEnd"/>
-      <w:r>
-        <w:rPr>
-          <w:b/>
-          <w:bCs/>
-        </w:rPr>
-        <w:t xml:space="preserve"> }}</w:t>
-      </w:r>
-      <w:r>
-        <w:rPr>
-          <w:b/>
-          <w:bCs/>
-        </w:rPr>
-        <w:br/>
-        <w:t>&lt;/div&gt;</w:t>
-      </w:r>
-    </w:p>
-    <w:p>
-      <w:pPr>
-        <w:bidi/>
-        <w:rPr>
-          <w:b/>
-          <w:bCs/>
-          <w:rtl/>
-        </w:rPr>
-      </w:pPr>
-    </w:p>
-    <w:p>
-      <w:pPr>
-        <w:bidi/>
-        <w:rPr>
-          <w:b/>
-          <w:bCs/>
-          <w:rtl/>
-        </w:rPr>
-      </w:pPr>
-    </w:p>
-    <w:p>
-      <w:pPr>
-        <w:bidi/>
-        <w:rPr>
-          <w:b/>
-          <w:bCs/>
-          <w:rtl/>
-        </w:rPr>
-      </w:pPr>
-      <w:r>
-        <w:rPr>
-          <w:rFonts w:hint="cs"/>
-          <w:b/>
-          <w:bCs/>
-          <w:rtl/>
-        </w:rPr>
-        <w:t>הגדרת משתנה:</w:t>
-      </w:r>
-    </w:p>
-    <w:p>
-      <w:pPr>
-        <w:rPr>
-          <w:b/>
-          <w:bCs/>
-          <w:rtl/>
-        </w:rPr>
-      </w:pPr>
-      <w:r>
-        <w:rPr>
-          <w:b/>
-          <w:bCs/>
-        </w:rPr>
-        <w:t xml:space="preserve">const </w:t>
-      </w:r>
-      <w:proofErr w:type="spellStart"/>
-      <w:r>
-        <w:rPr>
-          <w:b/>
-          <w:bCs/>
-        </w:rPr>
-        <w:t>table_rating</w:t>
-      </w:r>
-      <w:proofErr w:type="spellEnd"/>
-      <w:r>
-        <w:rPr>
-          <w:b/>
-          <w:bCs/>
-        </w:rPr>
-        <w:t xml:space="preserve"> = </w:t>
-      </w:r>
-      <w:proofErr w:type="spellStart"/>
-      <w:proofErr w:type="gramStart"/>
-      <w:r>
-        <w:rPr>
-          <w:b/>
-          <w:bCs/>
-        </w:rPr>
-        <w:t>document.getElementById</w:t>
-      </w:r>
-      <w:proofErr w:type="spellEnd"/>
-      <w:proofErr w:type="gramEnd"/>
-      <w:r>
-        <w:rPr>
-          <w:b/>
-          <w:bCs/>
-        </w:rPr>
-        <w:t>("</w:t>
-      </w:r>
-      <w:proofErr w:type="spellStart"/>
-      <w:r>
-        <w:rPr>
-          <w:b/>
-          <w:bCs/>
-        </w:rPr>
-        <w:t>rating_table</w:t>
-      </w:r>
-      <w:proofErr w:type="spellEnd"/>
-      <w:r>
-        <w:rPr>
-          <w:b/>
-          <w:bCs/>
-        </w:rPr>
-        <w:t>"</w:t>
-      </w:r>
-      <w:proofErr w:type="gramStart"/>
-      <w:r>
-        <w:rPr>
-          <w:b/>
-          <w:bCs/>
-        </w:rPr>
-        <w:t>);</w:t>
-      </w:r>
-      <w:proofErr w:type="gramEnd"/>
-    </w:p>
-    <w:p>
-      <w:pPr>
-        <w:rPr>
-          <w:b/>
-          <w:bCs/>
-        </w:rPr>
-      </w:pPr>
-      <w:r>
-        <w:rPr>
-          <w:b/>
-          <w:bCs/>
-        </w:rPr>
-        <w:t xml:space="preserve">const </w:t>
-      </w:r>
-      <w:proofErr w:type="spellStart"/>
-      <w:r>
-        <w:rPr>
-          <w:b/>
-          <w:bCs/>
-        </w:rPr>
-        <w:t>stationDropdown</w:t>
-      </w:r>
-      <w:proofErr w:type="spellEnd"/>
-      <w:r>
-        <w:rPr>
-          <w:b/>
-          <w:bCs/>
-        </w:rPr>
-        <w:t xml:space="preserve"> = </w:t>
-      </w:r>
-      <w:proofErr w:type="spellStart"/>
-      <w:proofErr w:type="gramStart"/>
-      <w:r>
-        <w:rPr>
-          <w:b/>
-          <w:bCs/>
-        </w:rPr>
-        <w:t>document.getElementById</w:t>
-      </w:r>
-      <w:proofErr w:type="spellEnd"/>
-      <w:proofErr w:type="gramEnd"/>
-      <w:r>
-        <w:rPr>
-          <w:b/>
-          <w:bCs/>
-        </w:rPr>
-        <w:t>("</w:t>
-      </w:r>
-      <w:proofErr w:type="spellStart"/>
-      <w:r>
-        <w:rPr>
-          <w:b/>
-          <w:bCs/>
-        </w:rPr>
-        <w:t>stationFilter</w:t>
-      </w:r>
-      <w:proofErr w:type="spellEnd"/>
-      <w:r>
-        <w:rPr>
-          <w:b/>
-          <w:bCs/>
-        </w:rPr>
-        <w:t>"</w:t>
-      </w:r>
-      <w:proofErr w:type="gramStart"/>
-      <w:r>
-        <w:rPr>
-          <w:b/>
-          <w:bCs/>
-        </w:rPr>
-        <w:t>);</w:t>
-      </w:r>
-      <w:proofErr w:type="gramEnd"/>
-    </w:p>
-    <w:p>
-      <w:pPr>
-        <w:rPr>
-          <w:b/>
-          <w:bCs/>
-          <w:rtl/>
-        </w:rPr>
-      </w:pPr>
-    </w:p>
-    <w:p>
-      <w:pPr>
-        <w:rPr>
-          <w:b/>
-          <w:bCs/>
-        </w:rPr>
-      </w:pPr>
-    </w:p>
-    <w:p>
-      <w:pPr>
-        <w:rPr>
-          <w:b/>
-          <w:bCs/>
-          <w:rtl/>
-        </w:rPr>
-      </w:pPr>
-      <w:r>
-        <w:rPr>
-          <w:rFonts w:hint="cs"/>
-          <w:b/>
-          <w:bCs/>
-          <w:rtl/>
-        </w:rPr>
-        <w:t>להחביא את כל הדאטה:</w:t>
-      </w:r>
-    </w:p>
-    <w:p>
-      <w:pPr>
-        <w:rPr>
-          <w:b/>
-          <w:bCs/>
-          <w:rtl/>
-        </w:rPr>
-      </w:pPr>
-      <w:r>
-        <w:rPr>
-          <w:b/>
-          <w:bCs/>
-        </w:rPr>
-        <w:t xml:space="preserve">function </w:t>
-      </w:r>
-      <w:proofErr w:type="spellStart"/>
-      <w:proofErr w:type="gramStart"/>
+        <w:t>// region BLOCK 4I</w:t>
+      </w:r>
       <w:r>
         <w:rPr>
           <w:b/>
@@ -2139,7 +2449,25 @@
           <w:i/>
           <w:iCs/>
         </w:rPr>
-        <w:t>hideAllTables</w:t>
+        <w:br/>
+        <w:t xml:space="preserve">  </w:t>
+      </w:r>
+      <w:proofErr w:type="spellStart"/>
+      <w:r>
+        <w:rPr>
+          <w:b/>
+          <w:bCs/>
+          <w:i/>
+          <w:iCs/>
+        </w:rPr>
+        <w:t>Array</w:t>
+      </w:r>
+      <w:r>
+        <w:rPr>
+          <w:b/>
+          <w:bCs/>
+        </w:rPr>
+        <w:t>.from</w:t>
       </w:r>
       <w:proofErr w:type="spellEnd"/>
       <w:r>
@@ -2149,13 +2477,303 @@
         </w:rPr>
         <w:t>(</w:t>
       </w:r>
-      <w:proofErr w:type="gramEnd"/>
-      <w:r>
-        <w:rPr>
-          <w:b/>
-          <w:bCs/>
-        </w:rPr>
-        <w:t>) {</w:t>
+      <w:proofErr w:type="spellStart"/>
+      <w:r>
+        <w:rPr>
+          <w:b/>
+          <w:bCs/>
+        </w:rPr>
+        <w:t>table_rating.querySelectorAll</w:t>
+      </w:r>
+      <w:proofErr w:type="spellEnd"/>
+      <w:r>
+        <w:rPr>
+          <w:b/>
+          <w:bCs/>
+        </w:rPr>
+        <w:t>("</w:t>
+      </w:r>
+      <w:proofErr w:type="spellStart"/>
+      <w:r>
+        <w:rPr>
+          <w:b/>
+          <w:bCs/>
+        </w:rPr>
+        <w:t>th</w:t>
+      </w:r>
+      <w:proofErr w:type="spellEnd"/>
+      <w:r>
+        <w:rPr>
+          <w:b/>
+          <w:bCs/>
+        </w:rPr>
+        <w:t>")).</w:t>
+      </w:r>
+      <w:proofErr w:type="spellStart"/>
+      <w:r>
+        <w:rPr>
+          <w:b/>
+          <w:bCs/>
+        </w:rPr>
+        <w:t>forEach</w:t>
+      </w:r>
+      <w:proofErr w:type="spellEnd"/>
+      <w:r>
+        <w:rPr>
+          <w:b/>
+          <w:bCs/>
+        </w:rPr>
+        <w:t>((</w:t>
+      </w:r>
+      <w:proofErr w:type="spellStart"/>
+      <w:r>
+        <w:rPr>
+          <w:b/>
+          <w:bCs/>
+        </w:rPr>
+        <w:t>th</w:t>
+      </w:r>
+      <w:proofErr w:type="spellEnd"/>
+      <w:r>
+        <w:rPr>
+          <w:b/>
+          <w:bCs/>
+        </w:rPr>
+        <w:t xml:space="preserve">, </w:t>
+      </w:r>
+      <w:proofErr w:type="spellStart"/>
+      <w:r>
+        <w:rPr>
+          <w:b/>
+          <w:bCs/>
+        </w:rPr>
+        <w:t>i</w:t>
+      </w:r>
+      <w:proofErr w:type="spellEnd"/>
+      <w:r>
+        <w:rPr>
+          <w:b/>
+          <w:bCs/>
+        </w:rPr>
+        <w:t>) =&gt; {</w:t>
+      </w:r>
+      <w:r>
+        <w:rPr>
+          <w:b/>
+          <w:bCs/>
+        </w:rPr>
+        <w:br/>
+        <w:t xml:space="preserve">    const t = </w:t>
+      </w:r>
+      <w:r>
+        <w:rPr>
+          <w:b/>
+          <w:bCs/>
+          <w:i/>
+          <w:iCs/>
+        </w:rPr>
+        <w:t>norm</w:t>
+      </w:r>
+      <w:r>
+        <w:rPr>
+          <w:b/>
+          <w:bCs/>
+        </w:rPr>
+        <w:t>(</w:t>
+      </w:r>
+      <w:proofErr w:type="spellStart"/>
+      <w:r>
+        <w:rPr>
+          <w:b/>
+          <w:bCs/>
+        </w:rPr>
+        <w:t>th.innerText</w:t>
+      </w:r>
+      <w:proofErr w:type="spellEnd"/>
+      <w:r>
+        <w:rPr>
+          <w:b/>
+          <w:bCs/>
+        </w:rPr>
+        <w:t>);</w:t>
+      </w:r>
+      <w:r>
+        <w:rPr>
+          <w:b/>
+          <w:bCs/>
+        </w:rPr>
+        <w:br/>
+        <w:t xml:space="preserve">    if (t === "</w:t>
+      </w:r>
+      <w:r>
+        <w:rPr>
+          <w:b/>
+          <w:bCs/>
+          <w:rtl/>
+        </w:rPr>
+        <w:t>שם</w:t>
+      </w:r>
+      <w:r>
+        <w:rPr>
+          <w:b/>
+          <w:bCs/>
+        </w:rPr>
+        <w:t xml:space="preserve"> </w:t>
+      </w:r>
+      <w:r>
+        <w:rPr>
+          <w:b/>
+          <w:bCs/>
+          <w:rtl/>
+        </w:rPr>
+        <w:t>תחנת</w:t>
+      </w:r>
+      <w:r>
+        <w:rPr>
+          <w:b/>
+          <w:bCs/>
+        </w:rPr>
+        <w:t xml:space="preserve"> </w:t>
+      </w:r>
+      <w:r>
+        <w:rPr>
+          <w:b/>
+          <w:bCs/>
+          <w:rtl/>
+        </w:rPr>
+        <w:t>הרכבת</w:t>
+      </w:r>
+      <w:r>
+        <w:rPr>
+          <w:b/>
+          <w:bCs/>
+        </w:rPr>
+        <w:t xml:space="preserve">") </w:t>
+      </w:r>
+      <w:proofErr w:type="spellStart"/>
+      <w:r>
+        <w:rPr>
+          <w:b/>
+          <w:bCs/>
+        </w:rPr>
+        <w:t>stationColIndex</w:t>
+      </w:r>
+      <w:proofErr w:type="spellEnd"/>
+      <w:r>
+        <w:rPr>
+          <w:b/>
+          <w:bCs/>
+        </w:rPr>
+        <w:t xml:space="preserve"> = </w:t>
+      </w:r>
+      <w:proofErr w:type="spellStart"/>
+      <w:r>
+        <w:rPr>
+          <w:b/>
+          <w:bCs/>
+        </w:rPr>
+        <w:t>i</w:t>
+      </w:r>
+      <w:proofErr w:type="spellEnd"/>
+      <w:r>
+        <w:rPr>
+          <w:b/>
+          <w:bCs/>
+        </w:rPr>
+        <w:t>;</w:t>
+      </w:r>
+      <w:r>
+        <w:rPr>
+          <w:b/>
+          <w:bCs/>
+        </w:rPr>
+        <w:br/>
+        <w:t xml:space="preserve">    if (t === "</w:t>
+      </w:r>
+      <w:r>
+        <w:rPr>
+          <w:b/>
+          <w:bCs/>
+          <w:rtl/>
+        </w:rPr>
+        <w:t>שנה</w:t>
+      </w:r>
+      <w:r>
+        <w:rPr>
+          <w:b/>
+          <w:bCs/>
+        </w:rPr>
+        <w:t xml:space="preserve">") yearColIndexT1 = </w:t>
+      </w:r>
+      <w:proofErr w:type="spellStart"/>
+      <w:r>
+        <w:rPr>
+          <w:b/>
+          <w:bCs/>
+        </w:rPr>
+        <w:t>i</w:t>
+      </w:r>
+      <w:proofErr w:type="spellEnd"/>
+      <w:r>
+        <w:rPr>
+          <w:b/>
+          <w:bCs/>
+        </w:rPr>
+        <w:t>;</w:t>
+      </w:r>
+      <w:r>
+        <w:rPr>
+          <w:b/>
+          <w:bCs/>
+        </w:rPr>
+        <w:br/>
+        <w:t xml:space="preserve">    if (t === "</w:t>
+      </w:r>
+      <w:r>
+        <w:rPr>
+          <w:b/>
+          <w:bCs/>
+          <w:rtl/>
+        </w:rPr>
+        <w:t>חודש</w:t>
+      </w:r>
+      <w:r>
+        <w:rPr>
+          <w:b/>
+          <w:bCs/>
+        </w:rPr>
+        <w:t xml:space="preserve">") monthColIndexT1 = </w:t>
+      </w:r>
+      <w:proofErr w:type="spellStart"/>
+      <w:r>
+        <w:rPr>
+          <w:b/>
+          <w:bCs/>
+        </w:rPr>
+        <w:t>i</w:t>
+      </w:r>
+      <w:proofErr w:type="spellEnd"/>
+      <w:r>
+        <w:rPr>
+          <w:b/>
+          <w:bCs/>
+        </w:rPr>
+        <w:t>;</w:t>
+      </w:r>
+      <w:r>
+        <w:rPr>
+          <w:b/>
+          <w:bCs/>
+        </w:rPr>
+        <w:br/>
+        <w:t xml:space="preserve">  });</w:t>
+      </w:r>
+      <w:r>
+        <w:rPr>
+          <w:b/>
+          <w:bCs/>
+        </w:rPr>
+        <w:br/>
       </w:r>
       <w:r>
         <w:rPr>
@@ -2171,15 +2789,80 @@
           <w:b/>
           <w:bCs/>
         </w:rPr>
-        <w:t>table_rating</w:t>
-      </w:r>
-      <w:proofErr w:type="spellEnd"/>
-      <w:r>
-        <w:rPr>
-          <w:b/>
-          <w:bCs/>
-        </w:rPr>
-        <w:t>) {</w:t>
+        <w:t>stationColIndex</w:t>
+      </w:r>
+      <w:proofErr w:type="spellEnd"/>
+      <w:r>
+        <w:rPr>
+          <w:b/>
+          <w:bCs/>
+        </w:rPr>
+        <w:t xml:space="preserve"> !== -1) {</w:t>
+      </w:r>
+      <w:r>
+        <w:rPr>
+          <w:b/>
+          <w:bCs/>
+        </w:rPr>
+        <w:br/>
+        <w:t xml:space="preserve">    const </w:t>
+      </w:r>
+      <w:proofErr w:type="spellStart"/>
+      <w:r>
+        <w:rPr>
+          <w:b/>
+          <w:bCs/>
+        </w:rPr>
+        <w:t>allRows</w:t>
+      </w:r>
+      <w:proofErr w:type="spellEnd"/>
+      <w:r>
+        <w:rPr>
+          <w:b/>
+          <w:bCs/>
+        </w:rPr>
+        <w:t xml:space="preserve"> = </w:t>
+      </w:r>
+      <w:proofErr w:type="spellStart"/>
+      <w:r>
+        <w:rPr>
+          <w:b/>
+          <w:bCs/>
+          <w:i/>
+          <w:iCs/>
+        </w:rPr>
+        <w:t>Array</w:t>
+      </w:r>
+      <w:r>
+        <w:rPr>
+          <w:b/>
+          <w:bCs/>
+        </w:rPr>
+        <w:t>.from</w:t>
+      </w:r>
+      <w:proofErr w:type="spellEnd"/>
+      <w:r>
+        <w:rPr>
+          <w:b/>
+          <w:bCs/>
+        </w:rPr>
+        <w:t>(</w:t>
+      </w:r>
+      <w:proofErr w:type="spellStart"/>
+      <w:r>
+        <w:rPr>
+          <w:b/>
+          <w:bCs/>
+        </w:rPr>
+        <w:t>table_rating.querySelectorAll</w:t>
+      </w:r>
+      <w:proofErr w:type="spellEnd"/>
+      <w:r>
+        <w:rPr>
+          <w:b/>
+          <w:bCs/>
+        </w:rPr>
+        <w:t>("tr"));</w:t>
       </w:r>
       <w:r>
         <w:rPr>
@@ -2194,50 +2877,111 @@
         <w:rPr>
           <w:b/>
           <w:bCs/>
+        </w:rPr>
+        <w:t>dataRows</w:t>
+      </w:r>
+      <w:proofErr w:type="spellEnd"/>
+      <w:r>
+        <w:rPr>
+          <w:b/>
+          <w:bCs/>
+        </w:rPr>
+        <w:t xml:space="preserve"> = </w:t>
+      </w:r>
+      <w:proofErr w:type="spellStart"/>
+      <w:r>
+        <w:rPr>
+          <w:b/>
+          <w:bCs/>
+        </w:rPr>
+        <w:t>allRows.filter</w:t>
+      </w:r>
+      <w:proofErr w:type="spellEnd"/>
+      <w:r>
+        <w:rPr>
+          <w:b/>
+          <w:bCs/>
+        </w:rPr>
+        <w:t>(r =&gt; !</w:t>
+      </w:r>
+      <w:proofErr w:type="spellStart"/>
+      <w:r>
+        <w:rPr>
+          <w:b/>
+          <w:bCs/>
+        </w:rPr>
+        <w:t>r.querySelector</w:t>
+      </w:r>
+      <w:proofErr w:type="spellEnd"/>
+      <w:r>
+        <w:rPr>
+          <w:b/>
+          <w:bCs/>
+        </w:rPr>
+        <w:t>("</w:t>
+      </w:r>
+      <w:proofErr w:type="spellStart"/>
+      <w:r>
+        <w:rPr>
+          <w:b/>
+          <w:bCs/>
+        </w:rPr>
+        <w:t>th</w:t>
+      </w:r>
+      <w:proofErr w:type="spellEnd"/>
+      <w:r>
+        <w:rPr>
+          <w:b/>
+          <w:bCs/>
+        </w:rPr>
+        <w:t>"));</w:t>
+      </w:r>
+      <w:r>
+        <w:rPr>
+          <w:b/>
+          <w:bCs/>
+        </w:rPr>
+        <w:br/>
+      </w:r>
+      <w:r>
+        <w:rPr>
+          <w:b/>
+          <w:bCs/>
+        </w:rPr>
+        <w:br/>
+        <w:t xml:space="preserve">    const </w:t>
+      </w:r>
+      <w:proofErr w:type="spellStart"/>
+      <w:r>
+        <w:rPr>
+          <w:b/>
+          <w:bCs/>
+        </w:rPr>
+        <w:t>stationSet</w:t>
+      </w:r>
+      <w:proofErr w:type="spellEnd"/>
+      <w:r>
+        <w:rPr>
+          <w:b/>
+          <w:bCs/>
+        </w:rPr>
+        <w:t xml:space="preserve"> = new </w:t>
+      </w:r>
+      <w:r>
+        <w:rPr>
+          <w:b/>
+          <w:bCs/>
           <w:i/>
           <w:iCs/>
         </w:rPr>
-        <w:t>Array</w:t>
-      </w:r>
-      <w:r>
-        <w:rPr>
-          <w:b/>
-          <w:bCs/>
-        </w:rPr>
-        <w:t>.from</w:t>
-      </w:r>
-      <w:proofErr w:type="spellEnd"/>
-      <w:r>
-        <w:rPr>
-          <w:b/>
-          <w:bCs/>
-        </w:rPr>
-        <w:t>(</w:t>
-      </w:r>
-      <w:proofErr w:type="spellStart"/>
-      <w:r>
-        <w:rPr>
-          <w:b/>
-          <w:bCs/>
-        </w:rPr>
-        <w:t>table_</w:t>
-      </w:r>
-      <w:proofErr w:type="gramStart"/>
-      <w:r>
-        <w:rPr>
-          <w:b/>
-          <w:bCs/>
-        </w:rPr>
-        <w:t>rating.querySelectorAll</w:t>
-      </w:r>
-      <w:proofErr w:type="spellEnd"/>
-      <w:proofErr w:type="gramEnd"/>
-      <w:r>
-        <w:rPr>
-          <w:b/>
-          <w:bCs/>
-        </w:rPr>
-        <w:t>("tr"))</w:t>
+        <w:t>Set</w:t>
+      </w:r>
+      <w:r>
+        <w:rPr>
+          <w:b/>
+          <w:bCs/>
+        </w:rPr>
+        <w:t>();</w:t>
       </w:r>
       <w:r>
         <w:rPr>
@@ -2247,69 +2991,21 @@
         <w:br/>
         <w:t xml:space="preserve">    </w:t>
       </w:r>
-      <w:proofErr w:type="gramStart"/>
-      <w:r>
-        <w:rPr>
-          <w:b/>
-          <w:bCs/>
-        </w:rPr>
-        <w:t xml:space="preserve">  .filter</w:t>
-      </w:r>
-      <w:proofErr w:type="gramEnd"/>
-      <w:r>
-        <w:rPr>
-          <w:b/>
-          <w:bCs/>
-        </w:rPr>
-        <w:t>(r =</w:t>
-      </w:r>
-      <w:proofErr w:type="gramStart"/>
-      <w:r>
-        <w:rPr>
-          <w:b/>
-          <w:bCs/>
-        </w:rPr>
-        <w:t>&gt; !</w:t>
-      </w:r>
-      <w:proofErr w:type="spellStart"/>
-      <w:r>
-        <w:rPr>
-          <w:b/>
-          <w:bCs/>
-        </w:rPr>
-        <w:t>r</w:t>
-      </w:r>
-      <w:proofErr w:type="gramEnd"/>
-      <w:r>
-        <w:rPr>
-          <w:b/>
-          <w:bCs/>
-        </w:rPr>
-        <w:t>.querySelector</w:t>
-      </w:r>
-      <w:proofErr w:type="spellEnd"/>
-      <w:r>
-        <w:rPr>
-          <w:b/>
-          <w:bCs/>
-        </w:rPr>
-        <w:t>("</w:t>
-      </w:r>
-      <w:proofErr w:type="spellStart"/>
-      <w:r>
-        <w:rPr>
-          <w:b/>
-          <w:bCs/>
-        </w:rPr>
-        <w:t>th</w:t>
-      </w:r>
-      <w:proofErr w:type="spellEnd"/>
-      <w:r>
-        <w:rPr>
-          <w:b/>
-          <w:bCs/>
-        </w:rPr>
-        <w:t>"))</w:t>
+      <w:proofErr w:type="spellStart"/>
+      <w:r>
+        <w:rPr>
+          <w:b/>
+          <w:bCs/>
+        </w:rPr>
+        <w:t>dataRows.forEach</w:t>
+      </w:r>
+      <w:proofErr w:type="spellEnd"/>
+      <w:r>
+        <w:rPr>
+          <w:b/>
+          <w:bCs/>
+        </w:rPr>
+        <w:t>(r =&gt; {</w:t>
       </w:r>
       <w:r>
         <w:rPr>
@@ -2317,6 +3013,394 @@
           <w:bCs/>
         </w:rPr>
         <w:br/>
+        <w:t xml:space="preserve">      const v = </w:t>
+      </w:r>
+      <w:r>
+        <w:rPr>
+          <w:b/>
+          <w:bCs/>
+          <w:i/>
+          <w:iCs/>
+        </w:rPr>
+        <w:t>norm</w:t>
+      </w:r>
+      <w:r>
+        <w:rPr>
+          <w:b/>
+          <w:bCs/>
+        </w:rPr>
+        <w:t>(</w:t>
+      </w:r>
+      <w:proofErr w:type="spellStart"/>
+      <w:r>
+        <w:rPr>
+          <w:b/>
+          <w:bCs/>
+        </w:rPr>
+        <w:t>r.children</w:t>
+      </w:r>
+      <w:proofErr w:type="spellEnd"/>
+      <w:r>
+        <w:rPr>
+          <w:b/>
+          <w:bCs/>
+        </w:rPr>
+        <w:t>[</w:t>
+      </w:r>
+      <w:proofErr w:type="spellStart"/>
+      <w:r>
+        <w:rPr>
+          <w:b/>
+          <w:bCs/>
+        </w:rPr>
+        <w:t>stationColIndex</w:t>
+      </w:r>
+      <w:proofErr w:type="spellEnd"/>
+      <w:r>
+        <w:rPr>
+          <w:b/>
+          <w:bCs/>
+        </w:rPr>
+        <w:t>]?.</w:t>
+      </w:r>
+      <w:proofErr w:type="spellStart"/>
+      <w:r>
+        <w:rPr>
+          <w:b/>
+          <w:bCs/>
+        </w:rPr>
+        <w:t>innerText</w:t>
+      </w:r>
+      <w:proofErr w:type="spellEnd"/>
+      <w:r>
+        <w:rPr>
+          <w:b/>
+          <w:bCs/>
+        </w:rPr>
+        <w:t>);</w:t>
+      </w:r>
+      <w:r>
+        <w:rPr>
+          <w:b/>
+          <w:bCs/>
+        </w:rPr>
+        <w:br/>
+        <w:t xml:space="preserve">      if (v) </w:t>
+      </w:r>
+      <w:proofErr w:type="spellStart"/>
+      <w:r>
+        <w:rPr>
+          <w:b/>
+          <w:bCs/>
+        </w:rPr>
+        <w:t>stationSet.add</w:t>
+      </w:r>
+      <w:proofErr w:type="spellEnd"/>
+      <w:r>
+        <w:rPr>
+          <w:b/>
+          <w:bCs/>
+        </w:rPr>
+        <w:t>(v);</w:t>
+      </w:r>
+      <w:r>
+        <w:rPr>
+          <w:b/>
+          <w:bCs/>
+        </w:rPr>
+        <w:br/>
+        <w:t xml:space="preserve">    });</w:t>
+      </w:r>
+      <w:r>
+        <w:rPr>
+          <w:b/>
+          <w:bCs/>
+        </w:rPr>
+        <w:br/>
+      </w:r>
+      <w:r>
+        <w:rPr>
+          <w:b/>
+          <w:bCs/>
+        </w:rPr>
+        <w:br/>
+        <w:t xml:space="preserve">    </w:t>
+      </w:r>
+      <w:proofErr w:type="spellStart"/>
+      <w:r>
+        <w:rPr>
+          <w:b/>
+          <w:bCs/>
+        </w:rPr>
+        <w:t>stationDropdown.innerHTML</w:t>
+      </w:r>
+      <w:proofErr w:type="spellEnd"/>
+      <w:r>
+        <w:rPr>
+          <w:b/>
+          <w:bCs/>
+        </w:rPr>
+        <w:t xml:space="preserve"> = "";</w:t>
+      </w:r>
+      <w:r>
+        <w:rPr>
+          <w:b/>
+          <w:bCs/>
+        </w:rPr>
+        <w:br/>
+      </w:r>
+      <w:r>
+        <w:rPr>
+          <w:b/>
+          <w:bCs/>
+        </w:rPr>
+        <w:br/>
+        <w:t xml:space="preserve">    const </w:t>
+      </w:r>
+      <w:proofErr w:type="spellStart"/>
+      <w:r>
+        <w:rPr>
+          <w:b/>
+          <w:bCs/>
+        </w:rPr>
+        <w:t>sph</w:t>
+      </w:r>
+      <w:proofErr w:type="spellEnd"/>
+      <w:r>
+        <w:rPr>
+          <w:b/>
+          <w:bCs/>
+        </w:rPr>
+        <w:t xml:space="preserve"> = </w:t>
+      </w:r>
+      <w:proofErr w:type="spellStart"/>
+      <w:r>
+        <w:rPr>
+          <w:b/>
+          <w:bCs/>
+        </w:rPr>
+        <w:t>document.createElement</w:t>
+      </w:r>
+      <w:proofErr w:type="spellEnd"/>
+      <w:r>
+        <w:rPr>
+          <w:b/>
+          <w:bCs/>
+        </w:rPr>
+        <w:t>("option");</w:t>
+      </w:r>
+      <w:r>
+        <w:rPr>
+          <w:b/>
+          <w:bCs/>
+        </w:rPr>
+        <w:br/>
+        <w:t xml:space="preserve">    </w:t>
+      </w:r>
+      <w:proofErr w:type="spellStart"/>
+      <w:r>
+        <w:rPr>
+          <w:b/>
+          <w:bCs/>
+        </w:rPr>
+        <w:t>sph.value</w:t>
+      </w:r>
+      <w:proofErr w:type="spellEnd"/>
+      <w:r>
+        <w:rPr>
+          <w:b/>
+          <w:bCs/>
+        </w:rPr>
+        <w:t xml:space="preserve"> = "";</w:t>
+      </w:r>
+      <w:r>
+        <w:rPr>
+          <w:b/>
+          <w:bCs/>
+        </w:rPr>
+        <w:br/>
+        <w:t xml:space="preserve">    </w:t>
+      </w:r>
+      <w:proofErr w:type="spellStart"/>
+      <w:r>
+        <w:rPr>
+          <w:b/>
+          <w:bCs/>
+        </w:rPr>
+        <w:t>sph.textContent</w:t>
+      </w:r>
+      <w:proofErr w:type="spellEnd"/>
+      <w:r>
+        <w:rPr>
+          <w:b/>
+          <w:bCs/>
+        </w:rPr>
+        <w:t xml:space="preserve"> = "</w:t>
+      </w:r>
+      <w:r>
+        <w:rPr>
+          <w:b/>
+          <w:bCs/>
+          <w:rtl/>
+        </w:rPr>
+        <w:t>בחר</w:t>
+      </w:r>
+      <w:r>
+        <w:rPr>
+          <w:b/>
+          <w:bCs/>
+        </w:rPr>
+        <w:t xml:space="preserve"> </w:t>
+      </w:r>
+      <w:r>
+        <w:rPr>
+          <w:b/>
+          <w:bCs/>
+          <w:rtl/>
+        </w:rPr>
+        <w:t>תחנה</w:t>
+      </w:r>
+      <w:r>
+        <w:rPr>
+          <w:b/>
+          <w:bCs/>
+        </w:rPr>
+        <w:t>";</w:t>
+      </w:r>
+      <w:r>
+        <w:rPr>
+          <w:b/>
+          <w:bCs/>
+        </w:rPr>
+        <w:br/>
+        <w:t xml:space="preserve">    </w:t>
+      </w:r>
+      <w:proofErr w:type="spellStart"/>
+      <w:r>
+        <w:rPr>
+          <w:b/>
+          <w:bCs/>
+        </w:rPr>
+        <w:t>stationDropdown.appendChild</w:t>
+      </w:r>
+      <w:proofErr w:type="spellEnd"/>
+      <w:r>
+        <w:rPr>
+          <w:b/>
+          <w:bCs/>
+        </w:rPr>
+        <w:t>(</w:t>
+      </w:r>
+      <w:proofErr w:type="spellStart"/>
+      <w:r>
+        <w:rPr>
+          <w:b/>
+          <w:bCs/>
+        </w:rPr>
+        <w:t>sph</w:t>
+      </w:r>
+      <w:proofErr w:type="spellEnd"/>
+      <w:r>
+        <w:rPr>
+          <w:b/>
+          <w:bCs/>
+        </w:rPr>
+        <w:t>);</w:t>
+      </w:r>
+      <w:r>
+        <w:rPr>
+          <w:b/>
+          <w:bCs/>
+        </w:rPr>
+        <w:br/>
+      </w:r>
+      <w:r>
+        <w:rPr>
+          <w:b/>
+          <w:bCs/>
+        </w:rPr>
+        <w:br/>
+        <w:t xml:space="preserve">    </w:t>
+      </w:r>
+      <w:proofErr w:type="spellStart"/>
+      <w:r>
+        <w:rPr>
+          <w:b/>
+          <w:bCs/>
+          <w:i/>
+          <w:iCs/>
+        </w:rPr>
+        <w:t>Array</w:t>
+      </w:r>
+      <w:r>
+        <w:rPr>
+          <w:b/>
+          <w:bCs/>
+        </w:rPr>
+        <w:t>.from</w:t>
+      </w:r>
+      <w:proofErr w:type="spellEnd"/>
+      <w:r>
+        <w:rPr>
+          <w:b/>
+          <w:bCs/>
+        </w:rPr>
+        <w:t>(</w:t>
+      </w:r>
+      <w:proofErr w:type="spellStart"/>
+      <w:r>
+        <w:rPr>
+          <w:b/>
+          <w:bCs/>
+        </w:rPr>
+        <w:t>stationSet</w:t>
+      </w:r>
+      <w:proofErr w:type="spellEnd"/>
+      <w:r>
+        <w:rPr>
+          <w:b/>
+          <w:bCs/>
+        </w:rPr>
+        <w:t>).sort().</w:t>
+      </w:r>
+      <w:proofErr w:type="spellStart"/>
+      <w:r>
+        <w:rPr>
+          <w:b/>
+          <w:bCs/>
+        </w:rPr>
+        <w:t>forEach</w:t>
+      </w:r>
+      <w:proofErr w:type="spellEnd"/>
+      <w:r>
+        <w:rPr>
+          <w:b/>
+          <w:bCs/>
+        </w:rPr>
+        <w:t>(</w:t>
+      </w:r>
+      <w:proofErr w:type="spellStart"/>
+      <w:r>
+        <w:rPr>
+          <w:b/>
+          <w:bCs/>
+        </w:rPr>
+        <w:t>st</w:t>
+      </w:r>
+      <w:proofErr w:type="spellEnd"/>
+      <w:r>
+        <w:rPr>
+          <w:b/>
+          <w:bCs/>
+        </w:rPr>
+        <w:t xml:space="preserve"> =&gt; {</w:t>
+      </w:r>
+      <w:r>
+        <w:rPr>
+          <w:b/>
+          <w:bCs/>
+        </w:rPr>
+        <w:br/>
       </w:r>
       <w:r>
         <w:rPr>
@@ -2324,26 +3408,160 @@
           <w:bCs/>
         </w:rPr>
         <w:lastRenderedPageBreak/>
+        <w:t xml:space="preserve">      const opt = </w:t>
+      </w:r>
+      <w:proofErr w:type="spellStart"/>
+      <w:r>
+        <w:rPr>
+          <w:b/>
+          <w:bCs/>
+        </w:rPr>
+        <w:t>document.createElement</w:t>
+      </w:r>
+      <w:proofErr w:type="spellEnd"/>
+      <w:r>
+        <w:rPr>
+          <w:b/>
+          <w:bCs/>
+        </w:rPr>
+        <w:t>("option");</w:t>
+      </w:r>
+      <w:r>
+        <w:rPr>
+          <w:b/>
+          <w:bCs/>
+        </w:rPr>
+        <w:br/>
+        <w:t xml:space="preserve">      </w:t>
+      </w:r>
+      <w:proofErr w:type="spellStart"/>
+      <w:r>
+        <w:rPr>
+          <w:b/>
+          <w:bCs/>
+        </w:rPr>
+        <w:t>opt.value</w:t>
+      </w:r>
+      <w:proofErr w:type="spellEnd"/>
+      <w:r>
+        <w:rPr>
+          <w:b/>
+          <w:bCs/>
+        </w:rPr>
+        <w:t xml:space="preserve"> = </w:t>
+      </w:r>
+      <w:proofErr w:type="spellStart"/>
+      <w:r>
+        <w:rPr>
+          <w:b/>
+          <w:bCs/>
+        </w:rPr>
+        <w:t>st</w:t>
+      </w:r>
+      <w:proofErr w:type="spellEnd"/>
+      <w:r>
+        <w:rPr>
+          <w:b/>
+          <w:bCs/>
+        </w:rPr>
+        <w:t>;</w:t>
+      </w:r>
+      <w:r>
+        <w:rPr>
+          <w:b/>
+          <w:bCs/>
+        </w:rPr>
+        <w:br/>
+        <w:t xml:space="preserve">      </w:t>
+      </w:r>
+      <w:proofErr w:type="spellStart"/>
+      <w:r>
+        <w:rPr>
+          <w:b/>
+          <w:bCs/>
+        </w:rPr>
+        <w:t>opt.textContent</w:t>
+      </w:r>
+      <w:proofErr w:type="spellEnd"/>
+      <w:r>
+        <w:rPr>
+          <w:b/>
+          <w:bCs/>
+        </w:rPr>
+        <w:t xml:space="preserve"> = </w:t>
+      </w:r>
+      <w:proofErr w:type="spellStart"/>
+      <w:r>
+        <w:rPr>
+          <w:b/>
+          <w:bCs/>
+        </w:rPr>
+        <w:t>st</w:t>
+      </w:r>
+      <w:proofErr w:type="spellEnd"/>
+      <w:r>
+        <w:rPr>
+          <w:b/>
+          <w:bCs/>
+        </w:rPr>
+        <w:t>;</w:t>
+      </w:r>
+      <w:r>
+        <w:rPr>
+          <w:b/>
+          <w:bCs/>
+        </w:rPr>
+        <w:br/>
+        <w:t xml:space="preserve">      </w:t>
+      </w:r>
+      <w:proofErr w:type="spellStart"/>
+      <w:r>
+        <w:rPr>
+          <w:b/>
+          <w:bCs/>
+        </w:rPr>
+        <w:t>stationDropdown.appendChild</w:t>
+      </w:r>
+      <w:proofErr w:type="spellEnd"/>
+      <w:r>
+        <w:rPr>
+          <w:b/>
+          <w:bCs/>
+        </w:rPr>
+        <w:t>(opt);</w:t>
+      </w:r>
+      <w:r>
+        <w:rPr>
+          <w:b/>
+          <w:bCs/>
+        </w:rPr>
+        <w:br/>
+        <w:t xml:space="preserve">    });</w:t>
+      </w:r>
+      <w:r>
+        <w:rPr>
+          <w:b/>
+          <w:bCs/>
+        </w:rPr>
+        <w:br/>
+      </w:r>
+      <w:r>
+        <w:rPr>
+          <w:b/>
+          <w:bCs/>
+        </w:rPr>
+        <w:br/>
         <w:t xml:space="preserve">    </w:t>
       </w:r>
-      <w:proofErr w:type="gramStart"/>
-      <w:r>
-        <w:rPr>
-          <w:b/>
-          <w:bCs/>
-        </w:rPr>
-        <w:t xml:space="preserve">  .</w:t>
-      </w:r>
-      <w:proofErr w:type="spellStart"/>
-      <w:r>
-        <w:rPr>
-          <w:b/>
-          <w:bCs/>
-        </w:rPr>
-        <w:t>forEach</w:t>
-      </w:r>
-      <w:proofErr w:type="spellEnd"/>
-      <w:proofErr w:type="gramEnd"/>
+      <w:proofErr w:type="spellStart"/>
+      <w:r>
+        <w:rPr>
+          <w:b/>
+          <w:bCs/>
+        </w:rPr>
+        <w:t>dataRows.forEach</w:t>
+      </w:r>
+      <w:proofErr w:type="spellEnd"/>
       <w:r>
         <w:rPr>
           <w:b/>
@@ -2352,21 +3570,12 @@
         <w:t xml:space="preserve">(r =&gt; </w:t>
       </w:r>
       <w:proofErr w:type="spellStart"/>
-      <w:proofErr w:type="gramStart"/>
-      <w:r>
-        <w:rPr>
-          <w:b/>
-          <w:bCs/>
-        </w:rPr>
-        <w:t>r.style</w:t>
-      </w:r>
-      <w:proofErr w:type="gramEnd"/>
-      <w:r>
-        <w:rPr>
-          <w:b/>
-          <w:bCs/>
-        </w:rPr>
-        <w:t>.display</w:t>
+      <w:r>
+        <w:rPr>
+          <w:b/>
+          <w:bCs/>
+        </w:rPr>
+        <w:t>r.style.display</w:t>
       </w:r>
       <w:proofErr w:type="spellEnd"/>
       <w:r>
@@ -2387,33 +3596,28 @@
     </w:p>
     <w:p>
       <w:pPr>
-        <w:bidi/>
-        <w:rPr>
-          <w:b/>
-          <w:bCs/>
-          <w:rtl/>
-        </w:rPr>
-      </w:pPr>
-    </w:p>
-    <w:p>
-      <w:pPr>
-        <w:bidi/>
-        <w:rPr>
-          <w:b/>
-          <w:bCs/>
-          <w:rtl/>
-        </w:rPr>
-      </w:pPr>
-    </w:p>
-    <w:p>
-      <w:pPr>
-        <w:bidi/>
-        <w:rPr>
-          <w:b/>
-          <w:bCs/>
-          <w:rtl/>
-        </w:rPr>
-      </w:pPr>
+        <w:rPr>
+          <w:b/>
+          <w:bCs/>
+          <w:rtl/>
+        </w:rPr>
+      </w:pPr>
+    </w:p>
+    <w:p>
+      <w:pPr>
+        <w:rPr>
+          <w:b/>
+          <w:bCs/>
+          <w:rtl/>
+        </w:rPr>
+      </w:pPr>
+      <w:r>
+        <w:rPr>
+          <w:b/>
+          <w:bCs/>
+        </w:rPr>
+        <w:t>apply filters</w:t>
+      </w:r>
       <w:r>
         <w:rPr>
           <w:rFonts w:hint="cs"/>
@@ -2421,175 +3625,24 @@
           <w:bCs/>
           <w:rtl/>
         </w:rPr>
-        <w:t>מכניס ערכים לתחנות רכבת:</w:t>
-      </w:r>
-    </w:p>
-    <w:p>
-      <w:pPr>
-        <w:rPr>
-          <w:b/>
-          <w:bCs/>
-        </w:rPr>
-      </w:pPr>
-      <w:r>
-        <w:rPr>
-          <w:b/>
-          <w:bCs/>
-        </w:rPr>
-        <w:t xml:space="preserve">let </w:t>
-      </w:r>
-      <w:proofErr w:type="spellStart"/>
-      <w:r>
-        <w:rPr>
-          <w:b/>
-          <w:bCs/>
-        </w:rPr>
-        <w:t>stationColIndex</w:t>
-      </w:r>
-      <w:proofErr w:type="spellEnd"/>
-      <w:r>
-        <w:rPr>
-          <w:b/>
-          <w:bCs/>
-        </w:rPr>
-        <w:t xml:space="preserve"> = </w:t>
-      </w:r>
-      <w:proofErr w:type="gramStart"/>
-      <w:r>
-        <w:rPr>
-          <w:b/>
-          <w:bCs/>
-        </w:rPr>
-        <w:t>-1;</w:t>
-      </w:r>
-      <w:proofErr w:type="gramEnd"/>
-    </w:p>
-    <w:p>
-      <w:pPr>
-        <w:rPr>
-          <w:b/>
-          <w:bCs/>
-          <w:rtl/>
-        </w:rPr>
-      </w:pPr>
-    </w:p>
-    <w:p>
-      <w:pPr>
-        <w:rPr>
-          <w:b/>
-          <w:bCs/>
-        </w:rPr>
-      </w:pPr>
-      <w:r>
-        <w:rPr>
-          <w:b/>
-          <w:bCs/>
-        </w:rPr>
-        <w:t>if (</w:t>
-      </w:r>
-      <w:proofErr w:type="spellStart"/>
-      <w:r>
-        <w:rPr>
-          <w:b/>
-          <w:bCs/>
-        </w:rPr>
-        <w:t>table_rating</w:t>
-      </w:r>
-      <w:proofErr w:type="spellEnd"/>
-      <w:r>
-        <w:rPr>
-          <w:b/>
-          <w:bCs/>
-        </w:rPr>
-        <w:t xml:space="preserve"> &amp;&amp; </w:t>
-      </w:r>
-      <w:proofErr w:type="spellStart"/>
-      <w:r>
-        <w:rPr>
-          <w:b/>
-          <w:bCs/>
-        </w:rPr>
-        <w:t>stationDropdown</w:t>
-      </w:r>
-      <w:proofErr w:type="spellEnd"/>
-      <w:r>
-        <w:rPr>
-          <w:b/>
-          <w:bCs/>
-        </w:rPr>
-        <w:t xml:space="preserve"> &amp;&amp; </w:t>
-      </w:r>
-      <w:proofErr w:type="spellStart"/>
-      <w:r>
-        <w:rPr>
-          <w:b/>
-          <w:bCs/>
-        </w:rPr>
-        <w:t>yearDropdown</w:t>
-      </w:r>
-      <w:proofErr w:type="spellEnd"/>
-      <w:r>
-        <w:rPr>
-          <w:b/>
-          <w:bCs/>
-        </w:rPr>
-        <w:t xml:space="preserve"> &amp;&amp; </w:t>
-      </w:r>
-      <w:proofErr w:type="spellStart"/>
-      <w:r>
-        <w:rPr>
-          <w:b/>
-          <w:bCs/>
-        </w:rPr>
-        <w:t>monthDropdown</w:t>
-      </w:r>
-      <w:proofErr w:type="spellEnd"/>
-      <w:r>
-        <w:rPr>
-          <w:b/>
-          <w:bCs/>
-        </w:rPr>
-        <w:t xml:space="preserve"> &amp;&amp; </w:t>
-      </w:r>
-      <w:proofErr w:type="spellStart"/>
-      <w:r>
-        <w:rPr>
-          <w:b/>
-          <w:bCs/>
-        </w:rPr>
-        <w:t>busDirectionDropdown</w:t>
-      </w:r>
-      <w:proofErr w:type="spellEnd"/>
-      <w:r>
-        <w:rPr>
-          <w:b/>
-          <w:bCs/>
-        </w:rPr>
-        <w:t xml:space="preserve"> &amp;&amp; </w:t>
-      </w:r>
-      <w:proofErr w:type="spellStart"/>
-      <w:r>
-        <w:rPr>
-          <w:b/>
-          <w:bCs/>
-        </w:rPr>
-        <w:t>weekDayCheckboxContainer</w:t>
-      </w:r>
-      <w:proofErr w:type="spellEnd"/>
-      <w:r>
-        <w:rPr>
-          <w:b/>
-          <w:bCs/>
-        </w:rPr>
-        <w:t>) {</w:t>
-      </w:r>
-      <w:r>
-        <w:rPr>
-          <w:b/>
-          <w:bCs/>
-        </w:rPr>
-        <w:br/>
-      </w:r>
+        <w:t>:</w:t>
+      </w:r>
+    </w:p>
+    <w:p>
+      <w:pPr>
+        <w:rPr>
+          <w:b/>
+          <w:bCs/>
+        </w:rPr>
+      </w:pPr>
+      <w:r>
+        <w:rPr>
+          <w:b/>
+          <w:bCs/>
+        </w:rPr>
+        <w:t xml:space="preserve">function </w:t>
+      </w:r>
+      <w:proofErr w:type="spellStart"/>
       <w:r>
         <w:rPr>
           <w:b/>
@@ -2597,1297 +3650,71 @@
           <w:i/>
           <w:iCs/>
         </w:rPr>
-        <w:t>// region BLOCK 4I</w:t>
-      </w:r>
-      <w:r>
-        <w:rPr>
-          <w:b/>
-          <w:bCs/>
-          <w:i/>
-          <w:iCs/>
+        <w:t>applyFilters</w:t>
+      </w:r>
+      <w:proofErr w:type="spellEnd"/>
+      <w:r>
+        <w:rPr>
+          <w:b/>
+          <w:bCs/>
+        </w:rPr>
+        <w:t>() {</w:t>
+      </w:r>
+      <w:r>
+        <w:rPr>
+          <w:b/>
+          <w:bCs/>
+        </w:rPr>
+        <w:br/>
+        <w:t xml:space="preserve">  const </w:t>
+      </w:r>
+      <w:proofErr w:type="spellStart"/>
+      <w:r>
+        <w:rPr>
+          <w:b/>
+          <w:bCs/>
+        </w:rPr>
+        <w:t>selectedStation</w:t>
+      </w:r>
+      <w:proofErr w:type="spellEnd"/>
+      <w:r>
+        <w:rPr>
+          <w:b/>
+          <w:bCs/>
+        </w:rPr>
+        <w:t xml:space="preserve"> = </w:t>
+      </w:r>
+      <w:proofErr w:type="spellStart"/>
+      <w:r>
+        <w:rPr>
+          <w:b/>
+          <w:bCs/>
+        </w:rPr>
+        <w:t>stationDropdown.value</w:t>
+      </w:r>
+      <w:proofErr w:type="spellEnd"/>
+      <w:r>
+        <w:rPr>
+          <w:b/>
+          <w:bCs/>
+        </w:rPr>
+        <w:t>;</w:t>
+      </w:r>
+      <w:r>
+        <w:rPr>
+          <w:b/>
+          <w:bCs/>
         </w:rPr>
         <w:br/>
         <w:t xml:space="preserve">  </w:t>
       </w:r>
-      <w:proofErr w:type="spellStart"/>
-      <w:r>
-        <w:rPr>
-          <w:b/>
-          <w:bCs/>
-          <w:i/>
-          <w:iCs/>
-        </w:rPr>
-        <w:t>Array</w:t>
-      </w:r>
-      <w:r>
-        <w:rPr>
-          <w:b/>
-          <w:bCs/>
-        </w:rPr>
-        <w:t>.from</w:t>
-      </w:r>
-      <w:proofErr w:type="spellEnd"/>
-      <w:r>
-        <w:rPr>
-          <w:b/>
-          <w:bCs/>
-        </w:rPr>
-        <w:t>(</w:t>
-      </w:r>
-      <w:proofErr w:type="spellStart"/>
-      <w:r>
-        <w:rPr>
-          <w:b/>
-          <w:bCs/>
-        </w:rPr>
-        <w:t>table_rating.querySelectorAll</w:t>
-      </w:r>
-      <w:proofErr w:type="spellEnd"/>
-      <w:r>
-        <w:rPr>
-          <w:b/>
-          <w:bCs/>
-        </w:rPr>
-        <w:t>("</w:t>
-      </w:r>
-      <w:proofErr w:type="spellStart"/>
-      <w:r>
-        <w:rPr>
-          <w:b/>
-          <w:bCs/>
-        </w:rPr>
-        <w:t>th</w:t>
-      </w:r>
-      <w:proofErr w:type="spellEnd"/>
-      <w:r>
-        <w:rPr>
-          <w:b/>
-          <w:bCs/>
-        </w:rPr>
-        <w:t>")).</w:t>
-      </w:r>
-      <w:proofErr w:type="spellStart"/>
-      <w:r>
-        <w:rPr>
-          <w:b/>
-          <w:bCs/>
-        </w:rPr>
-        <w:t>forEach</w:t>
-      </w:r>
-      <w:proofErr w:type="spellEnd"/>
-      <w:r>
-        <w:rPr>
-          <w:b/>
-          <w:bCs/>
-        </w:rPr>
-        <w:t>((</w:t>
-      </w:r>
-      <w:proofErr w:type="spellStart"/>
-      <w:r>
-        <w:rPr>
-          <w:b/>
-          <w:bCs/>
-        </w:rPr>
-        <w:t>th</w:t>
-      </w:r>
-      <w:proofErr w:type="spellEnd"/>
-      <w:r>
-        <w:rPr>
-          <w:b/>
-          <w:bCs/>
-        </w:rPr>
-        <w:t xml:space="preserve">, </w:t>
-      </w:r>
-      <w:proofErr w:type="spellStart"/>
-      <w:r>
-        <w:rPr>
-          <w:b/>
-          <w:bCs/>
-        </w:rPr>
-        <w:t>i</w:t>
-      </w:r>
-      <w:proofErr w:type="spellEnd"/>
-      <w:r>
-        <w:rPr>
-          <w:b/>
-          <w:bCs/>
-        </w:rPr>
-        <w:t>) =&gt; {</w:t>
-      </w:r>
-      <w:r>
-        <w:rPr>
-          <w:b/>
-          <w:bCs/>
-        </w:rPr>
-        <w:br/>
-        <w:t xml:space="preserve">    const t = </w:t>
-      </w:r>
-      <w:r>
-        <w:rPr>
-          <w:b/>
-          <w:bCs/>
-          <w:i/>
-          <w:iCs/>
-        </w:rPr>
-        <w:t>norm</w:t>
-      </w:r>
-      <w:r>
-        <w:rPr>
-          <w:b/>
-          <w:bCs/>
-        </w:rPr>
-        <w:t>(</w:t>
-      </w:r>
-      <w:proofErr w:type="spellStart"/>
-      <w:r>
-        <w:rPr>
-          <w:b/>
-          <w:bCs/>
-        </w:rPr>
-        <w:t>th.innerText</w:t>
-      </w:r>
-      <w:proofErr w:type="spellEnd"/>
-      <w:r>
-        <w:rPr>
-          <w:b/>
-          <w:bCs/>
-        </w:rPr>
-        <w:t>);</w:t>
-      </w:r>
-      <w:r>
-        <w:rPr>
-          <w:b/>
-          <w:bCs/>
-        </w:rPr>
-        <w:br/>
-        <w:t xml:space="preserve">    if (t === "</w:t>
-      </w:r>
-      <w:r>
-        <w:rPr>
-          <w:b/>
-          <w:bCs/>
-          <w:rtl/>
-        </w:rPr>
-        <w:t>שם</w:t>
-      </w:r>
-      <w:r>
-        <w:rPr>
-          <w:b/>
-          <w:bCs/>
-        </w:rPr>
-        <w:t xml:space="preserve"> </w:t>
-      </w:r>
-      <w:r>
-        <w:rPr>
-          <w:b/>
-          <w:bCs/>
-          <w:rtl/>
-        </w:rPr>
-        <w:t>תחנת</w:t>
-      </w:r>
-      <w:r>
-        <w:rPr>
-          <w:b/>
-          <w:bCs/>
-        </w:rPr>
-        <w:t xml:space="preserve"> </w:t>
-      </w:r>
-      <w:r>
-        <w:rPr>
-          <w:b/>
-          <w:bCs/>
-          <w:rtl/>
-        </w:rPr>
-        <w:t>הרכבת</w:t>
-      </w:r>
-      <w:r>
-        <w:rPr>
-          <w:b/>
-          <w:bCs/>
-        </w:rPr>
-        <w:t xml:space="preserve">") </w:t>
-      </w:r>
-      <w:proofErr w:type="spellStart"/>
-      <w:r>
-        <w:rPr>
-          <w:b/>
-          <w:bCs/>
-        </w:rPr>
-        <w:t>stationColIndex</w:t>
-      </w:r>
-      <w:proofErr w:type="spellEnd"/>
-      <w:r>
-        <w:rPr>
-          <w:b/>
-          <w:bCs/>
-        </w:rPr>
-        <w:t xml:space="preserve"> = </w:t>
-      </w:r>
-      <w:proofErr w:type="spellStart"/>
-      <w:r>
-        <w:rPr>
-          <w:b/>
-          <w:bCs/>
-        </w:rPr>
-        <w:t>i</w:t>
-      </w:r>
-      <w:proofErr w:type="spellEnd"/>
-      <w:r>
-        <w:rPr>
-          <w:b/>
-          <w:bCs/>
-        </w:rPr>
-        <w:t>;</w:t>
-      </w:r>
-      <w:r>
-        <w:rPr>
-          <w:b/>
-          <w:bCs/>
-        </w:rPr>
-        <w:br/>
-        <w:t xml:space="preserve">    if (t === "</w:t>
-      </w:r>
-      <w:r>
-        <w:rPr>
-          <w:b/>
-          <w:bCs/>
-          <w:rtl/>
-        </w:rPr>
-        <w:t>שנה</w:t>
-      </w:r>
-      <w:r>
-        <w:rPr>
-          <w:b/>
-          <w:bCs/>
-        </w:rPr>
-        <w:t xml:space="preserve">") yearColIndexT1 = </w:t>
-      </w:r>
-      <w:proofErr w:type="spellStart"/>
-      <w:r>
-        <w:rPr>
-          <w:b/>
-          <w:bCs/>
-        </w:rPr>
-        <w:t>i</w:t>
-      </w:r>
-      <w:proofErr w:type="spellEnd"/>
-      <w:r>
-        <w:rPr>
-          <w:b/>
-          <w:bCs/>
-        </w:rPr>
-        <w:t>;</w:t>
-      </w:r>
-      <w:r>
-        <w:rPr>
-          <w:b/>
-          <w:bCs/>
-        </w:rPr>
-        <w:br/>
-        <w:t xml:space="preserve">    if (t === "</w:t>
-      </w:r>
-      <w:r>
-        <w:rPr>
-          <w:b/>
-          <w:bCs/>
-          <w:rtl/>
-        </w:rPr>
-        <w:t>חודש</w:t>
-      </w:r>
-      <w:r>
-        <w:rPr>
-          <w:b/>
-          <w:bCs/>
-        </w:rPr>
-        <w:t xml:space="preserve">") monthColIndexT1 = </w:t>
-      </w:r>
-      <w:proofErr w:type="spellStart"/>
-      <w:r>
-        <w:rPr>
-          <w:b/>
-          <w:bCs/>
-        </w:rPr>
-        <w:t>i</w:t>
-      </w:r>
-      <w:proofErr w:type="spellEnd"/>
-      <w:r>
-        <w:rPr>
-          <w:b/>
-          <w:bCs/>
-        </w:rPr>
-        <w:t>;</w:t>
-      </w:r>
-      <w:r>
-        <w:rPr>
-          <w:b/>
-          <w:bCs/>
-        </w:rPr>
-        <w:br/>
-        <w:t xml:space="preserve">  });</w:t>
-      </w:r>
-      <w:r>
-        <w:rPr>
-          <w:b/>
-          <w:bCs/>
-        </w:rPr>
-        <w:br/>
-      </w:r>
-      <w:r>
-        <w:rPr>
-          <w:b/>
-          <w:bCs/>
-        </w:rPr>
-        <w:br/>
-        <w:t xml:space="preserve">  if (</w:t>
-      </w:r>
-      <w:proofErr w:type="spellStart"/>
-      <w:r>
-        <w:rPr>
-          <w:b/>
-          <w:bCs/>
-        </w:rPr>
-        <w:t>stationColIndex</w:t>
-      </w:r>
-      <w:proofErr w:type="spellEnd"/>
-      <w:r>
-        <w:rPr>
-          <w:b/>
-          <w:bCs/>
-        </w:rPr>
-        <w:t xml:space="preserve"> !== -1) {</w:t>
-      </w:r>
-      <w:r>
-        <w:rPr>
-          <w:b/>
-          <w:bCs/>
-        </w:rPr>
-        <w:br/>
-        <w:t xml:space="preserve">    const </w:t>
-      </w:r>
-      <w:proofErr w:type="spellStart"/>
-      <w:r>
-        <w:rPr>
-          <w:b/>
-          <w:bCs/>
-        </w:rPr>
-        <w:t>allRows</w:t>
-      </w:r>
-      <w:proofErr w:type="spellEnd"/>
-      <w:r>
-        <w:rPr>
-          <w:b/>
-          <w:bCs/>
-        </w:rPr>
-        <w:t xml:space="preserve"> = </w:t>
-      </w:r>
-      <w:proofErr w:type="spellStart"/>
-      <w:r>
-        <w:rPr>
-          <w:b/>
-          <w:bCs/>
-          <w:i/>
-          <w:iCs/>
-        </w:rPr>
-        <w:t>Array</w:t>
-      </w:r>
-      <w:r>
-        <w:rPr>
-          <w:b/>
-          <w:bCs/>
-        </w:rPr>
-        <w:t>.from</w:t>
-      </w:r>
-      <w:proofErr w:type="spellEnd"/>
-      <w:r>
-        <w:rPr>
-          <w:b/>
-          <w:bCs/>
-        </w:rPr>
-        <w:t>(</w:t>
-      </w:r>
-      <w:proofErr w:type="spellStart"/>
-      <w:r>
-        <w:rPr>
-          <w:b/>
-          <w:bCs/>
-        </w:rPr>
-        <w:t>table_rating.querySelectorAll</w:t>
-      </w:r>
-      <w:proofErr w:type="spellEnd"/>
-      <w:r>
-        <w:rPr>
-          <w:b/>
-          <w:bCs/>
-        </w:rPr>
-        <w:t>("tr"));</w:t>
-      </w:r>
-      <w:r>
-        <w:rPr>
-          <w:b/>
-          <w:bCs/>
-        </w:rPr>
-        <w:br/>
-        <w:t xml:space="preserve">    </w:t>
-      </w:r>
-      <w:proofErr w:type="spellStart"/>
-      <w:r>
-        <w:rPr>
-          <w:b/>
-          <w:bCs/>
-        </w:rPr>
-        <w:t>dataRows</w:t>
-      </w:r>
-      <w:proofErr w:type="spellEnd"/>
-      <w:r>
-        <w:rPr>
-          <w:b/>
-          <w:bCs/>
-        </w:rPr>
-        <w:t xml:space="preserve"> = </w:t>
-      </w:r>
-      <w:proofErr w:type="spellStart"/>
-      <w:r>
-        <w:rPr>
-          <w:b/>
-          <w:bCs/>
-        </w:rPr>
-        <w:t>allRows.filter</w:t>
-      </w:r>
-      <w:proofErr w:type="spellEnd"/>
-      <w:r>
-        <w:rPr>
-          <w:b/>
-          <w:bCs/>
-        </w:rPr>
-        <w:t>(r =&gt; !</w:t>
-      </w:r>
-      <w:proofErr w:type="spellStart"/>
-      <w:r>
-        <w:rPr>
-          <w:b/>
-          <w:bCs/>
-        </w:rPr>
-        <w:t>r.querySelector</w:t>
-      </w:r>
-      <w:proofErr w:type="spellEnd"/>
-      <w:r>
-        <w:rPr>
-          <w:b/>
-          <w:bCs/>
-        </w:rPr>
-        <w:t>("</w:t>
-      </w:r>
-      <w:proofErr w:type="spellStart"/>
-      <w:r>
-        <w:rPr>
-          <w:b/>
-          <w:bCs/>
-        </w:rPr>
-        <w:t>th</w:t>
-      </w:r>
-      <w:proofErr w:type="spellEnd"/>
-      <w:r>
-        <w:rPr>
-          <w:b/>
-          <w:bCs/>
-        </w:rPr>
-        <w:t>"));</w:t>
-      </w:r>
-      <w:r>
-        <w:rPr>
-          <w:b/>
-          <w:bCs/>
-        </w:rPr>
-        <w:br/>
-      </w:r>
-      <w:r>
-        <w:rPr>
-          <w:b/>
-          <w:bCs/>
-        </w:rPr>
-        <w:br/>
-        <w:t xml:space="preserve">    const </w:t>
-      </w:r>
-      <w:proofErr w:type="spellStart"/>
-      <w:r>
-        <w:rPr>
-          <w:b/>
-          <w:bCs/>
-        </w:rPr>
-        <w:t>stationSet</w:t>
-      </w:r>
-      <w:proofErr w:type="spellEnd"/>
-      <w:r>
-        <w:rPr>
-          <w:b/>
-          <w:bCs/>
-        </w:rPr>
-        <w:t xml:space="preserve"> = new </w:t>
-      </w:r>
-      <w:r>
-        <w:rPr>
-          <w:b/>
-          <w:bCs/>
-          <w:i/>
-          <w:iCs/>
-        </w:rPr>
-        <w:t>Set</w:t>
-      </w:r>
-      <w:r>
-        <w:rPr>
-          <w:b/>
-          <w:bCs/>
-        </w:rPr>
-        <w:t>();</w:t>
-      </w:r>
-      <w:r>
-        <w:rPr>
-          <w:b/>
-          <w:bCs/>
-        </w:rPr>
-        <w:br/>
-        <w:t xml:space="preserve">    </w:t>
-      </w:r>
-      <w:proofErr w:type="spellStart"/>
-      <w:r>
-        <w:rPr>
-          <w:b/>
-          <w:bCs/>
-        </w:rPr>
-        <w:t>dataRows.forEach</w:t>
-      </w:r>
-      <w:proofErr w:type="spellEnd"/>
-      <w:r>
-        <w:rPr>
-          <w:b/>
-          <w:bCs/>
-        </w:rPr>
-        <w:t>(r =&gt; {</w:t>
-      </w:r>
-      <w:r>
-        <w:rPr>
-          <w:b/>
-          <w:bCs/>
-        </w:rPr>
-        <w:br/>
-        <w:t xml:space="preserve">      const v = </w:t>
-      </w:r>
-      <w:r>
-        <w:rPr>
-          <w:b/>
-          <w:bCs/>
-          <w:i/>
-          <w:iCs/>
-        </w:rPr>
-        <w:t>norm</w:t>
-      </w:r>
-      <w:r>
-        <w:rPr>
-          <w:b/>
-          <w:bCs/>
-        </w:rPr>
-        <w:t>(</w:t>
-      </w:r>
-      <w:proofErr w:type="spellStart"/>
-      <w:r>
-        <w:rPr>
-          <w:b/>
-          <w:bCs/>
-        </w:rPr>
-        <w:t>r.children</w:t>
-      </w:r>
-      <w:proofErr w:type="spellEnd"/>
-      <w:r>
-        <w:rPr>
-          <w:b/>
-          <w:bCs/>
-        </w:rPr>
-        <w:t>[</w:t>
-      </w:r>
-      <w:proofErr w:type="spellStart"/>
-      <w:r>
-        <w:rPr>
-          <w:b/>
-          <w:bCs/>
-        </w:rPr>
-        <w:t>stationColIndex</w:t>
-      </w:r>
-      <w:proofErr w:type="spellEnd"/>
-      <w:r>
-        <w:rPr>
-          <w:b/>
-          <w:bCs/>
-        </w:rPr>
-        <w:t>]?.</w:t>
-      </w:r>
-      <w:proofErr w:type="spellStart"/>
-      <w:r>
-        <w:rPr>
-          <w:b/>
-          <w:bCs/>
-        </w:rPr>
-        <w:t>innerText</w:t>
-      </w:r>
-      <w:proofErr w:type="spellEnd"/>
-      <w:r>
-        <w:rPr>
-          <w:b/>
-          <w:bCs/>
-        </w:rPr>
-        <w:t>);</w:t>
-      </w:r>
-      <w:r>
-        <w:rPr>
-          <w:b/>
-          <w:bCs/>
-        </w:rPr>
-        <w:br/>
-        <w:t xml:space="preserve">      if (v) </w:t>
-      </w:r>
-      <w:proofErr w:type="spellStart"/>
-      <w:r>
-        <w:rPr>
-          <w:b/>
-          <w:bCs/>
-        </w:rPr>
-        <w:t>stationSet.add</w:t>
-      </w:r>
-      <w:proofErr w:type="spellEnd"/>
-      <w:r>
-        <w:rPr>
-          <w:b/>
-          <w:bCs/>
-        </w:rPr>
-        <w:t>(v);</w:t>
-      </w:r>
-      <w:r>
-        <w:rPr>
-          <w:b/>
-          <w:bCs/>
-        </w:rPr>
-        <w:br/>
-        <w:t xml:space="preserve">    });</w:t>
-      </w:r>
-      <w:r>
-        <w:rPr>
-          <w:b/>
-          <w:bCs/>
-        </w:rPr>
-        <w:br/>
-      </w:r>
-      <w:r>
-        <w:rPr>
-          <w:b/>
-          <w:bCs/>
-        </w:rPr>
-        <w:br/>
-        <w:t xml:space="preserve">    </w:t>
-      </w:r>
-      <w:proofErr w:type="spellStart"/>
-      <w:r>
-        <w:rPr>
-          <w:b/>
-          <w:bCs/>
-        </w:rPr>
-        <w:t>stationDropdown.innerHTML</w:t>
-      </w:r>
-      <w:proofErr w:type="spellEnd"/>
-      <w:r>
-        <w:rPr>
-          <w:b/>
-          <w:bCs/>
-        </w:rPr>
-        <w:t xml:space="preserve"> = "";</w:t>
-      </w:r>
-      <w:r>
-        <w:rPr>
-          <w:b/>
-          <w:bCs/>
-        </w:rPr>
-        <w:br/>
-      </w:r>
-      <w:r>
-        <w:rPr>
-          <w:b/>
-          <w:bCs/>
-        </w:rPr>
-        <w:br/>
-        <w:t xml:space="preserve">    const </w:t>
-      </w:r>
-      <w:proofErr w:type="spellStart"/>
-      <w:r>
-        <w:rPr>
-          <w:b/>
-          <w:bCs/>
-        </w:rPr>
-        <w:t>sph</w:t>
-      </w:r>
-      <w:proofErr w:type="spellEnd"/>
-      <w:r>
-        <w:rPr>
-          <w:b/>
-          <w:bCs/>
-        </w:rPr>
-        <w:t xml:space="preserve"> = </w:t>
-      </w:r>
-      <w:proofErr w:type="spellStart"/>
-      <w:r>
-        <w:rPr>
-          <w:b/>
-          <w:bCs/>
-        </w:rPr>
-        <w:t>document.createElement</w:t>
-      </w:r>
-      <w:proofErr w:type="spellEnd"/>
-      <w:r>
-        <w:rPr>
-          <w:b/>
-          <w:bCs/>
-        </w:rPr>
-        <w:t>("option");</w:t>
-      </w:r>
-      <w:r>
-        <w:rPr>
-          <w:b/>
-          <w:bCs/>
-        </w:rPr>
-        <w:br/>
-        <w:t xml:space="preserve">    </w:t>
-      </w:r>
-      <w:proofErr w:type="spellStart"/>
-      <w:r>
-        <w:rPr>
-          <w:b/>
-          <w:bCs/>
-        </w:rPr>
-        <w:t>sph.value</w:t>
-      </w:r>
-      <w:proofErr w:type="spellEnd"/>
-      <w:r>
-        <w:rPr>
-          <w:b/>
-          <w:bCs/>
-        </w:rPr>
-        <w:t xml:space="preserve"> = "";</w:t>
-      </w:r>
-      <w:r>
-        <w:rPr>
-          <w:b/>
-          <w:bCs/>
-        </w:rPr>
-        <w:br/>
-        <w:t xml:space="preserve">    </w:t>
-      </w:r>
-      <w:proofErr w:type="spellStart"/>
-      <w:r>
-        <w:rPr>
-          <w:b/>
-          <w:bCs/>
-        </w:rPr>
-        <w:t>sph.textContent</w:t>
-      </w:r>
-      <w:proofErr w:type="spellEnd"/>
-      <w:r>
-        <w:rPr>
-          <w:b/>
-          <w:bCs/>
-        </w:rPr>
-        <w:t xml:space="preserve"> = "</w:t>
-      </w:r>
-      <w:r>
-        <w:rPr>
-          <w:b/>
-          <w:bCs/>
-          <w:rtl/>
-        </w:rPr>
-        <w:t>בחר</w:t>
-      </w:r>
-      <w:r>
-        <w:rPr>
-          <w:b/>
-          <w:bCs/>
-        </w:rPr>
-        <w:t xml:space="preserve"> </w:t>
-      </w:r>
-      <w:r>
-        <w:rPr>
-          <w:b/>
-          <w:bCs/>
-          <w:rtl/>
-        </w:rPr>
-        <w:t>תחנה</w:t>
-      </w:r>
-      <w:r>
-        <w:rPr>
-          <w:b/>
-          <w:bCs/>
-        </w:rPr>
-        <w:t>";</w:t>
-      </w:r>
-      <w:r>
-        <w:rPr>
-          <w:b/>
-          <w:bCs/>
-        </w:rPr>
-        <w:br/>
-        <w:t xml:space="preserve">    </w:t>
-      </w:r>
-      <w:proofErr w:type="spellStart"/>
-      <w:r>
-        <w:rPr>
-          <w:b/>
-          <w:bCs/>
-        </w:rPr>
-        <w:t>stationDropdown.appendChild</w:t>
-      </w:r>
-      <w:proofErr w:type="spellEnd"/>
-      <w:r>
-        <w:rPr>
-          <w:b/>
-          <w:bCs/>
-        </w:rPr>
-        <w:t>(</w:t>
-      </w:r>
-      <w:proofErr w:type="spellStart"/>
-      <w:r>
-        <w:rPr>
-          <w:b/>
-          <w:bCs/>
-        </w:rPr>
-        <w:t>sph</w:t>
-      </w:r>
-      <w:proofErr w:type="spellEnd"/>
-      <w:r>
-        <w:rPr>
-          <w:b/>
-          <w:bCs/>
-        </w:rPr>
-        <w:t>);</w:t>
-      </w:r>
-      <w:r>
-        <w:rPr>
-          <w:b/>
-          <w:bCs/>
-        </w:rPr>
-        <w:br/>
-      </w:r>
-      <w:r>
-        <w:rPr>
-          <w:b/>
-          <w:bCs/>
-        </w:rPr>
-        <w:br/>
-        <w:t xml:space="preserve">    </w:t>
-      </w:r>
-      <w:proofErr w:type="spellStart"/>
-      <w:r>
-        <w:rPr>
-          <w:b/>
-          <w:bCs/>
-          <w:i/>
-          <w:iCs/>
-        </w:rPr>
-        <w:t>Array</w:t>
-      </w:r>
-      <w:r>
-        <w:rPr>
-          <w:b/>
-          <w:bCs/>
-        </w:rPr>
-        <w:t>.from</w:t>
-      </w:r>
-      <w:proofErr w:type="spellEnd"/>
-      <w:r>
-        <w:rPr>
-          <w:b/>
-          <w:bCs/>
-        </w:rPr>
-        <w:t>(</w:t>
-      </w:r>
-      <w:proofErr w:type="spellStart"/>
-      <w:r>
-        <w:rPr>
-          <w:b/>
-          <w:bCs/>
-        </w:rPr>
-        <w:t>stationSet</w:t>
-      </w:r>
-      <w:proofErr w:type="spellEnd"/>
-      <w:r>
-        <w:rPr>
-          <w:b/>
-          <w:bCs/>
-        </w:rPr>
-        <w:t>).sort().</w:t>
-      </w:r>
-      <w:proofErr w:type="spellStart"/>
-      <w:r>
-        <w:rPr>
-          <w:b/>
-          <w:bCs/>
-        </w:rPr>
-        <w:t>forEach</w:t>
-      </w:r>
-      <w:proofErr w:type="spellEnd"/>
-      <w:r>
-        <w:rPr>
-          <w:b/>
-          <w:bCs/>
-        </w:rPr>
-        <w:t>(</w:t>
-      </w:r>
-      <w:proofErr w:type="spellStart"/>
-      <w:r>
-        <w:rPr>
-          <w:b/>
-          <w:bCs/>
-        </w:rPr>
-        <w:t>st</w:t>
-      </w:r>
-      <w:proofErr w:type="spellEnd"/>
-      <w:r>
-        <w:rPr>
-          <w:b/>
-          <w:bCs/>
-        </w:rPr>
-        <w:t xml:space="preserve"> =&gt; {</w:t>
-      </w:r>
-      <w:r>
-        <w:rPr>
-          <w:b/>
-          <w:bCs/>
-        </w:rPr>
-        <w:br/>
-      </w:r>
-      <w:r>
-        <w:rPr>
-          <w:b/>
-          <w:bCs/>
-        </w:rPr>
-        <w:lastRenderedPageBreak/>
-        <w:t xml:space="preserve">      const opt = </w:t>
-      </w:r>
-      <w:proofErr w:type="spellStart"/>
-      <w:r>
-        <w:rPr>
-          <w:b/>
-          <w:bCs/>
-        </w:rPr>
-        <w:t>document.createElement</w:t>
-      </w:r>
-      <w:proofErr w:type="spellEnd"/>
-      <w:r>
-        <w:rPr>
-          <w:b/>
-          <w:bCs/>
-        </w:rPr>
-        <w:t>("option");</w:t>
-      </w:r>
-      <w:r>
-        <w:rPr>
-          <w:b/>
-          <w:bCs/>
-        </w:rPr>
-        <w:br/>
-        <w:t xml:space="preserve">      </w:t>
-      </w:r>
-      <w:proofErr w:type="spellStart"/>
-      <w:r>
-        <w:rPr>
-          <w:b/>
-          <w:bCs/>
-        </w:rPr>
-        <w:t>opt.value</w:t>
-      </w:r>
-      <w:proofErr w:type="spellEnd"/>
-      <w:r>
-        <w:rPr>
-          <w:b/>
-          <w:bCs/>
-        </w:rPr>
-        <w:t xml:space="preserve"> = </w:t>
-      </w:r>
-      <w:proofErr w:type="spellStart"/>
-      <w:r>
-        <w:rPr>
-          <w:b/>
-          <w:bCs/>
-        </w:rPr>
-        <w:t>st</w:t>
-      </w:r>
-      <w:proofErr w:type="spellEnd"/>
-      <w:r>
-        <w:rPr>
-          <w:b/>
-          <w:bCs/>
-        </w:rPr>
-        <w:t>;</w:t>
-      </w:r>
-      <w:r>
-        <w:rPr>
-          <w:b/>
-          <w:bCs/>
-        </w:rPr>
-        <w:br/>
-        <w:t xml:space="preserve">      </w:t>
-      </w:r>
-      <w:proofErr w:type="spellStart"/>
-      <w:r>
-        <w:rPr>
-          <w:b/>
-          <w:bCs/>
-        </w:rPr>
-        <w:t>opt.textContent</w:t>
-      </w:r>
-      <w:proofErr w:type="spellEnd"/>
-      <w:r>
-        <w:rPr>
-          <w:b/>
-          <w:bCs/>
-        </w:rPr>
-        <w:t xml:space="preserve"> = </w:t>
-      </w:r>
-      <w:proofErr w:type="spellStart"/>
-      <w:r>
-        <w:rPr>
-          <w:b/>
-          <w:bCs/>
-        </w:rPr>
-        <w:t>st</w:t>
-      </w:r>
-      <w:proofErr w:type="spellEnd"/>
-      <w:r>
-        <w:rPr>
-          <w:b/>
-          <w:bCs/>
-        </w:rPr>
-        <w:t>;</w:t>
-      </w:r>
-      <w:r>
-        <w:rPr>
-          <w:b/>
-          <w:bCs/>
-        </w:rPr>
-        <w:br/>
-        <w:t xml:space="preserve">      </w:t>
-      </w:r>
-      <w:proofErr w:type="spellStart"/>
-      <w:r>
-        <w:rPr>
-          <w:b/>
-          <w:bCs/>
-        </w:rPr>
-        <w:t>stationDropdown.appendChild</w:t>
-      </w:r>
-      <w:proofErr w:type="spellEnd"/>
-      <w:r>
-        <w:rPr>
-          <w:b/>
-          <w:bCs/>
-        </w:rPr>
-        <w:t>(opt);</w:t>
-      </w:r>
-      <w:r>
-        <w:rPr>
-          <w:b/>
-          <w:bCs/>
-        </w:rPr>
-        <w:br/>
-        <w:t xml:space="preserve">    });</w:t>
-      </w:r>
-      <w:r>
-        <w:rPr>
-          <w:b/>
-          <w:bCs/>
-        </w:rPr>
-        <w:br/>
-      </w:r>
-      <w:r>
-        <w:rPr>
-          <w:b/>
-          <w:bCs/>
-        </w:rPr>
-        <w:br/>
-        <w:t xml:space="preserve">    </w:t>
-      </w:r>
-      <w:proofErr w:type="spellStart"/>
-      <w:r>
-        <w:rPr>
-          <w:b/>
-          <w:bCs/>
-        </w:rPr>
-        <w:t>dataRows.forEach</w:t>
-      </w:r>
-      <w:proofErr w:type="spellEnd"/>
-      <w:r>
-        <w:rPr>
-          <w:b/>
-          <w:bCs/>
-        </w:rPr>
-        <w:t xml:space="preserve">(r =&gt; </w:t>
-      </w:r>
-      <w:proofErr w:type="spellStart"/>
-      <w:r>
-        <w:rPr>
-          <w:b/>
-          <w:bCs/>
-        </w:rPr>
-        <w:t>r.style.display</w:t>
-      </w:r>
-      <w:proofErr w:type="spellEnd"/>
-      <w:r>
-        <w:rPr>
-          <w:b/>
-          <w:bCs/>
-        </w:rPr>
-        <w:t xml:space="preserve"> = "none");</w:t>
-      </w:r>
-      <w:r>
-        <w:rPr>
-          <w:b/>
-          <w:bCs/>
-        </w:rPr>
-        <w:br/>
-        <w:t xml:space="preserve">  }</w:t>
-      </w:r>
-    </w:p>
-    <w:p>
-      <w:pPr>
-        <w:rPr>
-          <w:b/>
-          <w:bCs/>
-          <w:rtl/>
-        </w:rPr>
-      </w:pPr>
-    </w:p>
-    <w:p>
-      <w:pPr>
-        <w:rPr>
-          <w:b/>
-          <w:bCs/>
-          <w:rtl/>
-        </w:rPr>
-      </w:pPr>
-      <w:r>
-        <w:rPr>
-          <w:b/>
-          <w:bCs/>
-        </w:rPr>
-        <w:t>apply filters</w:t>
-      </w:r>
-      <w:r>
-        <w:rPr>
-          <w:rFonts w:hint="cs"/>
-          <w:b/>
-          <w:bCs/>
-          <w:rtl/>
-        </w:rPr>
-        <w:t>:</w:t>
-      </w:r>
-    </w:p>
-    <w:p>
-      <w:pPr>
-        <w:rPr>
-          <w:b/>
-          <w:bCs/>
-        </w:rPr>
-      </w:pPr>
-      <w:r>
-        <w:rPr>
-          <w:b/>
-          <w:bCs/>
-        </w:rPr>
-        <w:t xml:space="preserve">function </w:t>
-      </w:r>
-      <w:proofErr w:type="spellStart"/>
-      <w:proofErr w:type="gramStart"/>
-      <w:r>
-        <w:rPr>
-          <w:b/>
-          <w:bCs/>
-          <w:i/>
-          <w:iCs/>
-        </w:rPr>
-        <w:t>applyFilters</w:t>
-      </w:r>
-      <w:proofErr w:type="spellEnd"/>
-      <w:r>
-        <w:rPr>
-          <w:b/>
-          <w:bCs/>
-        </w:rPr>
-        <w:t>(</w:t>
-      </w:r>
-      <w:proofErr w:type="gramEnd"/>
-      <w:r>
-        <w:rPr>
-          <w:b/>
-          <w:bCs/>
-        </w:rPr>
-        <w:t>) {</w:t>
-      </w:r>
-      <w:r>
-        <w:rPr>
-          <w:b/>
-          <w:bCs/>
-        </w:rPr>
-        <w:br/>
-        <w:t xml:space="preserve">  const </w:t>
-      </w:r>
-      <w:proofErr w:type="spellStart"/>
-      <w:r>
-        <w:rPr>
-          <w:b/>
-          <w:bCs/>
-        </w:rPr>
-        <w:t>selectedStation</w:t>
-      </w:r>
-      <w:proofErr w:type="spellEnd"/>
-      <w:r>
-        <w:rPr>
-          <w:b/>
-          <w:bCs/>
-        </w:rPr>
-        <w:t xml:space="preserve"> = </w:t>
-      </w:r>
-      <w:proofErr w:type="spellStart"/>
-      <w:r>
-        <w:rPr>
-          <w:b/>
-          <w:bCs/>
-        </w:rPr>
-        <w:t>stationDropdown.value</w:t>
-      </w:r>
-      <w:proofErr w:type="spellEnd"/>
-      <w:r>
-        <w:rPr>
-          <w:b/>
-          <w:bCs/>
-        </w:rPr>
-        <w:t>;</w:t>
-      </w:r>
-      <w:r>
-        <w:rPr>
-          <w:b/>
-          <w:bCs/>
-        </w:rPr>
-        <w:br/>
-        <w:t xml:space="preserve">  </w:t>
-      </w:r>
-    </w:p>
-    <w:p>
-      <w:pPr>
-        <w:rPr>
-          <w:b/>
-          <w:bCs/>
-        </w:rPr>
-      </w:pPr>
-    </w:p>
-    <w:p>
-      <w:pPr>
-        <w:rPr>
-          <w:b/>
-          <w:bCs/>
+    </w:p>
+    <w:p>
+      <w:pPr>
+        <w:rPr>
+          <w:b/>
+          <w:bCs/>
+          <w:rtl/>
         </w:rPr>
       </w:pPr>
     </w:p>

</xml_diff>

<commit_message>
connectin DB to the site
</commit_message>
<xml_diff>
--- a/Shiluvim Web.docx
+++ b/Shiluvim Web.docx
@@ -2,54 +2,6 @@
 <file path=word/document.xml><?xml version="1.0" encoding="utf-8"?>
 <w:document xmlns:wpc="http://schemas.microsoft.com/office/word/2010/wordprocessingCanvas" xmlns:cx="http://schemas.microsoft.com/office/drawing/2014/chartex" xmlns:cx1="http://schemas.microsoft.com/office/drawing/2015/9/8/chartex" xmlns:cx2="http://schemas.microsoft.com/office/drawing/2015/10/21/chartex" xmlns:cx3="http://schemas.microsoft.com/office/drawing/2016/5/9/chartex" xmlns:cx4="http://schemas.microsoft.com/office/drawing/2016/5/10/chartex" xmlns:cx5="http://schemas.microsoft.com/office/drawing/2016/5/11/chartex" xmlns:cx6="http://schemas.microsoft.com/office/drawing/2016/5/12/chartex" xmlns:cx7="http://schemas.microsoft.com/office/drawing/2016/5/13/chartex" xmlns:cx8="http://schemas.microsoft.com/office/drawing/2016/5/14/chartex" xmlns:mc="http://schemas.openxmlformats.org/markup-compatibility/2006" xmlns:aink="http://schemas.microsoft.com/office/drawing/2016/ink" xmlns:am3d="http://schemas.microsoft.com/office/drawing/2017/model3d" xmlns:o="urn:schemas-microsoft-com:office:office" xmlns:oel="http://schemas.microsoft.com/office/2019/extlst" xmlns:r="http://schemas.openxmlformats.org/officeDocument/2006/relationships" xmlns:m="http://schemas.openxmlformats.org/officeDocument/2006/math" xmlns:v="urn:schemas-microsoft-com:vml" xmlns:wp14="http://schemas.microsoft.com/office/word/2010/wordprocessingDrawing" xmlns:wp="http://schemas.openxmlformats.org/drawingml/2006/wordprocessingDrawing" xmlns:w10="urn:schemas-microsoft-com:office:word" xmlns:w="http://schemas.openxmlformats.org/wordprocessingml/2006/main" xmlns:w14="http://schemas.microsoft.com/office/word/2010/wordml" xmlns:w15="http://schemas.microsoft.com/office/word/2012/wordml" xmlns:w16cex="http://schemas.microsoft.com/office/word/2018/wordml/cex" xmlns:w16cid="http://schemas.microsoft.com/office/word/2016/wordml/cid" xmlns:w16="http://schemas.microsoft.com/office/word/2018/wordml" xmlns:w16du="http://schemas.microsoft.com/office/word/2023/wordml/word16du" xmlns:w16sdtdh="http://schemas.microsoft.com/office/word/2020/wordml/sdtdatahash" xmlns:w16sdtfl="http://schemas.microsoft.com/office/word/2024/wordml/sdtformatlock" xmlns:w16se="http://schemas.microsoft.com/office/word/2015/wordml/symex" xmlns:wpg="http://schemas.microsoft.com/office/word/2010/wordprocessingGroup" xmlns:wpi="http://schemas.microsoft.com/office/word/2010/wordprocessingInk" xmlns:wne="http://schemas.microsoft.com/office/word/2006/wordml" xmlns:wps="http://schemas.microsoft.com/office/word/2010/wordprocessingShape" mc:Ignorable="w14 w15 w16se w16cid w16 w16cex w16sdtdh w16sdtfl w16du wp14">
   <w:body>
-    <w:p>
-      <w:pPr>
-        <w:rPr>
-          <w:b/>
-          <w:bCs/>
-        </w:rPr>
-      </w:pPr>
-      <w:r>
-        <w:rPr>
-          <w:b/>
-          <w:bCs/>
-        </w:rPr>
-        <w:t xml:space="preserve">Username: </w:t>
-      </w:r>
-      <w:proofErr w:type="spellStart"/>
-      <w:r>
-        <w:rPr>
-          <w:b/>
-          <w:bCs/>
-        </w:rPr>
-        <w:t>ailyaev</w:t>
-      </w:r>
-      <w:proofErr w:type="spellEnd"/>
-    </w:p>
-    <w:p>
-      <w:pPr>
-        <w:rPr>
-          <w:b/>
-          <w:bCs/>
-        </w:rPr>
-      </w:pPr>
-      <w:r>
-        <w:rPr>
-          <w:b/>
-          <w:bCs/>
-        </w:rPr>
-        <w:t xml:space="preserve">Password: </w:t>
-      </w:r>
-      <w:proofErr w:type="spellStart"/>
-      <w:r>
-        <w:rPr>
-          <w:b/>
-          <w:bCs/>
-        </w:rPr>
-        <w:t>admAshiluvim</w:t>
-      </w:r>
-      <w:proofErr w:type="spellEnd"/>
-    </w:p>
     <w:p>
       <w:pPr>
         <w:bidi/>
@@ -509,6 +461,7 @@
         <w:t xml:space="preserve">python -m </w:t>
       </w:r>
       <w:proofErr w:type="spellStart"/>
+      <w:proofErr w:type="gramStart"/>
       <w:r>
         <w:rPr>
           <w:color w:val="FF0000"/>
@@ -530,6 +483,7 @@
         <w:t>venv</w:t>
       </w:r>
       <w:proofErr w:type="spellEnd"/>
+      <w:proofErr w:type="gramEnd"/>
     </w:p>
     <w:p>
       <w:pPr>
@@ -603,43 +557,43 @@
           <w:rFonts w:hint="cs"/>
           <w:rtl/>
         </w:rPr>
+        <w:t xml:space="preserve">מתקין </w:t>
+      </w:r>
+      <w:r>
+        <w:t>django</w:t>
+      </w:r>
+      <w:r>
+        <w:rPr>
+          <w:rFonts w:hint="cs"/>
+          <w:rtl/>
+        </w:rPr>
+        <w:t xml:space="preserve"> לתיקייה הספציפית</w:t>
+      </w:r>
+    </w:p>
+    <w:p>
+      <w:pPr>
+        <w:bidi/>
+        <w:rPr>
+          <w:b/>
+          <w:bCs/>
+        </w:rPr>
+      </w:pPr>
+    </w:p>
+    <w:p>
+      <w:pPr>
+        <w:bidi/>
+        <w:rPr>
+          <w:rtl/>
+        </w:rPr>
+      </w:pPr>
+      <w:r>
+        <w:rPr>
+          <w:rFonts w:hint="cs"/>
+          <w:b/>
+          <w:bCs/>
+          <w:rtl/>
+        </w:rPr>
         <w:lastRenderedPageBreak/>
-        <w:t xml:space="preserve">מתקין </w:t>
-      </w:r>
-      <w:r>
-        <w:t>django</w:t>
-      </w:r>
-      <w:r>
-        <w:rPr>
-          <w:rFonts w:hint="cs"/>
-          <w:rtl/>
-        </w:rPr>
-        <w:t xml:space="preserve"> לתיקייה הספציפית</w:t>
-      </w:r>
-    </w:p>
-    <w:p>
-      <w:pPr>
-        <w:bidi/>
-        <w:rPr>
-          <w:b/>
-          <w:bCs/>
-        </w:rPr>
-      </w:pPr>
-    </w:p>
-    <w:p>
-      <w:pPr>
-        <w:bidi/>
-        <w:rPr>
-          <w:rtl/>
-        </w:rPr>
-      </w:pPr>
-      <w:r>
-        <w:rPr>
-          <w:rFonts w:hint="cs"/>
-          <w:b/>
-          <w:bCs/>
-          <w:rtl/>
-        </w:rPr>
         <w:t xml:space="preserve">התקנת </w:t>
       </w:r>
       <w:r>
@@ -923,6 +877,7 @@
         <w:t xml:space="preserve"> </w:t>
       </w:r>
       <w:proofErr w:type="spellStart"/>
+      <w:proofErr w:type="gramStart"/>
       <w:r>
         <w:rPr>
           <w:color w:val="FF0000"/>
@@ -938,6 +893,7 @@
         </w:rPr>
         <w:t xml:space="preserve"> .</w:t>
       </w:r>
+      <w:proofErr w:type="gramEnd"/>
       <w:r>
         <w:rPr>
           <w:rFonts w:cs="Arial"/>
@@ -1160,6 +1116,7 @@
           <w:rFonts w:hint="cs"/>
           <w:rtl/>
         </w:rPr>
+        <w:lastRenderedPageBreak/>
         <w:t>בונה אפליקציה בתוך האתר</w:t>
       </w:r>
     </w:p>
@@ -1643,6 +1600,7 @@
           <w:bCs/>
         </w:rPr>
       </w:pPr>
+      <w:proofErr w:type="gramStart"/>
       <w:r>
         <w:rPr>
           <w:b/>
@@ -1650,8 +1608,9 @@
           <w:i/>
           <w:iCs/>
         </w:rPr>
-        <w:t>&lt;!-- region BLOCK 3 --&gt;</w:t>
-      </w:r>
+        <w:t>&lt;!--</w:t>
+      </w:r>
+      <w:proofErr w:type="gramEnd"/>
       <w:r>
         <w:rPr>
           <w:b/>
@@ -1659,6 +1618,15 @@
           <w:i/>
           <w:iCs/>
         </w:rPr>
+        <w:t xml:space="preserve"> region BLOCK 3 --&gt;</w:t>
+      </w:r>
+      <w:r>
+        <w:rPr>
+          <w:b/>
+          <w:bCs/>
+          <w:i/>
+          <w:iCs/>
+        </w:rPr>
         <w:br/>
       </w:r>
       <w:r>
@@ -1690,15 +1658,31 @@
           <w:bCs/>
         </w:rPr>
         <w:br/>
-        <w:t xml:space="preserve">    {{ </w:t>
-      </w:r>
-      <w:proofErr w:type="spellStart"/>
-      <w:r>
-        <w:rPr>
-          <w:b/>
-          <w:bCs/>
-        </w:rPr>
-        <w:t>df_ranking_table_html|safe</w:t>
+        <w:t xml:space="preserve"> </w:t>
+      </w:r>
+      <w:proofErr w:type="gramStart"/>
+      <w:r>
+        <w:rPr>
+          <w:b/>
+          <w:bCs/>
+        </w:rPr>
+        <w:t xml:space="preserve">   {{ </w:t>
+      </w:r>
+      <w:proofErr w:type="spellStart"/>
+      <w:r>
+        <w:rPr>
+          <w:b/>
+          <w:bCs/>
+        </w:rPr>
+        <w:t>df</w:t>
+      </w:r>
+      <w:proofErr w:type="gramEnd"/>
+      <w:r>
+        <w:rPr>
+          <w:b/>
+          <w:bCs/>
+        </w:rPr>
+        <w:t>_ranking_table_html|safe</w:t>
       </w:r>
       <w:proofErr w:type="spellEnd"/>
       <w:r>
@@ -1760,6 +1744,7 @@
           <w:bCs/>
         </w:rPr>
       </w:pPr>
+      <w:proofErr w:type="gramStart"/>
       <w:r>
         <w:rPr>
           <w:b/>
@@ -1767,8 +1752,9 @@
           <w:i/>
           <w:iCs/>
         </w:rPr>
-        <w:t>&lt;!-- region BLOCK 3 --&gt;</w:t>
-      </w:r>
+        <w:t>&lt;!--</w:t>
+      </w:r>
+      <w:proofErr w:type="gramEnd"/>
       <w:r>
         <w:rPr>
           <w:b/>
@@ -1776,6 +1762,15 @@
           <w:i/>
           <w:iCs/>
         </w:rPr>
+        <w:t xml:space="preserve"> region BLOCK 3 --&gt;</w:t>
+      </w:r>
+      <w:r>
+        <w:rPr>
+          <w:b/>
+          <w:bCs/>
+          <w:i/>
+          <w:iCs/>
+        </w:rPr>
         <w:br/>
       </w:r>
       <w:r>
@@ -1807,15 +1802,31 @@
           <w:bCs/>
         </w:rPr>
         <w:br/>
-        <w:t xml:space="preserve">    {{ </w:t>
-      </w:r>
-      <w:proofErr w:type="spellStart"/>
-      <w:r>
-        <w:rPr>
-          <w:b/>
-          <w:bCs/>
-        </w:rPr>
-        <w:t>df_ranking_table_html|safe</w:t>
+        <w:t xml:space="preserve"> </w:t>
+      </w:r>
+      <w:proofErr w:type="gramStart"/>
+      <w:r>
+        <w:rPr>
+          <w:b/>
+          <w:bCs/>
+        </w:rPr>
+        <w:t xml:space="preserve">   {{ </w:t>
+      </w:r>
+      <w:proofErr w:type="spellStart"/>
+      <w:r>
+        <w:rPr>
+          <w:b/>
+          <w:bCs/>
+        </w:rPr>
+        <w:t>df</w:t>
+      </w:r>
+      <w:proofErr w:type="gramEnd"/>
+      <w:r>
+        <w:rPr>
+          <w:b/>
+          <w:bCs/>
+        </w:rPr>
+        <w:t>_ranking_table_html|safe</w:t>
       </w:r>
       <w:proofErr w:type="spellEnd"/>
       <w:r>
@@ -1905,6 +1916,7 @@
         <w:t xml:space="preserve"> = </w:t>
       </w:r>
       <w:proofErr w:type="spellStart"/>
+      <w:proofErr w:type="gramStart"/>
       <w:r>
         <w:rPr>
           <w:b/>
@@ -1913,6 +1925,7 @@
         <w:t>document.getElementById</w:t>
       </w:r>
       <w:proofErr w:type="spellEnd"/>
+      <w:proofErr w:type="gramEnd"/>
       <w:r>
         <w:rPr>
           <w:b/>
@@ -1934,8 +1947,17 @@
           <w:b/>
           <w:bCs/>
         </w:rPr>
-        <w:t>");</w:t>
-      </w:r>
+        <w:t>"</w:t>
+      </w:r>
+      <w:proofErr w:type="gramStart"/>
+      <w:r>
+        <w:rPr>
+          <w:b/>
+          <w:bCs/>
+        </w:rPr>
+        <w:t>);</w:t>
+      </w:r>
+      <w:proofErr w:type="gramEnd"/>
     </w:p>
     <w:p>
       <w:pPr>
@@ -1968,6 +1990,7 @@
         <w:t xml:space="preserve"> = </w:t>
       </w:r>
       <w:proofErr w:type="spellStart"/>
+      <w:proofErr w:type="gramStart"/>
       <w:r>
         <w:rPr>
           <w:b/>
@@ -1976,6 +1999,7 @@
         <w:t>document.getElementById</w:t>
       </w:r>
       <w:proofErr w:type="spellEnd"/>
+      <w:proofErr w:type="gramEnd"/>
       <w:r>
         <w:rPr>
           <w:b/>
@@ -1997,8 +2021,17 @@
           <w:b/>
           <w:bCs/>
         </w:rPr>
-        <w:t>");</w:t>
-      </w:r>
+        <w:t>"</w:t>
+      </w:r>
+      <w:proofErr w:type="gramStart"/>
+      <w:r>
+        <w:rPr>
+          <w:b/>
+          <w:bCs/>
+        </w:rPr>
+        <w:t>);</w:t>
+      </w:r>
+      <w:proofErr w:type="gramEnd"/>
     </w:p>
     <w:p>
       <w:pPr>
@@ -2051,6 +2084,7 @@
         <w:t xml:space="preserve">function </w:t>
       </w:r>
       <w:proofErr w:type="spellStart"/>
+      <w:proofErr w:type="gramStart"/>
       <w:r>
         <w:rPr>
           <w:b/>
@@ -2066,7 +2100,15 @@
           <w:b/>
           <w:bCs/>
         </w:rPr>
-        <w:t>() {</w:t>
+        <w:t>(</w:t>
+      </w:r>
+      <w:proofErr w:type="gramEnd"/>
+      <w:r>
+        <w:rPr>
+          <w:b/>
+          <w:bCs/>
+        </w:rPr>
+        <w:t>) {</w:t>
       </w:r>
       <w:r>
         <w:rPr>
@@ -2131,9 +2173,18 @@
           <w:b/>
           <w:bCs/>
         </w:rPr>
-        <w:t>table_rating.querySelectorAll</w:t>
-      </w:r>
-      <w:proofErr w:type="spellEnd"/>
+        <w:t>table_</w:t>
+      </w:r>
+      <w:proofErr w:type="gramStart"/>
+      <w:r>
+        <w:rPr>
+          <w:b/>
+          <w:bCs/>
+        </w:rPr>
+        <w:t>rating.querySelectorAll</w:t>
+      </w:r>
+      <w:proofErr w:type="spellEnd"/>
+      <w:proofErr w:type="gramEnd"/>
       <w:r>
         <w:rPr>
           <w:b/>
@@ -2147,15 +2198,47 @@
           <w:bCs/>
         </w:rPr>
         <w:br/>
-        <w:t xml:space="preserve">      .filter(r =&gt; !</w:t>
-      </w:r>
-      <w:proofErr w:type="spellStart"/>
-      <w:r>
-        <w:rPr>
-          <w:b/>
-          <w:bCs/>
-        </w:rPr>
-        <w:t>r.querySelector</w:t>
+        <w:t xml:space="preserve">    </w:t>
+      </w:r>
+      <w:proofErr w:type="gramStart"/>
+      <w:r>
+        <w:rPr>
+          <w:b/>
+          <w:bCs/>
+        </w:rPr>
+        <w:t xml:space="preserve">  .filter</w:t>
+      </w:r>
+      <w:proofErr w:type="gramEnd"/>
+      <w:r>
+        <w:rPr>
+          <w:b/>
+          <w:bCs/>
+        </w:rPr>
+        <w:t>(r =</w:t>
+      </w:r>
+      <w:proofErr w:type="gramStart"/>
+      <w:r>
+        <w:rPr>
+          <w:b/>
+          <w:bCs/>
+        </w:rPr>
+        <w:t>&gt; !</w:t>
+      </w:r>
+      <w:proofErr w:type="spellStart"/>
+      <w:r>
+        <w:rPr>
+          <w:b/>
+          <w:bCs/>
+        </w:rPr>
+        <w:t>r</w:t>
+      </w:r>
+      <w:proofErr w:type="gramEnd"/>
+      <w:r>
+        <w:rPr>
+          <w:b/>
+          <w:bCs/>
+        </w:rPr>
+        <w:t>.querySelector</w:t>
       </w:r>
       <w:proofErr w:type="spellEnd"/>
       <w:r>
@@ -2187,14 +2270,15 @@
           <w:bCs/>
         </w:rPr>
         <w:br/>
-      </w:r>
-      <w:r>
-        <w:rPr>
-          <w:b/>
-          <w:bCs/>
-        </w:rPr>
-        <w:lastRenderedPageBreak/>
-        <w:t xml:space="preserve">      .</w:t>
+        <w:t xml:space="preserve">    </w:t>
+      </w:r>
+      <w:proofErr w:type="gramStart"/>
+      <w:r>
+        <w:rPr>
+          <w:b/>
+          <w:bCs/>
+        </w:rPr>
+        <w:t xml:space="preserve">  .</w:t>
       </w:r>
       <w:proofErr w:type="spellStart"/>
       <w:r>
@@ -2205,6 +2289,7 @@
         <w:t>forEach</w:t>
       </w:r>
       <w:proofErr w:type="spellEnd"/>
+      <w:proofErr w:type="gramEnd"/>
       <w:r>
         <w:rPr>
           <w:b/>
@@ -2213,12 +2298,21 @@
         <w:t xml:space="preserve">(r =&gt; </w:t>
       </w:r>
       <w:proofErr w:type="spellStart"/>
-      <w:r>
-        <w:rPr>
-          <w:b/>
-          <w:bCs/>
-        </w:rPr>
-        <w:t>r.style.display</w:t>
+      <w:proofErr w:type="gramStart"/>
+      <w:r>
+        <w:rPr>
+          <w:b/>
+          <w:bCs/>
+        </w:rPr>
+        <w:t>r.style</w:t>
+      </w:r>
+      <w:proofErr w:type="gramEnd"/>
+      <w:r>
+        <w:rPr>
+          <w:b/>
+          <w:bCs/>
+        </w:rPr>
+        <w:t>.display</w:t>
       </w:r>
       <w:proofErr w:type="spellEnd"/>
       <w:r>
@@ -2304,8 +2398,17 @@
           <w:b/>
           <w:bCs/>
         </w:rPr>
-        <w:t xml:space="preserve"> = -1;</w:t>
-      </w:r>
+        <w:t xml:space="preserve"> = </w:t>
+      </w:r>
+      <w:proofErr w:type="gramStart"/>
+      <w:r>
+        <w:rPr>
+          <w:b/>
+          <w:bCs/>
+        </w:rPr>
+        <w:t>-1;</w:t>
+      </w:r>
+      <w:proofErr w:type="gramEnd"/>
     </w:p>
     <w:p>
       <w:pPr>
@@ -3401,13 +3504,6 @@
           <w:bCs/>
         </w:rPr>
         <w:br/>
-      </w:r>
-      <w:r>
-        <w:rPr>
-          <w:b/>
-          <w:bCs/>
-        </w:rPr>
-        <w:lastRenderedPageBreak/>
         <w:t xml:space="preserve">      const opt = </w:t>
       </w:r>
       <w:proofErr w:type="spellStart"/>
@@ -3512,6 +3608,13 @@
           <w:bCs/>
         </w:rPr>
         <w:br/>
+      </w:r>
+      <w:r>
+        <w:rPr>
+          <w:b/>
+          <w:bCs/>
+        </w:rPr>
+        <w:lastRenderedPageBreak/>
         <w:t xml:space="preserve">      </w:t>
       </w:r>
       <w:proofErr w:type="spellStart"/>
@@ -3643,6 +3746,7 @@
         <w:t xml:space="preserve">function </w:t>
       </w:r>
       <w:proofErr w:type="spellStart"/>
+      <w:proofErr w:type="gramStart"/>
       <w:r>
         <w:rPr>
           <w:b/>
@@ -3658,7 +3762,15 @@
           <w:b/>
           <w:bCs/>
         </w:rPr>
-        <w:t>() {</w:t>
+        <w:t>(</w:t>
+      </w:r>
+      <w:proofErr w:type="gramEnd"/>
+      <w:r>
+        <w:rPr>
+          <w:b/>
+          <w:bCs/>
+        </w:rPr>
+        <w:t>) {</w:t>
       </w:r>
       <w:r>
         <w:rPr>

</xml_diff>